<commit_message>
Raise the depth-vision review to a Sensors CAS Q3 draft
Add a structured abstract, highlights, graphical abstract, inclusion rules, device-level error table, selection flowchart, calibration subsection, LiDAR-inertial and neural-SLAM coverage, and a ten-point design checklist. Bibliography is 138 cited sources.

Co-authored-by: Reze13omb <Reze13omb@users.noreply.github.com>
</commit_message>
<xml_diff>
--- a/manuscripts/depth_vision_sensors/Zhang_Cui_Depth_Vision_Sensors_Review_revised.docx
+++ b/manuscripts/depth_vision_sensors/Zhang_Cui_Depth_Vision_Sensors_Review_revised.docx
@@ -102,7 +102,7 @@
           <w:i w:val="0"/>
           <w:sz w:val="22"/>
         </w:rPr>
-        <w:t>Active depth vision sensors have become a standard perception front-end in mechatronic systems, including industrial robots, indoor mobile platforms, and unmanned aerial vehicles (UAVs). Unlike passive stereo or monocular depth estimation, structured light, time-of-flight (ToF), and solid-state light detection and ranging (LiDAR) emit controlled illumination and recover metric range with less dependence on scene texture. This review follows a hardware-centered narrative. First, we summarize the operating principles, representative devices, and reported operating envelopes of the three main active modalities. Second, we review the algorithms that convert raw depth into usable estimates: denoising and completion, multi-sensor fusion, visual-inertial-depth odometry, and geometric-semantic mapping. Third, we examine four application families in which the sensing modality is a first-order design choice: industrial inspection and bin picking, indoor mobile robots, UAVs, and collaborative robots. Remaining barriers are organized around sunlight and material sensitivity, compute and power, calibration, and interface fragmentation, together with emerging directions such as event-based depth, on-sensor inference, and photonic beam steering. The paper is intended as a compact map from sensor physics to system function for mechatronic designers, rather than a substitute for modality-specific hardware surveys.</w:t>
+        <w:t>Background: Active depth cameras and solid-state LiDAR now sit on industrial robots, indoor mobile bases, and small unmanned aerial vehicles (UAVs), yet designers still treat “depth sensor” as one specification. Methods: This structured narrative review screens English-language work from 2001 to early 2025 in IEEE Xplore, Scopus, and Web of Science on structured light, time-of-flight (ToF), RGB-D, solid-state LiDAR, depth completion, visual-inertial and RGB-D SLAM, bin picking, collaborative robots, and UAV ranging. Priority is given to hardware papers, comparative evaluations with reported error, and application studies that name the modality. Results: Structured light still owns close-range accuracy; compact iToF and active stereo own room-scale mobile heads; solid-state LiDAR owns outdoor metres. Those envelopes, not marketing generations, decide whether KinectFusion-style mapping, visual-inertial-depth odometry, LiDAR-inertial odometry, or a safety-rated stop is even feasible. Conclusions: A mechatronic stack should be chosen by range, lighting, surface, mass, and safety integrity, keep a metric low-level range channel when a motor can stop, and treat calibration as a first-class design item. The paper maps sensor physics to estimators and applications; it does not replace modality-specific optics surveys.</w:t>
       </w:r>
     </w:p>
     <w:p>
@@ -117,7 +117,150 @@
           <w:i/>
           <w:sz w:val="20"/>
         </w:rPr>
-        <w:t>Keywords: depth vision sensors; mechatronic systems; structured light; time-of-flight; solid-state LiDAR; SLAM; sensor fusion; collaborative robots</w:t>
+        <w:t>Keywords: depth vision sensors; mechatronic systems; structured light; time-of-flight; solid-state LiDAR; RGB-D; SLAM; sensor fusion; collaborative robots; UAV inspection</w:t>
+      </w:r>
+    </w:p>
+    <w:p>
+      <w:pPr>
+        <w:pStyle w:val="Heading1"/>
+      </w:pPr>
+      <w:r>
+        <w:rPr>
+          <w:rFonts w:ascii="Times New Roman" w:hAnsi="Times New Roman"/>
+          <w:color w:val="1F2937"/>
+        </w:rPr>
+        <w:t>Highlights</w:t>
+      </w:r>
+    </w:p>
+    <w:p>
+      <w:pPr>
+        <w:spacing w:after="160" w:line="360" w:lineRule="auto"/>
+        <w:jc w:val="both"/>
+      </w:pPr>
+      <w:r>
+        <w:rPr>
+          <w:rFonts w:ascii="Times New Roman" w:hAnsi="Times New Roman" w:eastAsia="Times New Roman"/>
+          <w:b w:val="0"/>
+          <w:i w:val="0"/>
+          <w:sz w:val="22"/>
+        </w:rPr>
+        <w:t>• Hardware generations did not replace one another. They split the operating envelope: structured light for close-range accuracy, ToF and active stereo for compact room-scale sensing, solid-state LiDAR for outdoor metres.</w:t>
+      </w:r>
+    </w:p>
+    <w:p>
+      <w:pPr>
+        <w:spacing w:after="160" w:line="360" w:lineRule="auto"/>
+        <w:jc w:val="both"/>
+      </w:pPr>
+      <w:r>
+        <w:rPr>
+          <w:rFonts w:ascii="Times New Roman" w:hAnsi="Times New Roman" w:eastAsia="Times New Roman"/>
+          <w:b w:val="0"/>
+          <w:i w:val="0"/>
+          <w:sz w:val="22"/>
+        </w:rPr>
+        <w:t>• Comparative evaluations (Kinect v1/v2, Azure Kinect, RealSense D400-class, multi-camera indoor tests) give order-of-magnitude errors that are usable for system design if they are not treated as datasheet guarantees.</w:t>
+      </w:r>
+    </w:p>
+    <w:p>
+      <w:pPr>
+        <w:spacing w:after="160" w:line="360" w:lineRule="auto"/>
+        <w:jc w:val="both"/>
+      </w:pPr>
+      <w:r>
+        <w:rPr>
+          <w:rFonts w:ascii="Times New Roman" w:hAnsi="Times New Roman" w:eastAsia="Times New Roman"/>
+          <w:b w:val="0"/>
+          <w:i w:val="0"/>
+          <w:sz w:val="22"/>
+        </w:rPr>
+        <w:t>• The estimator must match the front-end: TSDF fusion for tabletops, visual-inertial-depth odometry for indoor bases, LiDAR-inertial odometry for sparse long-range clouds.</w:t>
+      </w:r>
+    </w:p>
+    <w:p>
+      <w:pPr>
+        <w:spacing w:after="160" w:line="360" w:lineRule="auto"/>
+        <w:jc w:val="both"/>
+      </w:pPr>
+      <w:r>
+        <w:rPr>
+          <w:rFonts w:ascii="Times New Roman" w:hAnsi="Times New Roman" w:eastAsia="Times New Roman"/>
+          <w:b w:val="0"/>
+          <w:i w:val="0"/>
+          <w:sz w:val="22"/>
+        </w:rPr>
+        <w:t>• A consumer RGB-D camera is not a safety-rated device. Collaborative cells still need ISO/TS 15066 logic, a safety controller, and usually a redundant channel.</w:t>
+      </w:r>
+    </w:p>
+    <w:p>
+      <w:pPr>
+        <w:spacing w:after="160" w:line="360" w:lineRule="auto"/>
+        <w:jc w:val="both"/>
+      </w:pPr>
+      <w:r>
+        <w:rPr>
+          <w:rFonts w:ascii="Times New Roman" w:hAnsi="Times New Roman" w:eastAsia="Times New Roman"/>
+          <w:b w:val="0"/>
+          <w:i w:val="0"/>
+          <w:sz w:val="22"/>
+        </w:rPr>
+        <w:t>• Event cameras, on-sensor AI, and photonic beam steering are real research directions. They are not yet drop-in replacements for frame-based RGB-D in a warehouse bill of materials.</w:t>
+      </w:r>
+    </w:p>
+    <w:p>
+      <w:pPr>
+        <w:spacing w:after="40"/>
+        <w:jc w:val="center"/>
+      </w:pPr>
+      <w:r>
+        <w:drawing>
+          <wp:inline xmlns:a="http://schemas.openxmlformats.org/drawingml/2006/main" xmlns:pic="http://schemas.openxmlformats.org/drawingml/2006/picture">
+            <wp:extent cx="5760720" cy="2802020"/>
+            <wp:docPr id="1" name="Picture 1"/>
+            <wp:cNvGraphicFramePr>
+              <a:graphicFrameLocks noChangeAspect="1"/>
+            </wp:cNvGraphicFramePr>
+            <a:graphic>
+              <a:graphicData uri="http://schemas.openxmlformats.org/drawingml/2006/picture">
+                <pic:pic>
+                  <pic:nvPicPr>
+                    <pic:cNvPr id="0" name="graphical_abstract.png"/>
+                    <pic:cNvPicPr/>
+                  </pic:nvPicPr>
+                  <pic:blipFill>
+                    <a:blip r:embed="rId9"/>
+                    <a:stretch>
+                      <a:fillRect/>
+                    </a:stretch>
+                  </pic:blipFill>
+                  <pic:spPr>
+                    <a:xfrm>
+                      <a:off x="0" y="0"/>
+                      <a:ext cx="5760720" cy="2802020"/>
+                    </a:xfrm>
+                    <a:prstGeom prst="rect"/>
+                  </pic:spPr>
+                </pic:pic>
+              </a:graphicData>
+            </a:graphic>
+          </wp:inline>
+        </w:drawing>
+      </w:r>
+    </w:p>
+    <w:p>
+      <w:pPr>
+        <w:spacing w:before="80" w:after="240"/>
+        <w:ind w:firstLine="0"/>
+        <w:jc w:val="both"/>
+      </w:pPr>
+      <w:r>
+        <w:rPr>
+          <w:rFonts w:ascii="Times New Roman" w:hAnsi="Times New Roman" w:eastAsia="Times New Roman"/>
+          <w:b w:val="0"/>
+          <w:i/>
+          <w:sz w:val="20"/>
+        </w:rPr>
+        <w:t>Graphical abstract. Active depth families feed distinct estimators and only then become mechatronic functions. Limits (sunlight, watts, calibration, fusion integrity) remain first-order.</w:t>
       </w:r>
     </w:p>
     <w:p>
@@ -622,7 +765,403 @@
           <w:i w:val="0"/>
           <w:sz w:val="22"/>
         </w:rPr>
-        <w:t>The paper is a narrative review, not a PRISMA systematic review. We screened IEEE Xplore, Scopus, Web of Science, and major publisher libraries for English-language work from approximately 2001 to early 2025. Search phrases combined structured light, time-of-flight camera, RGB-D, solid-state LiDAR, depth completion, visual-inertial odometry, RGB-D SLAM, bin picking, collaborative robot, and UAV obstacle avoidance. Priority was given to seminal hardware and calibration papers, widely cited surveys, comparative evaluations that report quantitative error, and application studies in which the depth modality is specified. Product datasheets are used only as supporting context and are not treated as peer-reviewed evidence. Mechanical spinning LiDAR is discussed only as a baseline for solid-state designs. Biomedical and purely cinematic uses of depth cameras are outside the scope.</w:t>
+        <w:t>The paper is a structured narrative review. It is not a PRISMA systematic review and does not claim an exhaustive count of every RGB-D paper since 2010. Inventing a flow-diagram numerator would be dishonest. What we did specify is the search frame, the inclusion rule, and the reason a paper was kept.</w:t>
+      </w:r>
+    </w:p>
+    <w:p>
+      <w:pPr>
+        <w:spacing w:after="160" w:line="360" w:lineRule="auto"/>
+        <w:ind w:firstLine="432"/>
+        <w:jc w:val="both"/>
+      </w:pPr>
+      <w:r>
+        <w:rPr>
+          <w:rFonts w:ascii="Times New Roman" w:hAnsi="Times New Roman" w:eastAsia="Times New Roman"/>
+          <w:b w:val="0"/>
+          <w:i w:val="0"/>
+          <w:sz w:val="22"/>
+        </w:rPr>
+        <w:t>Sources. English-language records from approximately January 2001 to March 2025 were screened in IEEE Xplore, Scopus, and Web of Science, with publisher sites (IEEE, Springer, Elsevier, MDPI, Wiley, ACM) used to retrieve full texts. Core books and standards were added by citation chasing [23,24,31,32,33,34]. Query stems included structured light, fringe projection, time-of-flight camera, RGB-D, Kinect, RealSense, Azure Kinect, solid-state LiDAR, optical phased array, depth completion, visual-inertial odometry, RGB-D SLAM, LiDAR-inertial odometry, bin picking, 6-DoF pose, collaborative robot, speed and separation monitoring, and UAV obstacle avoidance OR inspection. Boolean combinations were adapted to each database.</w:t>
+      </w:r>
+    </w:p>
+    <w:p>
+      <w:pPr>
+        <w:spacing w:after="160" w:line="360" w:lineRule="auto"/>
+        <w:ind w:firstLine="432"/>
+        <w:jc w:val="both"/>
+      </w:pPr>
+      <w:r>
+        <w:rPr>
+          <w:rFonts w:ascii="Times New Roman" w:hAnsi="Times New Roman" w:eastAsia="Times New Roman"/>
+          <w:b w:val="0"/>
+          <w:i w:val="0"/>
+          <w:sz w:val="22"/>
+        </w:rPr>
+        <w:t>Inclusion. A record was kept if it (i) states a depth or ranging principle that a mechatronic designer can act on, (ii) reports a quantitative error, range, or system result, or (iii) is a widely cited survey that we needed in order to point readers to a deeper treatment. Exclusion. Purely biomedical or cinematic uses; papers that never name the depth modality; product blogs and unreviewed datasheets as primary evidence; and mechanical spinning LiDAR except as a baseline for solid-state designs. When two papers report the same device, the peer-reviewed metrology study is preferred over a manufacturer white paper. Table 1a records that rule.</w:t>
+      </w:r>
+    </w:p>
+    <w:p>
+      <w:pPr>
+        <w:spacing w:before="80" w:after="240"/>
+        <w:ind w:firstLine="0"/>
+        <w:jc w:val="both"/>
+      </w:pPr>
+      <w:r>
+        <w:rPr>
+          <w:rFonts w:ascii="Times New Roman" w:hAnsi="Times New Roman" w:eastAsia="Times New Roman"/>
+          <w:b w:val="0"/>
+          <w:i/>
+          <w:sz w:val="20"/>
+        </w:rPr>
+        <w:t>Table 1a. Inclusion and exclusion used in this structured narrative review.</w:t>
+      </w:r>
+    </w:p>
+    <w:tbl>
+      <w:tblPr>
+        <w:tblStyle w:val="TableGrid"/>
+        <w:tblW w:type="auto" w:w="0"/>
+        <w:tblLayout w:type="autofit"/>
+        <w:tblLook w:firstColumn="1" w:firstRow="1" w:lastColumn="0" w:lastRow="0" w:noHBand="0" w:noVBand="1" w:val="04A0"/>
+      </w:tblPr>
+      <w:tblGrid>
+        <w:gridCol w:w="3120"/>
+        <w:gridCol w:w="3120"/>
+        <w:gridCol w:w="3120"/>
+      </w:tblGrid>
+      <w:tr>
+        <w:tc>
+          <w:tcPr>
+            <w:tcW w:type="dxa" w:w="3120"/>
+          </w:tcPr>
+          <w:p>
+            <w:r/>
+            <w:r>
+              <w:rPr>
+                <w:rFonts w:ascii="Times New Roman" w:hAnsi="Times New Roman" w:eastAsia="Times New Roman"/>
+                <w:b/>
+                <w:i w:val="0"/>
+                <w:sz w:val="16"/>
+              </w:rPr>
+              <w:t>Keep if</w:t>
+            </w:r>
+          </w:p>
+        </w:tc>
+        <w:tc>
+          <w:tcPr>
+            <w:tcW w:type="dxa" w:w="3120"/>
+          </w:tcPr>
+          <w:p>
+            <w:r/>
+            <w:r>
+              <w:rPr>
+                <w:rFonts w:ascii="Times New Roman" w:hAnsi="Times New Roman" w:eastAsia="Times New Roman"/>
+                <w:b/>
+                <w:i w:val="0"/>
+                <w:sz w:val="16"/>
+              </w:rPr>
+              <w:t>Drop if</w:t>
+            </w:r>
+          </w:p>
+        </w:tc>
+        <w:tc>
+          <w:tcPr>
+            <w:tcW w:type="dxa" w:w="3120"/>
+          </w:tcPr>
+          <w:p>
+            <w:r/>
+            <w:r>
+              <w:rPr>
+                <w:rFonts w:ascii="Times New Roman" w:hAnsi="Times New Roman" w:eastAsia="Times New Roman"/>
+                <w:b/>
+                <w:i w:val="0"/>
+                <w:sz w:val="16"/>
+              </w:rPr>
+              <w:t>How the record is used</w:t>
+            </w:r>
+          </w:p>
+        </w:tc>
+      </w:tr>
+      <w:tr>
+        <w:tc>
+          <w:tcPr>
+            <w:tcW w:type="dxa" w:w="3120"/>
+          </w:tcPr>
+          <w:p>
+            <w:r/>
+            <w:r>
+              <w:rPr>
+                <w:rFonts w:ascii="Times New Roman" w:hAnsi="Times New Roman" w:eastAsia="Times New Roman"/>
+                <w:b w:val="0"/>
+                <w:i w:val="0"/>
+                <w:sz w:val="16"/>
+              </w:rPr>
+              <w:t>Hardware principle or calibration is stated</w:t>
+            </w:r>
+          </w:p>
+        </w:tc>
+        <w:tc>
+          <w:tcPr>
+            <w:tcW w:type="dxa" w:w="3120"/>
+          </w:tcPr>
+          <w:p>
+            <w:r/>
+            <w:r>
+              <w:rPr>
+                <w:rFonts w:ascii="Times New Roman" w:hAnsi="Times New Roman" w:eastAsia="Times New Roman"/>
+                <w:b w:val="0"/>
+                <w:i w:val="0"/>
+                <w:sz w:val="16"/>
+              </w:rPr>
+              <w:t>Modality never named</w:t>
+            </w:r>
+          </w:p>
+        </w:tc>
+        <w:tc>
+          <w:tcPr>
+            <w:tcW w:type="dxa" w:w="3120"/>
+          </w:tcPr>
+          <w:p>
+            <w:r/>
+            <w:r>
+              <w:rPr>
+                <w:rFonts w:ascii="Times New Roman" w:hAnsi="Times New Roman" w:eastAsia="Times New Roman"/>
+                <w:b w:val="0"/>
+                <w:i w:val="0"/>
+                <w:sz w:val="16"/>
+              </w:rPr>
+              <w:t>Section 2 envelopes</w:t>
+            </w:r>
+          </w:p>
+        </w:tc>
+      </w:tr>
+      <w:tr>
+        <w:tc>
+          <w:tcPr>
+            <w:tcW w:type="dxa" w:w="3120"/>
+          </w:tcPr>
+          <w:p>
+            <w:r/>
+            <w:r>
+              <w:rPr>
+                <w:rFonts w:ascii="Times New Roman" w:hAnsi="Times New Roman" w:eastAsia="Times New Roman"/>
+                <w:b w:val="0"/>
+                <w:i w:val="0"/>
+                <w:sz w:val="16"/>
+              </w:rPr>
+              <w:t>Peer-reviewed range or error numbers</w:t>
+            </w:r>
+          </w:p>
+        </w:tc>
+        <w:tc>
+          <w:tcPr>
+            <w:tcW w:type="dxa" w:w="3120"/>
+          </w:tcPr>
+          <w:p>
+            <w:r/>
+            <w:r>
+              <w:rPr>
+                <w:rFonts w:ascii="Times New Roman" w:hAnsi="Times New Roman" w:eastAsia="Times New Roman"/>
+                <w:b w:val="0"/>
+                <w:i w:val="0"/>
+                <w:sz w:val="16"/>
+              </w:rPr>
+              <w:t>Datasheet-only claim with no method</w:t>
+            </w:r>
+          </w:p>
+        </w:tc>
+        <w:tc>
+          <w:tcPr>
+            <w:tcW w:type="dxa" w:w="3120"/>
+          </w:tcPr>
+          <w:p>
+            <w:r/>
+            <w:r>
+              <w:rPr>
+                <w:rFonts w:ascii="Times New Roman" w:hAnsi="Times New Roman" w:eastAsia="Times New Roman"/>
+                <w:b w:val="0"/>
+                <w:i w:val="0"/>
+                <w:sz w:val="16"/>
+              </w:rPr>
+              <w:t>Tables 2-3</w:t>
+            </w:r>
+          </w:p>
+        </w:tc>
+      </w:tr>
+      <w:tr>
+        <w:tc>
+          <w:tcPr>
+            <w:tcW w:type="dxa" w:w="3120"/>
+          </w:tcPr>
+          <w:p>
+            <w:r/>
+            <w:r>
+              <w:rPr>
+                <w:rFonts w:ascii="Times New Roman" w:hAnsi="Times New Roman" w:eastAsia="Times New Roman"/>
+                <w:b w:val="0"/>
+                <w:i w:val="0"/>
+                <w:sz w:val="16"/>
+              </w:rPr>
+              <w:t>Estimator assumes a stated depth front-end</w:t>
+            </w:r>
+          </w:p>
+        </w:tc>
+        <w:tc>
+          <w:tcPr>
+            <w:tcW w:type="dxa" w:w="3120"/>
+          </w:tcPr>
+          <w:p>
+            <w:r/>
+            <w:r>
+              <w:rPr>
+                <w:rFonts w:ascii="Times New Roman" w:hAnsi="Times New Roman" w:eastAsia="Times New Roman"/>
+                <w:b w:val="0"/>
+                <w:i w:val="0"/>
+                <w:sz w:val="16"/>
+              </w:rPr>
+              <w:t>Algorithm paper with a generic “depth input”</w:t>
+            </w:r>
+          </w:p>
+        </w:tc>
+        <w:tc>
+          <w:tcPr>
+            <w:tcW w:type="dxa" w:w="3120"/>
+          </w:tcPr>
+          <w:p>
+            <w:r/>
+            <w:r>
+              <w:rPr>
+                <w:rFonts w:ascii="Times New Roman" w:hAnsi="Times New Roman" w:eastAsia="Times New Roman"/>
+                <w:b w:val="0"/>
+                <w:i w:val="0"/>
+                <w:sz w:val="16"/>
+              </w:rPr>
+              <w:t>Section 3</w:t>
+            </w:r>
+          </w:p>
+        </w:tc>
+      </w:tr>
+      <w:tr>
+        <w:tc>
+          <w:tcPr>
+            <w:tcW w:type="dxa" w:w="3120"/>
+          </w:tcPr>
+          <w:p>
+            <w:r/>
+            <w:r>
+              <w:rPr>
+                <w:rFonts w:ascii="Times New Roman" w:hAnsi="Times New Roman" w:eastAsia="Times New Roman"/>
+                <w:b w:val="0"/>
+                <w:i w:val="0"/>
+                <w:sz w:val="16"/>
+              </w:rPr>
+              <w:t>Application names the sensor family</w:t>
+            </w:r>
+          </w:p>
+        </w:tc>
+        <w:tc>
+          <w:tcPr>
+            <w:tcW w:type="dxa" w:w="3120"/>
+          </w:tcPr>
+          <w:p>
+            <w:r/>
+            <w:r>
+              <w:rPr>
+                <w:rFonts w:ascii="Times New Roman" w:hAnsi="Times New Roman" w:eastAsia="Times New Roman"/>
+                <w:b w:val="0"/>
+                <w:i w:val="0"/>
+                <w:sz w:val="16"/>
+              </w:rPr>
+              <w:t>Market survey without a sensing requirement</w:t>
+            </w:r>
+          </w:p>
+        </w:tc>
+        <w:tc>
+          <w:tcPr>
+            <w:tcW w:type="dxa" w:w="3120"/>
+          </w:tcPr>
+          <w:p>
+            <w:r/>
+            <w:r>
+              <w:rPr>
+                <w:rFonts w:ascii="Times New Roman" w:hAnsi="Times New Roman" w:eastAsia="Times New Roman"/>
+                <w:b w:val="0"/>
+                <w:i w:val="0"/>
+                <w:sz w:val="16"/>
+              </w:rPr>
+              <w:t>Section 4</w:t>
+            </w:r>
+          </w:p>
+        </w:tc>
+      </w:tr>
+      <w:tr>
+        <w:tc>
+          <w:tcPr>
+            <w:tcW w:type="dxa" w:w="3120"/>
+          </w:tcPr>
+          <w:p>
+            <w:r/>
+            <w:r>
+              <w:rPr>
+                <w:rFonts w:ascii="Times New Roman" w:hAnsi="Times New Roman" w:eastAsia="Times New Roman"/>
+                <w:b w:val="0"/>
+                <w:i w:val="0"/>
+                <w:sz w:val="16"/>
+              </w:rPr>
+              <w:t>Standard that governs safety or robots</w:t>
+            </w:r>
+          </w:p>
+        </w:tc>
+        <w:tc>
+          <w:tcPr>
+            <w:tcW w:type="dxa" w:w="3120"/>
+          </w:tcPr>
+          <w:p>
+            <w:r/>
+            <w:r>
+              <w:rPr>
+                <w:rFonts w:ascii="Times New Roman" w:hAnsi="Times New Roman" w:eastAsia="Times New Roman"/>
+                <w:b w:val="0"/>
+                <w:i w:val="0"/>
+                <w:sz w:val="16"/>
+              </w:rPr>
+              <w:t>Opinion piece</w:t>
+            </w:r>
+          </w:p>
+        </w:tc>
+        <w:tc>
+          <w:tcPr>
+            <w:tcW w:type="dxa" w:w="3120"/>
+          </w:tcPr>
+          <w:p>
+            <w:r/>
+            <w:r>
+              <w:rPr>
+                <w:rFonts w:ascii="Times New Roman" w:hAnsi="Times New Roman" w:eastAsia="Times New Roman"/>
+                <w:b w:val="0"/>
+                <w:i w:val="0"/>
+                <w:sz w:val="16"/>
+              </w:rPr>
+              <w:t>Sections 4.4 and 5</w:t>
+            </w:r>
+          </w:p>
+        </w:tc>
+      </w:tr>
+    </w:tbl>
+    <w:p/>
+    <w:p>
+      <w:pPr>
+        <w:spacing w:after="160" w:line="360" w:lineRule="auto"/>
+        <w:ind w:firstLine="432"/>
+        <w:jc w:val="both"/>
+      </w:pPr>
+      <w:r>
+        <w:rPr>
+          <w:rFonts w:ascii="Times New Roman" w:hAnsi="Times New Roman" w:eastAsia="Times New Roman"/>
+          <w:b w:val="0"/>
+          <w:i w:val="0"/>
+          <w:sz w:val="22"/>
+        </w:rPr>
+        <w:t>This protocol is enough for a Sensors-style review to be reproducible in spirit. It is not enough to support a meta-analysis of depth RMSE across all consumer cameras, because experimental setups are not commensurate [4,24,35,36].</w:t>
       </w:r>
     </w:p>
     <w:p>
@@ -650,7 +1189,7 @@
           <w:i w:val="0"/>
           <w:sz w:val="22"/>
         </w:rPr>
-        <w:t>The paper makes four modest contributions. First, it compares structured light, active stereo, iToF, dToF, and solid-state LiDAR by principle, reported range and error, and typical mechatronic role. Second, it links raw depth artifacts to the estimation layers that machines actually run. Third, it organizes applications by sensing requirement rather than by market category. Fourth, it separates mitigations that already ship from ideas that remain research. Section 2 reviews hardware. Section 3 reviews enabling algorithms. Section 4 reviews applications. Section 5 discusses open problems and outlook. Section 6 concludes.</w:t>
+        <w:t>The paper makes five contributions aimed at mechatronic designers rather than at optics specialists. First, it compares structured light, active stereo, iToF, dToF, and solid-state LiDAR by principle, reported range and error, and role. Second, it compiles device-level numbers from peer-reviewed evaluations of Kinect-class, RealSense-class, and Azure Kinect cameras so that Table 3 can be opened during a design review [14,15,35,36,37]. Third, it links raw artifacts to the estimators that machines actually run, including LiDAR-inertial odometry for sparse long-range clouds [38,39,40]. Fourth, it organizes applications by the depth property that is spent. Fifth, it gives an explicit selection flowchart and a checklist that can be copied into a requirements document. Section 2 reviews hardware. Section 3 reviews enabling algorithms. Section 4 reviews applications and selection. Section 5 discusses open problems. Section 6 concludes.</w:t>
       </w:r>
     </w:p>
     <w:p>
@@ -690,7 +1229,7 @@
         <w:drawing>
           <wp:inline xmlns:a="http://schemas.openxmlformats.org/drawingml/2006/main" xmlns:pic="http://schemas.openxmlformats.org/drawingml/2006/picture">
             <wp:extent cx="5760720" cy="2819933"/>
-            <wp:docPr id="1" name="Picture 1"/>
+            <wp:docPr id="2" name="Picture 2"/>
             <wp:cNvGraphicFramePr>
               <a:graphicFrameLocks noChangeAspect="1"/>
             </wp:cNvGraphicFramePr>
@@ -702,7 +1241,7 @@
                     <pic:cNvPicPr/>
                   </pic:nvPicPr>
                   <pic:blipFill>
-                    <a:blip r:embed="rId9"/>
+                    <a:blip r:embed="rId10"/>
                     <a:stretch>
                       <a:fillRect/>
                     </a:stretch>
@@ -778,7 +1317,7 @@
           <w:i w:val="0"/>
           <w:sz w:val="22"/>
         </w:rPr>
-        <w:t>Consumer devices traded metrology-grade projectors for a static pseudo-random speckle and on-chip matching. Kinect v1 is the canonical example: a near-infrared (NIR) projector, an infrared camera, and a colour camera. Khoshelham and Elberink showed that its random depth error grows from a few millimetres near the sensor to about 4 cm near 5 m, while axial point spacing can reach about 7 cm at that range [14]. Those numbers explain both the success of KinectFusion-style indoor reconstruction [17,18] and the unsuitability of the same sensor as an outdoor navigation camera.</w:t>
+        <w:t>Consumer devices traded metrology-grade projectors for a static pseudo-random speckle and on-chip matching. Kinect v1 is the canonical example: a near-infrared (NIR) projector, an infrared camera, and a colour camera. Khoshelham and Elberink showed that its random depth error grows from a few millimetres near the sensor to about 4 cm near 5 m, while axial point spacing can reach about 7 cm at that range [14]. Early geometric studies of the same device reached the same qualitative conclusion and supplied calibration recipes that robotics groups still reuse [41,42]. Those numbers explain both the success of KinectFusion-style indoor reconstruction [17,18] and the unsuitability of the same sensor as an outdoor navigation camera.</w:t>
       </w:r>
     </w:p>
     <w:p>
@@ -822,7 +1361,7 @@
           <w:i w:val="0"/>
           <w:sz w:val="22"/>
         </w:rPr>
-        <w:t>A ToF pixel estimates range from the travel time of light. Indirect ToF (iToF; lock-in or continuous-wave) measures the phase shift of a modulated source [7,31]. For a modulation frequency f_m the unambiguous range is on the order of c/(2 f_m); a typical 30 MHz tone wraps near 5 m, which is why multi-frequency operation appears on industrial iToF cameras [7,8]. Direct ToF (dToF) timestamps a short pulse, often with single-photon avalanche diode (SPAD) arrays and time-to-digital converters [8,21,32]. iToF became practical in compact cameras because a single illuminator and a single sensor replace a precision stereo baseline [7,15]. Reported indoor working distances for consumer iToF, including Kinect v2, are typically 0.5-4.5 m [15,33,34]. Side-by-side studies of Kinect v1 and v2 show that the ToF unit reduced some structured-light artifacts (texture dependence, multi-device interference) while introducing others (multipath in corners, flying pixels, wiggling) [15,33,34]. Sunlight, multipath, and flying pixels remain first-order limitations [15,33,35].</w:t>
+        <w:t>A ToF pixel estimates range from the travel time of light. Indirect ToF (iToF; lock-in or continuous-wave) measures the phase shift of a modulated source [7,32,43]. For a modulation frequency f_m the unambiguous range is on the order of c/(2 f_m); a typical 30 MHz tone wraps near 5 m, which is why multi-frequency operation appears on industrial iToF cameras [7,8,32]. Direct ToF (dToF) timestamps a short pulse, often with single-photon avalanche diode (SPAD) arrays and time-to-digital converters [8,21,44]. iToF became practical in compact cameras because a single illuminator and a single sensor replace a precision stereo baseline [7,15]. Reported indoor working distances for consumer iToF, including Kinect v2, are typically 0.5-4.5 m [15,45,46]. Side-by-side studies of Kinect v1 and v2 show that the ToF unit reduced some structured-light artifacts (texture dependence, multi-device interference) while introducing others (multipath in corners, flying pixels, wiggling) [15,45,46,47]. Azure Kinect, the later Microsoft ToF camera, reduced random depth noise relative to Kinect v2 in near-FOV modes under about 3 m and improved spatial accuracy beyond about 2.5 m in laser-scanner comparisons, without removing sunlight or multipath as design limits [35,36]. Sunlight, multipath, and flying pixels remain first-order limitations [15,45,48].</w:t>
       </w:r>
     </w:p>
     <w:p>
@@ -866,7 +1405,7 @@
           <w:i w:val="0"/>
           <w:sz w:val="22"/>
         </w:rPr>
-        <w:t>Once the task leaves the room (warehouse aisles, yards, roads, bridge girders) consumer RGB-D cameras run out of photons and out of unambiguous range. Mechanical spinning LiDAR already solved long-range ranging. Solid-state and semi-solid designs try to keep that range while removing a bulky rotator [9,10,29,30]. MEMS mirrors scan a laser with a small moving mass and are the most commercially mature semi-solid option. Flash LiDAR illuminates a patch at once and is closer to a ToF camera, with range and resolution set by peak power and pixel count. Optical phased arrays and metasurface beam steerers aim at a fully solid-state scanner [36,37,38,39,40]. Large-scale silicon photonic arrays and MEMS-on-photonics demonstrators show that chip-scale beam steering is no longer only a laboratory sketch [38,40]. For mechatronic integration the practical facts are simpler: solid-state units are smaller and potentially more robust to vibration, but they are still sparse compared with RGB-D, still expensive at automotive grade, and still require careful time synchronization with cameras and IMUs [10,29,41]. Automotive surveys also stress eye-safety, rain/fog backscatter, and the need for a perception stack that does not treat a sparse cloud as if it were a Kinect frame [10,29].</w:t>
+        <w:t>Once the task leaves the room (warehouse aisles, yards, roads, bridge girders) consumer RGB-D cameras run out of photons and out of unambiguous range. Mechanical spinning LiDAR already solved long-range ranging. Solid-state and semi-solid designs try to keep that range while removing a bulky rotator [9,10,29,30,49,50]. MEMS mirrors scan a laser with a small moving mass and are the most commercially mature semi-solid option. Flash LiDAR illuminates a patch at once and is closer to a ToF camera, with range and resolution set by peak power and pixel count. Optical phased arrays and metasurface beam steerers aim at a fully solid-state scanner [51,52,53,54,55,56]. Large-scale silicon photonic arrays and MEMS-on-photonics demonstrators show that chip-scale beam steering is no longer only a laboratory sketch [53,55]. Circuit- and architecture-level reviews stress that the scanner is only one block: laser, detector, timing, and eye-safety set the range as much as the steering method [49,50]. For mechatronic integration the practical facts are simpler: solid-state units are smaller and potentially more robust to vibration, but they are still sparse compared with RGB-D, still expensive at automotive grade, and still require careful time synchronization with cameras and IMUs [10,29,57]. Automotive surveys also stress eye-safety, rain/fog backscatter, and the need for a perception stack that does not treat a sparse cloud as if it were a Kinect frame [10,29].</w:t>
       </w:r>
     </w:p>
     <w:p>
@@ -883,38 +1422,6 @@
           <w:sz w:val="22"/>
         </w:rPr>
         <w:t>Table 2 collects order-of-magnitude figures reported in the literature. Values are typical envelopes, not guarantees for a particular serial number. Two design rules follow. First, do not treat "depth camera" as one specification: a sensor that is excellent for bin picking is usually the wrong sensor for a 30 m warehouse aisle. Second, hardware generations did not replace one another; they split the operating envelope. Structured light still wins close-range accuracy. ToF wins compactness at room scale. Solid-state LiDAR wins range. Mechatronic architectures increasingly carry more than one of them.</w:t>
-      </w:r>
-    </w:p>
-    <w:p>
-      <w:pPr>
-        <w:spacing w:after="160" w:line="360" w:lineRule="auto"/>
-        <w:ind w:firstLine="432"/>
-        <w:jc w:val="both"/>
-      </w:pPr>
-      <w:r>
-        <w:rPr>
-          <w:rFonts w:ascii="Times New Roman" w:hAnsi="Times New Roman" w:eastAsia="Times New Roman"/>
-          <w:b w:val="0"/>
-          <w:i w:val="0"/>
-          <w:sz w:val="22"/>
-        </w:rPr>
-        <w:t>A practical selection sequence used in many robot shops is: write down the minimum and maximum range, the worst lighting, the worst surface, the allowed mass and watts, and the safety integrity level. Only then open a catalogue. Indoor rooms with matte walls still suit RGB-D [4,14,20]. Fixed cells with metal parts still suit industrial structured light [5]. Yards and roads still suit LiDAR, usually fused with cameras [10,41,42]. If two of those worlds appear on one machine, budget two sensors and a calibration procedure, not a single "universal" depth camera.</w:t>
-      </w:r>
-    </w:p>
-    <w:p>
-      <w:pPr>
-        <w:spacing w:after="160" w:line="360" w:lineRule="auto"/>
-        <w:ind w:firstLine="432"/>
-        <w:jc w:val="both"/>
-      </w:pPr>
-      <w:r>
-        <w:rPr>
-          <w:rFonts w:ascii="Times New Roman" w:hAnsi="Times New Roman" w:eastAsia="Times New Roman"/>
-          <w:b w:val="0"/>
-          <w:i w:val="0"/>
-          <w:sz w:val="22"/>
-        </w:rPr>
-        <w:t>Three short examples make the same point. A bin-picking cell with a 1.2 m standoff and oily steel parts should start from industrial structured light, a 6-DoF pose estimator, and a compliant grasp, not from a 100 m LiDAR [5,43,44]. An indoor delivery base that must see a pallet toe and a person in a corridor should start from a wide RGB-D camera plus a two-dimensional safety LiDAR and a visual-inertial estimator [20,45,46]. A bridge-inspection UAV that must hold a 5-15 m standoff in wind should start from a lightweight solid-state ranger, an IMU, and a compact RGB inspector, and should not expect a phone-class ToF module to carry the ranging load [2,9,47].</w:t>
       </w:r>
     </w:p>
     <w:p>
@@ -1635,7 +2142,7 @@
                 <w:i w:val="0"/>
                 <w:sz w:val="16"/>
               </w:rPr>
-              <w:t>[7,8,15,33]</w:t>
+              <w:t>[7,8,15,45]</w:t>
             </w:r>
           </w:p>
         </w:tc>
@@ -1773,7 +2280,7 @@
                 <w:i w:val="0"/>
                 <w:sz w:val="16"/>
               </w:rPr>
-              <w:t>[21,32]</w:t>
+              <w:t>[21,44]</w:t>
             </w:r>
           </w:p>
         </w:tc>
@@ -1920,6 +2427,922 @@
     <w:p/>
     <w:p>
       <w:pPr>
+        <w:spacing w:after="160" w:line="360" w:lineRule="auto"/>
+        <w:ind w:firstLine="432"/>
+        <w:jc w:val="both"/>
+      </w:pPr>
+      <w:r>
+        <w:rPr>
+          <w:rFonts w:ascii="Times New Roman" w:hAnsi="Times New Roman" w:eastAsia="Times New Roman"/>
+          <w:b w:val="0"/>
+          <w:i w:val="0"/>
+          <w:sz w:val="22"/>
+        </w:rPr>
+        <w:t>A practical selection sequence used in many robot shops is: write down the minimum and maximum range, the worst lighting, the worst surface, the allowed mass and watts, and the safety integrity level. Only then open a catalogue (Figure 2). Indoor rooms with matte walls still suit RGB-D [4,14,20]. Fixed cells with metal parts still suit industrial structured light [5]. Yards and roads still suit LiDAR, usually fused with cameras [10,57,58]. If two of those worlds appear on one machine, budget two sensors and a calibration procedure, not a single "universal" depth camera.</w:t>
+      </w:r>
+    </w:p>
+    <w:p>
+      <w:pPr>
+        <w:spacing w:after="40"/>
+        <w:jc w:val="center"/>
+      </w:pPr>
+      <w:r>
+        <w:drawing>
+          <wp:inline xmlns:a="http://schemas.openxmlformats.org/drawingml/2006/main" xmlns:pic="http://schemas.openxmlformats.org/drawingml/2006/picture">
+            <wp:extent cx="5760720" cy="3120010"/>
+            <wp:docPr id="3" name="Picture 3"/>
+            <wp:cNvGraphicFramePr>
+              <a:graphicFrameLocks noChangeAspect="1"/>
+            </wp:cNvGraphicFramePr>
+            <a:graphic>
+              <a:graphicData uri="http://schemas.openxmlformats.org/drawingml/2006/picture">
+                <pic:pic>
+                  <pic:nvPicPr>
+                    <pic:cNvPr id="0" name="fig4_selection_flowchart.png"/>
+                    <pic:cNvPicPr/>
+                  </pic:nvPicPr>
+                  <pic:blipFill>
+                    <a:blip r:embed="rId11"/>
+                    <a:stretch>
+                      <a:fillRect/>
+                    </a:stretch>
+                  </pic:blipFill>
+                  <pic:spPr>
+                    <a:xfrm>
+                      <a:off x="0" y="0"/>
+                      <a:ext cx="5760720" cy="3120010"/>
+                    </a:xfrm>
+                    <a:prstGeom prst="rect"/>
+                  </pic:spPr>
+                </pic:pic>
+              </a:graphicData>
+            </a:graphic>
+          </wp:inline>
+        </w:drawing>
+      </w:r>
+    </w:p>
+    <w:p>
+      <w:pPr>
+        <w:spacing w:before="80" w:after="240"/>
+        <w:ind w:firstLine="0"/>
+        <w:jc w:val="both"/>
+      </w:pPr>
+      <w:r>
+        <w:rPr>
+          <w:rFonts w:ascii="Times New Roman" w:hAnsi="Times New Roman" w:eastAsia="Times New Roman"/>
+          <w:b w:val="0"/>
+          <w:i/>
+          <w:sz w:val="20"/>
+        </w:rPr>
+        <w:t>Figure 2. Selection from the operating envelope. The three exit boxes are families, not product SKUs. Mixed worlds require mixed sensors.</w:t>
+      </w:r>
+    </w:p>
+    <w:p>
+      <w:pPr>
+        <w:spacing w:after="160" w:line="360" w:lineRule="auto"/>
+        <w:ind w:firstLine="432"/>
+        <w:jc w:val="both"/>
+      </w:pPr>
+      <w:r>
+        <w:rPr>
+          <w:rFonts w:ascii="Times New Roman" w:hAnsi="Times New Roman" w:eastAsia="Times New Roman"/>
+          <w:b w:val="0"/>
+          <w:i w:val="0"/>
+          <w:sz w:val="22"/>
+        </w:rPr>
+        <w:t>Three short examples make the same point. A bin-picking cell with a 1.2 m standoff and oily steel parts should start from industrial structured light, a 6-DoF pose estimator, and a compliant grasp, not from a 100 m LiDAR [5,59,60]. An indoor delivery base that must see a pallet toe and a person in a corridor should start from a wide RGB-D camera plus a two-dimensional safety LiDAR and a visual-inertial estimator [20,61,62]. A bridge-inspection UAV that must hold a 5-15 m standoff in wind should start from a lightweight solid-state ranger, an IMU, and a compact RGB inspector, and should not expect a phone-class ToF module to carry the ranging load [2,9,63].</w:t>
+      </w:r>
+    </w:p>
+    <w:p>
+      <w:pPr>
+        <w:pStyle w:val="Heading2"/>
+      </w:pPr>
+      <w:r>
+        <w:rPr>
+          <w:rFonts w:ascii="Times New Roman" w:hAnsi="Times New Roman"/>
+          <w:color w:val="1F2937"/>
+        </w:rPr>
+        <w:t>2.4 Device-level numbers and the function each generation unlocked</w:t>
+      </w:r>
+    </w:p>
+    <w:p>
+      <w:pPr>
+        <w:spacing w:after="160" w:line="360" w:lineRule="auto"/>
+        <w:ind w:firstLine="432"/>
+        <w:jc w:val="both"/>
+      </w:pPr>
+      <w:r>
+        <w:rPr>
+          <w:rFonts w:ascii="Times New Roman" w:hAnsi="Times New Roman" w:eastAsia="Times New Roman"/>
+          <w:b w:val="0"/>
+          <w:i w:val="0"/>
+          <w:sz w:val="22"/>
+        </w:rPr>
+        <w:t>Family envelopes are not enough when a buyer has to choose a SKU. Table 3 lists numbers that peer-reviewed evaluations actually measured, not marketing ranges. Kinect v1 remains the best-documented structured-light consumer camera [14,41]. Kinect v2 and Azure Kinect document the ToF path, including the fact that Azure Kinect is not uniformly better than v2 at every distance and FOV mode [15,35,36,47]. RealSense SR300 and D415 document the coded-light and active-stereo Intel line with metrological characterizations rather than blog tests [20,37,64]. Halmetschlager-Funek et al. remain the widest indoor multi-device comparison and should be read before any single-camera ranking is trusted [4].</w:t>
+      </w:r>
+    </w:p>
+    <w:p>
+      <w:pPr>
+        <w:spacing w:before="80" w:after="240"/>
+        <w:ind w:firstLine="0"/>
+        <w:jc w:val="both"/>
+      </w:pPr>
+      <w:r>
+        <w:rPr>
+          <w:rFonts w:ascii="Times New Roman" w:hAnsi="Times New Roman" w:eastAsia="Times New Roman"/>
+          <w:b w:val="0"/>
+          <w:i/>
+          <w:sz w:val="20"/>
+        </w:rPr>
+        <w:t>Table 3. Device-level figures taken from peer-reviewed evaluations. These are experimental orders of magnitude, not acceptance specifications.</w:t>
+      </w:r>
+    </w:p>
+    <w:tbl>
+      <w:tblPr>
+        <w:tblStyle w:val="TableGrid"/>
+        <w:tblW w:type="auto" w:w="0"/>
+        <w:tblLayout w:type="autofit"/>
+        <w:tblLook w:firstColumn="1" w:firstRow="1" w:lastColumn="0" w:lastRow="0" w:noHBand="0" w:noVBand="1" w:val="04A0"/>
+      </w:tblPr>
+      <w:tblGrid>
+        <w:gridCol w:w="1872"/>
+        <w:gridCol w:w="1872"/>
+        <w:gridCol w:w="1872"/>
+        <w:gridCol w:w="1872"/>
+        <w:gridCol w:w="1872"/>
+      </w:tblGrid>
+      <w:tr>
+        <w:tc>
+          <w:tcPr>
+            <w:tcW w:type="dxa" w:w="1872"/>
+          </w:tcPr>
+          <w:p>
+            <w:r/>
+            <w:r>
+              <w:rPr>
+                <w:rFonts w:ascii="Times New Roman" w:hAnsi="Times New Roman" w:eastAsia="Times New Roman"/>
+                <w:b/>
+                <w:i w:val="0"/>
+                <w:sz w:val="16"/>
+              </w:rPr>
+              <w:t>Device (study)</w:t>
+            </w:r>
+          </w:p>
+        </w:tc>
+        <w:tc>
+          <w:tcPr>
+            <w:tcW w:type="dxa" w:w="1872"/>
+          </w:tcPr>
+          <w:p>
+            <w:r/>
+            <w:r>
+              <w:rPr>
+                <w:rFonts w:ascii="Times New Roman" w:hAnsi="Times New Roman" w:eastAsia="Times New Roman"/>
+                <w:b/>
+                <w:i w:val="0"/>
+                <w:sz w:val="16"/>
+              </w:rPr>
+              <w:t>Principle</w:t>
+            </w:r>
+          </w:p>
+        </w:tc>
+        <w:tc>
+          <w:tcPr>
+            <w:tcW w:type="dxa" w:w="1872"/>
+          </w:tcPr>
+          <w:p>
+            <w:r/>
+            <w:r>
+              <w:rPr>
+                <w:rFonts w:ascii="Times New Roman" w:hAnsi="Times New Roman" w:eastAsia="Times New Roman"/>
+                <w:b/>
+                <w:i w:val="0"/>
+                <w:sz w:val="16"/>
+              </w:rPr>
+              <w:t>Reported range or setup</w:t>
+            </w:r>
+          </w:p>
+        </w:tc>
+        <w:tc>
+          <w:tcPr>
+            <w:tcW w:type="dxa" w:w="1872"/>
+          </w:tcPr>
+          <w:p>
+            <w:r/>
+            <w:r>
+              <w:rPr>
+                <w:rFonts w:ascii="Times New Roman" w:hAnsi="Times New Roman" w:eastAsia="Times New Roman"/>
+                <w:b/>
+                <w:i w:val="0"/>
+                <w:sz w:val="16"/>
+              </w:rPr>
+              <w:t>Reported error / noise</w:t>
+            </w:r>
+          </w:p>
+        </w:tc>
+        <w:tc>
+          <w:tcPr>
+            <w:tcW w:type="dxa" w:w="1872"/>
+          </w:tcPr>
+          <w:p>
+            <w:r/>
+            <w:r>
+              <w:rPr>
+                <w:rFonts w:ascii="Times New Roman" w:hAnsi="Times New Roman" w:eastAsia="Times New Roman"/>
+                <w:b/>
+                <w:i w:val="0"/>
+                <w:sz w:val="16"/>
+              </w:rPr>
+              <w:t>Note for designers</w:t>
+            </w:r>
+          </w:p>
+        </w:tc>
+      </w:tr>
+      <w:tr>
+        <w:tc>
+          <w:tcPr>
+            <w:tcW w:type="dxa" w:w="1872"/>
+          </w:tcPr>
+          <w:p>
+            <w:r/>
+            <w:r>
+              <w:rPr>
+                <w:rFonts w:ascii="Times New Roman" w:hAnsi="Times New Roman" w:eastAsia="Times New Roman"/>
+                <w:b w:val="0"/>
+                <w:i w:val="0"/>
+                <w:sz w:val="16"/>
+              </w:rPr>
+              <w:t>Kinect v1 [14]</w:t>
+            </w:r>
+          </w:p>
+        </w:tc>
+        <w:tc>
+          <w:tcPr>
+            <w:tcW w:type="dxa" w:w="1872"/>
+          </w:tcPr>
+          <w:p>
+            <w:r/>
+            <w:r>
+              <w:rPr>
+                <w:rFonts w:ascii="Times New Roman" w:hAnsi="Times New Roman" w:eastAsia="Times New Roman"/>
+                <w:b w:val="0"/>
+                <w:i w:val="0"/>
+                <w:sz w:val="16"/>
+              </w:rPr>
+              <w:t>Structured light</w:t>
+            </w:r>
+          </w:p>
+        </w:tc>
+        <w:tc>
+          <w:tcPr>
+            <w:tcW w:type="dxa" w:w="1872"/>
+          </w:tcPr>
+          <w:p>
+            <w:r/>
+            <w:r>
+              <w:rPr>
+                <w:rFonts w:ascii="Times New Roman" w:hAnsi="Times New Roman" w:eastAsia="Times New Roman"/>
+                <w:b w:val="0"/>
+                <w:i w:val="0"/>
+                <w:sz w:val="16"/>
+              </w:rPr>
+              <w:t>Indoor, to ~5 m</w:t>
+            </w:r>
+          </w:p>
+        </w:tc>
+        <w:tc>
+          <w:tcPr>
+            <w:tcW w:type="dxa" w:w="1872"/>
+          </w:tcPr>
+          <w:p>
+            <w:r/>
+            <w:r>
+              <w:rPr>
+                <w:rFonts w:ascii="Times New Roman" w:hAnsi="Times New Roman" w:eastAsia="Times New Roman"/>
+                <w:b w:val="0"/>
+                <w:i w:val="0"/>
+                <w:sz w:val="16"/>
+              </w:rPr>
+              <w:t>Random error few mm near field; ~4 cm near 5 m; axial spacing ~7 cm at 5 m</w:t>
+            </w:r>
+          </w:p>
+        </w:tc>
+        <w:tc>
+          <w:tcPr>
+            <w:tcW w:type="dxa" w:w="1872"/>
+          </w:tcPr>
+          <w:p>
+            <w:r/>
+            <w:r>
+              <w:rPr>
+                <w:rFonts w:ascii="Times New Roman" w:hAnsi="Times New Roman" w:eastAsia="Times New Roman"/>
+                <w:b w:val="0"/>
+                <w:i w:val="0"/>
+                <w:sz w:val="16"/>
+              </w:rPr>
+              <w:t>Good enough for indoor TSDF; not a survey instrument</w:t>
+            </w:r>
+          </w:p>
+        </w:tc>
+      </w:tr>
+      <w:tr>
+        <w:tc>
+          <w:tcPr>
+            <w:tcW w:type="dxa" w:w="1872"/>
+          </w:tcPr>
+          <w:p>
+            <w:r/>
+            <w:r>
+              <w:rPr>
+                <w:rFonts w:ascii="Times New Roman" w:hAnsi="Times New Roman" w:eastAsia="Times New Roman"/>
+                <w:b w:val="0"/>
+                <w:i w:val="0"/>
+                <w:sz w:val="16"/>
+              </w:rPr>
+              <w:t>Kinect v2 [15,45,47]</w:t>
+            </w:r>
+          </w:p>
+        </w:tc>
+        <w:tc>
+          <w:tcPr>
+            <w:tcW w:type="dxa" w:w="1872"/>
+          </w:tcPr>
+          <w:p>
+            <w:r/>
+            <w:r>
+              <w:rPr>
+                <w:rFonts w:ascii="Times New Roman" w:hAnsi="Times New Roman" w:eastAsia="Times New Roman"/>
+                <w:b w:val="0"/>
+                <w:i w:val="0"/>
+                <w:sz w:val="16"/>
+              </w:rPr>
+              <w:t>iToF</w:t>
+            </w:r>
+          </w:p>
+        </w:tc>
+        <w:tc>
+          <w:tcPr>
+            <w:tcW w:type="dxa" w:w="1872"/>
+          </w:tcPr>
+          <w:p>
+            <w:r/>
+            <w:r>
+              <w:rPr>
+                <w:rFonts w:ascii="Times New Roman" w:hAnsi="Times New Roman" w:eastAsia="Times New Roman"/>
+                <w:b w:val="0"/>
+                <w:i w:val="0"/>
+                <w:sz w:val="16"/>
+              </w:rPr>
+              <w:t>Typically 0.5-4.5 m indoor</w:t>
+            </w:r>
+          </w:p>
+        </w:tc>
+        <w:tc>
+          <w:tcPr>
+            <w:tcW w:type="dxa" w:w="1872"/>
+          </w:tcPr>
+          <w:p>
+            <w:r/>
+            <w:r>
+              <w:rPr>
+                <w:rFonts w:ascii="Times New Roman" w:hAnsi="Times New Roman" w:eastAsia="Times New Roman"/>
+                <w:b w:val="0"/>
+                <w:i w:val="0"/>
+                <w:sz w:val="16"/>
+              </w:rPr>
+              <w:t>Better texture robustness than v1; multipath, flying pixels, wiggling</w:t>
+            </w:r>
+          </w:p>
+        </w:tc>
+        <w:tc>
+          <w:tcPr>
+            <w:tcW w:type="dxa" w:w="1872"/>
+          </w:tcPr>
+          <w:p>
+            <w:r/>
+            <w:r>
+              <w:rPr>
+                <w:rFonts w:ascii="Times New Roman" w:hAnsi="Times New Roman" w:eastAsia="Times New Roman"/>
+                <w:b w:val="0"/>
+                <w:i w:val="0"/>
+                <w:sz w:val="16"/>
+              </w:rPr>
+              <w:t>Indoor robot head; model the bias [61]</w:t>
+            </w:r>
+          </w:p>
+        </w:tc>
+      </w:tr>
+      <w:tr>
+        <w:tc>
+          <w:tcPr>
+            <w:tcW w:type="dxa" w:w="1872"/>
+          </w:tcPr>
+          <w:p>
+            <w:r/>
+            <w:r>
+              <w:rPr>
+                <w:rFonts w:ascii="Times New Roman" w:hAnsi="Times New Roman" w:eastAsia="Times New Roman"/>
+                <w:b w:val="0"/>
+                <w:i w:val="0"/>
+                <w:sz w:val="16"/>
+              </w:rPr>
+              <w:t>Azure Kinect [35,36]</w:t>
+            </w:r>
+          </w:p>
+        </w:tc>
+        <w:tc>
+          <w:tcPr>
+            <w:tcW w:type="dxa" w:w="1872"/>
+          </w:tcPr>
+          <w:p>
+            <w:r/>
+            <w:r>
+              <w:rPr>
+                <w:rFonts w:ascii="Times New Roman" w:hAnsi="Times New Roman" w:eastAsia="Times New Roman"/>
+                <w:b w:val="0"/>
+                <w:i w:val="0"/>
+                <w:sz w:val="16"/>
+              </w:rPr>
+              <w:t>iToF</w:t>
+            </w:r>
+          </w:p>
+        </w:tc>
+        <w:tc>
+          <w:tcPr>
+            <w:tcW w:type="dxa" w:w="1872"/>
+          </w:tcPr>
+          <w:p>
+            <w:r/>
+            <w:r>
+              <w:rPr>
+                <w:rFonts w:ascii="Times New Roman" w:hAnsi="Times New Roman" w:eastAsia="Times New Roman"/>
+                <w:b w:val="0"/>
+                <w:i w:val="0"/>
+                <w:sz w:val="16"/>
+              </w:rPr>
+              <w:t>Mode-dependent; studies cover ~0.5-5 m</w:t>
+            </w:r>
+          </w:p>
+        </w:tc>
+        <w:tc>
+          <w:tcPr>
+            <w:tcW w:type="dxa" w:w="1872"/>
+          </w:tcPr>
+          <w:p>
+            <w:r/>
+            <w:r>
+              <w:rPr>
+                <w:rFonts w:ascii="Times New Roman" w:hAnsi="Times New Roman" w:eastAsia="Times New Roman"/>
+                <w:b w:val="0"/>
+                <w:i w:val="0"/>
+                <w:sz w:val="16"/>
+              </w:rPr>
+              <w:t>NFOV noise ~2x smaller than v2 under 3 m; better than v2 beyond ~2.5 m in one laser-scanner test</w:t>
+            </w:r>
+          </w:p>
+        </w:tc>
+        <w:tc>
+          <w:tcPr>
+            <w:tcW w:type="dxa" w:w="1872"/>
+          </w:tcPr>
+          <w:p>
+            <w:r/>
+            <w:r>
+              <w:rPr>
+                <w:rFonts w:ascii="Times New Roman" w:hAnsi="Times New Roman" w:eastAsia="Times New Roman"/>
+                <w:b w:val="0"/>
+                <w:i w:val="0"/>
+                <w:sz w:val="16"/>
+              </w:rPr>
+              <w:t>Check FOV mode; not a sunlight camera</w:t>
+            </w:r>
+          </w:p>
+        </w:tc>
+      </w:tr>
+      <w:tr>
+        <w:tc>
+          <w:tcPr>
+            <w:tcW w:type="dxa" w:w="1872"/>
+          </w:tcPr>
+          <w:p>
+            <w:r/>
+            <w:r>
+              <w:rPr>
+                <w:rFonts w:ascii="Times New Roman" w:hAnsi="Times New Roman" w:eastAsia="Times New Roman"/>
+                <w:b w:val="0"/>
+                <w:i w:val="0"/>
+                <w:sz w:val="16"/>
+              </w:rPr>
+              <w:t>RealSense SR300 [64]</w:t>
+            </w:r>
+          </w:p>
+        </w:tc>
+        <w:tc>
+          <w:tcPr>
+            <w:tcW w:type="dxa" w:w="1872"/>
+          </w:tcPr>
+          <w:p>
+            <w:r/>
+            <w:r>
+              <w:rPr>
+                <w:rFonts w:ascii="Times New Roman" w:hAnsi="Times New Roman" w:eastAsia="Times New Roman"/>
+                <w:b w:val="0"/>
+                <w:i w:val="0"/>
+                <w:sz w:val="16"/>
+              </w:rPr>
+              <w:t>Coded light</w:t>
+            </w:r>
+          </w:p>
+        </w:tc>
+        <w:tc>
+          <w:tcPr>
+            <w:tcW w:type="dxa" w:w="1872"/>
+          </w:tcPr>
+          <w:p>
+            <w:r/>
+            <w:r>
+              <w:rPr>
+                <w:rFonts w:ascii="Times New Roman" w:hAnsi="Times New Roman" w:eastAsia="Times New Roman"/>
+                <w:b w:val="0"/>
+                <w:i w:val="0"/>
+                <w:sz w:val="16"/>
+              </w:rPr>
+              <w:t>Short-range desktop</w:t>
+            </w:r>
+          </w:p>
+        </w:tc>
+        <w:tc>
+          <w:tcPr>
+            <w:tcW w:type="dxa" w:w="1872"/>
+          </w:tcPr>
+          <w:p>
+            <w:r/>
+            <w:r>
+              <w:rPr>
+                <w:rFonts w:ascii="Times New Roman" w:hAnsi="Times New Roman" w:eastAsia="Times New Roman"/>
+                <w:b w:val="0"/>
+                <w:i w:val="0"/>
+                <w:sz w:val="16"/>
+              </w:rPr>
+              <w:t>Metrological characterization; close-range only</w:t>
+            </w:r>
+          </w:p>
+        </w:tc>
+        <w:tc>
+          <w:tcPr>
+            <w:tcW w:type="dxa" w:w="1872"/>
+          </w:tcPr>
+          <w:p>
+            <w:r/>
+            <w:r>
+              <w:rPr>
+                <w:rFonts w:ascii="Times New Roman" w:hAnsi="Times New Roman" w:eastAsia="Times New Roman"/>
+                <w:b w:val="0"/>
+                <w:i w:val="0"/>
+                <w:sz w:val="16"/>
+              </w:rPr>
+              <w:t>Do not stretch to navigation</w:t>
+            </w:r>
+          </w:p>
+        </w:tc>
+      </w:tr>
+      <w:tr>
+        <w:tc>
+          <w:tcPr>
+            <w:tcW w:type="dxa" w:w="1872"/>
+          </w:tcPr>
+          <w:p>
+            <w:r/>
+            <w:r>
+              <w:rPr>
+                <w:rFonts w:ascii="Times New Roman" w:hAnsi="Times New Roman" w:eastAsia="Times New Roman"/>
+                <w:b w:val="0"/>
+                <w:i w:val="0"/>
+                <w:sz w:val="16"/>
+              </w:rPr>
+              <w:t>RealSense D415 [37]</w:t>
+            </w:r>
+          </w:p>
+        </w:tc>
+        <w:tc>
+          <w:tcPr>
+            <w:tcW w:type="dxa" w:w="1872"/>
+          </w:tcPr>
+          <w:p>
+            <w:r/>
+            <w:r>
+              <w:rPr>
+                <w:rFonts w:ascii="Times New Roman" w:hAnsi="Times New Roman" w:eastAsia="Times New Roman"/>
+                <w:b w:val="0"/>
+                <w:i w:val="0"/>
+                <w:sz w:val="16"/>
+              </w:rPr>
+              <w:t>Active stereo</w:t>
+            </w:r>
+          </w:p>
+        </w:tc>
+        <w:tc>
+          <w:tcPr>
+            <w:tcW w:type="dxa" w:w="1872"/>
+          </w:tcPr>
+          <w:p>
+            <w:r/>
+            <w:r>
+              <w:rPr>
+                <w:rFonts w:ascii="Times New Roman" w:hAnsi="Times New Roman" w:eastAsia="Times New Roman"/>
+                <w:b w:val="0"/>
+                <w:i w:val="0"/>
+                <w:sz w:val="16"/>
+              </w:rPr>
+              <w:t>Desktop / robot cell distances in the study</w:t>
+            </w:r>
+          </w:p>
+        </w:tc>
+        <w:tc>
+          <w:tcPr>
+            <w:tcW w:type="dxa" w:w="1872"/>
+          </w:tcPr>
+          <w:p>
+            <w:r/>
+            <w:r>
+              <w:rPr>
+                <w:rFonts w:ascii="Times New Roman" w:hAnsi="Times New Roman" w:eastAsia="Times New Roman"/>
+                <w:b w:val="0"/>
+                <w:i w:val="0"/>
+                <w:sz w:val="16"/>
+              </w:rPr>
+              <w:t>cm-level, setup-dependent</w:t>
+            </w:r>
+          </w:p>
+        </w:tc>
+        <w:tc>
+          <w:tcPr>
+            <w:tcW w:type="dxa" w:w="1872"/>
+          </w:tcPr>
+          <w:p>
+            <w:r/>
+            <w:r>
+              <w:rPr>
+                <w:rFonts w:ascii="Times New Roman" w:hAnsi="Times New Roman" w:eastAsia="Times New Roman"/>
+                <w:b w:val="0"/>
+                <w:i w:val="0"/>
+                <w:sz w:val="16"/>
+              </w:rPr>
+              <w:t>Calibration and lighting dominate</w:t>
+            </w:r>
+          </w:p>
+        </w:tc>
+      </w:tr>
+      <w:tr>
+        <w:tc>
+          <w:tcPr>
+            <w:tcW w:type="dxa" w:w="1872"/>
+          </w:tcPr>
+          <w:p>
+            <w:r/>
+            <w:r>
+              <w:rPr>
+                <w:rFonts w:ascii="Times New Roman" w:hAnsi="Times New Roman" w:eastAsia="Times New Roman"/>
+                <w:b w:val="0"/>
+                <w:i w:val="0"/>
+                <w:sz w:val="16"/>
+              </w:rPr>
+              <w:t>RealSense D400 family [20]</w:t>
+            </w:r>
+          </w:p>
+        </w:tc>
+        <w:tc>
+          <w:tcPr>
+            <w:tcW w:type="dxa" w:w="1872"/>
+          </w:tcPr>
+          <w:p>
+            <w:r/>
+            <w:r>
+              <w:rPr>
+                <w:rFonts w:ascii="Times New Roman" w:hAnsi="Times New Roman" w:eastAsia="Times New Roman"/>
+                <w:b w:val="0"/>
+                <w:i w:val="0"/>
+                <w:sz w:val="16"/>
+              </w:rPr>
+              <w:t>Active stereo</w:t>
+            </w:r>
+          </w:p>
+        </w:tc>
+        <w:tc>
+          <w:tcPr>
+            <w:tcW w:type="dxa" w:w="1872"/>
+          </w:tcPr>
+          <w:p>
+            <w:r/>
+            <w:r>
+              <w:rPr>
+                <w:rFonts w:ascii="Times New Roman" w:hAnsi="Times New Roman" w:eastAsia="Times New Roman"/>
+                <w:b w:val="0"/>
+                <w:i w:val="0"/>
+                <w:sz w:val="16"/>
+              </w:rPr>
+              <w:t>Roughly 0.2-10 m; best nearer</w:t>
+            </w:r>
+          </w:p>
+        </w:tc>
+        <w:tc>
+          <w:tcPr>
+            <w:tcW w:type="dxa" w:w="1872"/>
+          </w:tcPr>
+          <w:p>
+            <w:r/>
+            <w:r>
+              <w:rPr>
+                <w:rFonts w:ascii="Times New Roman" w:hAnsi="Times New Roman" w:eastAsia="Times New Roman"/>
+                <w:b w:val="0"/>
+                <w:i w:val="0"/>
+                <w:sz w:val="16"/>
+              </w:rPr>
+              <w:t>Matching artefacts if texture and projector are both weak</w:t>
+            </w:r>
+          </w:p>
+        </w:tc>
+        <w:tc>
+          <w:tcPr>
+            <w:tcW w:type="dxa" w:w="1872"/>
+          </w:tcPr>
+          <w:p>
+            <w:r/>
+            <w:r>
+              <w:rPr>
+                <w:rFonts w:ascii="Times New Roman" w:hAnsi="Times New Roman" w:eastAsia="Times New Roman"/>
+                <w:b w:val="0"/>
+                <w:i w:val="0"/>
+                <w:sz w:val="16"/>
+              </w:rPr>
+              <w:t>Outdoor-capable relative to speckle SL</w:t>
+            </w:r>
+          </w:p>
+        </w:tc>
+      </w:tr>
+      <w:tr>
+        <w:tc>
+          <w:tcPr>
+            <w:tcW w:type="dxa" w:w="1872"/>
+          </w:tcPr>
+          <w:p>
+            <w:r/>
+            <w:r>
+              <w:rPr>
+                <w:rFonts w:ascii="Times New Roman" w:hAnsi="Times New Roman" w:eastAsia="Times New Roman"/>
+                <w:b w:val="0"/>
+                <w:i w:val="0"/>
+                <w:sz w:val="16"/>
+              </w:rPr>
+              <w:t>Ten-camera indoor test [4]</w:t>
+            </w:r>
+          </w:p>
+        </w:tc>
+        <w:tc>
+          <w:tcPr>
+            <w:tcW w:type="dxa" w:w="1872"/>
+          </w:tcPr>
+          <w:p>
+            <w:r/>
+            <w:r>
+              <w:rPr>
+                <w:rFonts w:ascii="Times New Roman" w:hAnsi="Times New Roman" w:eastAsia="Times New Roman"/>
+                <w:b w:val="0"/>
+                <w:i w:val="0"/>
+                <w:sz w:val="16"/>
+              </w:rPr>
+              <w:t>SL / stereo / ToF mix</w:t>
+            </w:r>
+          </w:p>
+        </w:tc>
+        <w:tc>
+          <w:tcPr>
+            <w:tcW w:type="dxa" w:w="1872"/>
+          </w:tcPr>
+          <w:p>
+            <w:r/>
+            <w:r>
+              <w:rPr>
+                <w:rFonts w:ascii="Times New Roman" w:hAnsi="Times New Roman" w:eastAsia="Times New Roman"/>
+                <w:b w:val="0"/>
+                <w:i w:val="0"/>
+                <w:sz w:val="16"/>
+              </w:rPr>
+              <w:t>Robot-cell indoor grid</w:t>
+            </w:r>
+          </w:p>
+        </w:tc>
+        <w:tc>
+          <w:tcPr>
+            <w:tcW w:type="dxa" w:w="1872"/>
+          </w:tcPr>
+          <w:p>
+            <w:r/>
+            <w:r>
+              <w:rPr>
+                <w:rFonts w:ascii="Times New Roman" w:hAnsi="Times New Roman" w:eastAsia="Times New Roman"/>
+                <w:b w:val="0"/>
+                <w:i w:val="0"/>
+                <w:sz w:val="16"/>
+              </w:rPr>
+              <w:t>No single winner on bias, precision, lighting, multi-device</w:t>
+            </w:r>
+          </w:p>
+        </w:tc>
+        <w:tc>
+          <w:tcPr>
+            <w:tcW w:type="dxa" w:w="1872"/>
+          </w:tcPr>
+          <w:p>
+            <w:r/>
+            <w:r>
+              <w:rPr>
+                <w:rFonts w:ascii="Times New Roman" w:hAnsi="Times New Roman" w:eastAsia="Times New Roman"/>
+                <w:b w:val="0"/>
+                <w:i w:val="0"/>
+                <w:sz w:val="16"/>
+              </w:rPr>
+              <w:t>Re-rank after your lighting and material</w:t>
+            </w:r>
+          </w:p>
+        </w:tc>
+      </w:tr>
+    </w:tbl>
+    <w:p/>
+    <w:p>
+      <w:pPr>
+        <w:spacing w:after="160" w:line="360" w:lineRule="auto"/>
+        <w:ind w:firstLine="432"/>
+        <w:jc w:val="both"/>
+      </w:pPr>
+      <w:r>
+        <w:rPr>
+          <w:rFonts w:ascii="Times New Roman" w:hAnsi="Times New Roman" w:eastAsia="Times New Roman"/>
+          <w:b w:val="0"/>
+          <w:i w:val="0"/>
+          <w:sz w:val="22"/>
+        </w:rPr>
+        <w:t>Figure 3 states the causal claim of this review in one picture: each hardware step unlocked a function that was previously impractical at that size and cost. It did not make the previous function obsolete.</w:t>
+      </w:r>
+    </w:p>
+    <w:p>
+      <w:pPr>
+        <w:spacing w:after="40"/>
+        <w:jc w:val="center"/>
+      </w:pPr>
+      <w:r>
+        <w:drawing>
+          <wp:inline xmlns:a="http://schemas.openxmlformats.org/drawingml/2006/main" xmlns:pic="http://schemas.openxmlformats.org/drawingml/2006/picture">
+            <wp:extent cx="5760720" cy="2802759"/>
+            <wp:docPr id="4" name="Picture 4"/>
+            <wp:cNvGraphicFramePr>
+              <a:graphicFrameLocks noChangeAspect="1"/>
+            </wp:cNvGraphicFramePr>
+            <a:graphic>
+              <a:graphicData uri="http://schemas.openxmlformats.org/drawingml/2006/picture">
+                <pic:pic>
+                  <pic:nvPicPr>
+                    <pic:cNvPr id="0" name="fig5_hardware_functions.png"/>
+                    <pic:cNvPicPr/>
+                  </pic:nvPicPr>
+                  <pic:blipFill>
+                    <a:blip r:embed="rId12"/>
+                    <a:stretch>
+                      <a:fillRect/>
+                    </a:stretch>
+                  </pic:blipFill>
+                  <pic:spPr>
+                    <a:xfrm>
+                      <a:off x="0" y="0"/>
+                      <a:ext cx="5760720" cy="2802759"/>
+                    </a:xfrm>
+                    <a:prstGeom prst="rect"/>
+                  </pic:spPr>
+                </pic:pic>
+              </a:graphicData>
+            </a:graphic>
+          </wp:inline>
+        </w:drawing>
+      </w:r>
+    </w:p>
+    <w:p>
+      <w:pPr>
+        <w:spacing w:before="80" w:after="240"/>
+        <w:ind w:firstLine="0"/>
+        <w:jc w:val="both"/>
+      </w:pPr>
+      <w:r>
+        <w:rPr>
+          <w:rFonts w:ascii="Times New Roman" w:hAnsi="Times New Roman" w:eastAsia="Times New Roman"/>
+          <w:b w:val="0"/>
+          <w:i/>
+          <w:sz w:val="20"/>
+        </w:rPr>
+        <w:t>Figure 3. Hardware steps and the mechatronic functions they made newly practical. Emerging event and photonic devices are shown as research, not as current bill-of-materials items.</w:t>
+      </w:r>
+    </w:p>
+    <w:p>
+      <w:pPr>
         <w:pStyle w:val="Heading1"/>
       </w:pPr>
       <w:r>
@@ -1971,7 +3394,7 @@
           <w:i w:val="0"/>
           <w:sz w:val="22"/>
         </w:rPr>
-        <w:t>Consumer and automotive depth images share a small set of artifacts: impulse noise, invalid pixels (holes) on occlusions, black or specular surfaces, flying pixels on depth edges, and ToF multipath [4,7,15]. Classical spatial median filters and temporal averaging remain the first firmware line of defence. When a registered RGB image is available, joint bilateral or guided filtering uses colour edges to protect object boundaries while smoothing planar interiors [48]. These filters are cheap enough for embedded GPUs. They do not invent missing geometry.</w:t>
+        <w:t>Consumer and automotive depth images share a small set of artifacts: impulse noise, invalid pixels (holes) on occlusions, black or specular surfaces, flying pixels on depth edges, and ToF multipath [4,7,15]. Classical spatial median filters and temporal averaging remain the first firmware line of defence. When a registered RGB image is available, joint bilateral or guided filtering uses colour edges to protect object boundaries while smoothing planar interiors [65]. These filters are cheap enough for embedded GPUs. They do not invent missing geometry.</w:t>
       </w:r>
     </w:p>
     <w:p>
@@ -1987,7 +3410,7 @@
           <w:i w:val="0"/>
           <w:sz w:val="22"/>
         </w:rPr>
-        <w:t>Depth completion does. Early methods inpainted by diffusion or multi-view geometry. Learning-based completion trained on RGB-D or RGB-plus-sparse-LiDAR pairs now dominates the literature [12,13,49,50,51,52,53]. Eigen et al. showed that a multi-scale network can predict depth from a single RGB image [12]; later residual and self-supervised models reduced the need for dense ground truth [13,50,51]. Indoor work still leans on NYU-Depth v2-style labelled apartments [49]. Outdoor work leans on KITTI-style projected LiDAR, which is sparse and biased toward the road plane [52]. For that setting, Uhrig et al. introduced sparsity-invariant convolutions [52], and Ma and Karaman showed that even a few hundred metric samples plus RGB yield a dense metric map [53]. Later non-local and transformer architectures improve large holes by using long-range context, at a cost that still challenges small onboard computers [54]. A mechatronic reading of these papers is that completion is a good virtual sensor for visualization and mid-level planning, and a bad sole input to a safety-rated stop.</w:t>
+        <w:t>Depth completion does. Early methods inpainted by diffusion or multi-view geometry. Learning-based completion trained on RGB-D or RGB-plus-sparse-LiDAR pairs now dominates the literature [12,13,66,67,68,69,70,71,72,73,74]. Eigen et al. showed that a multi-scale network can predict depth from a single RGB image [12]; later residual and self-supervised models reduced the need for dense ground truth [13,67,68]. Indoor work still leans on NYU-Depth v2-style labelled apartments [66]. Zhang and Funkhouser showed that even a single RGB-D frame with holes can be completed if surface normals and occlusion boundaries are used as intermediate cues [71]. Outdoor work leans on KITTI-style projected LiDAR, which is sparse and biased toward the road plane [69]. For that setting, Uhrig et al. introduced sparsity-invariant convolutions [69], and Ma and Karaman showed that even a few hundred metric samples plus RGB yield a dense metric map [70]. Spatial-propagation networks (CSPN, NLSPN) and DeepLiDAR-style normal guidance then became the standard way to spread those sparse metric seeds [72,73,74]. Later non-local and transformer architectures improve large holes by using long-range context, at a cost that still challenges small onboard computers [75]. A mechatronic reading of these papers is that completion is a good virtual sensor for visualization and mid-level planning, and a bad sole input to a safety-rated stop.</w:t>
       </w:r>
     </w:p>
     <w:p>
@@ -2003,7 +3426,7 @@
           <w:i w:val="0"/>
           <w:sz w:val="22"/>
         </w:rPr>
-        <w:t>Table 3 rates common artifacts by industrial maturity. The important systems point is that learning-based completion is not yet a drop-in safety sensor: it can look plausible while being metrically wrong on transparent, thin, or never-seen objects.</w:t>
+        <w:t>Table 4 rates common artifacts by industrial maturity. The important systems point is that learning-based completion is not yet a drop-in safety sensor: it can look plausible while being metrically wrong on transparent, thin, or never-seen objects.</w:t>
       </w:r>
     </w:p>
     <w:p>
@@ -2019,7 +3442,7 @@
           <w:i/>
           <w:sz w:val="20"/>
         </w:rPr>
-        <w:t>Table 3. Common depth artifacts and the maturity of current mitigations.</w:t>
+        <w:t>Table 4. Common depth artifacts and the maturity of current mitigations.</w:t>
       </w:r>
     </w:p>
     <w:tbl>
@@ -2380,7 +3803,7 @@
                 <w:i w:val="0"/>
                 <w:sz w:val="16"/>
               </w:rPr>
-              <w:t>Maturing on high-end iToF; still hard on cheap single-frequency units [7,35]</w:t>
+              <w:t>Maturing on high-end iToF; still hard on cheap single-frequency units [7,48]</w:t>
             </w:r>
           </w:p>
         </w:tc>
@@ -2482,7 +3905,7 @@
           <w:i w:val="0"/>
           <w:sz w:val="22"/>
         </w:rPr>
-        <w:t>A depth camera alone is a poor navigation sensor: it is biased, partially observed, and asynchronous with the actuators. Fusion with an inertial measurement unit (IMU), wheel odometry, and/or a colour camera is therefore the default architecture on mobile robots and UAVs (Figure 2).</w:t>
+        <w:t>A depth camera alone is a poor navigation sensor: it is biased, partially observed, and asynchronous with the actuators. Fusion with an inertial measurement unit (IMU), wheel odometry, and/or a colour camera is therefore the default architecture on mobile robots and UAVs (Figure 4).</w:t>
       </w:r>
     </w:p>
     <w:p>
@@ -2494,7 +3917,7 @@
         <w:drawing>
           <wp:inline xmlns:a="http://schemas.openxmlformats.org/drawingml/2006/main" xmlns:pic="http://schemas.openxmlformats.org/drawingml/2006/picture">
             <wp:extent cx="5760720" cy="2964051"/>
-            <wp:docPr id="2" name="Picture 2"/>
+            <wp:docPr id="5" name="Picture 5"/>
             <wp:cNvGraphicFramePr>
               <a:graphicFrameLocks noChangeAspect="1"/>
             </wp:cNvGraphicFramePr>
@@ -2506,7 +3929,7 @@
                     <pic:cNvPicPr/>
                   </pic:nvPicPr>
                   <pic:blipFill>
-                    <a:blip r:embed="rId10"/>
+                    <a:blip r:embed="rId13"/>
                     <a:stretch>
                       <a:fillRect/>
                     </a:stretch>
@@ -2538,7 +3961,7 @@
           <w:i/>
           <w:sz w:val="20"/>
         </w:rPr>
-        <w:t>Figure 2. A typical estimation stack on a mobile robot. Depth is one residual source among several. The optional dense or semantic layer is expensive and is often omitted on large-scale outdoor maps.</w:t>
+        <w:t>Figure 4. A typical estimation stack on a mobile robot. Depth is one residual source among several. The optional dense or semantic layer is expensive and is often omitted on large-scale outdoor maps.</w:t>
       </w:r>
     </w:p>
     <w:p>
@@ -2554,7 +3977,7 @@
           <w:i w:val="0"/>
           <w:sz w:val="22"/>
         </w:rPr>
-        <w:t>Loose coupling treats each sensor as a black-box pose or twist and fuses them in an extended or unscented Kalman filter. The implementation is modular and cheap; the estimate is statistically suboptimal and cannot correct inner calibration errors [55]. Tight coupling, as in keyframe visual-inertial odometry (VIO), jointly optimizes visual residuals and IMU preintegration in a sliding window [56,57,58,59]. Adding metric depth yields visual-inertial-depth odometry: depth removes the monocular scale-gauge ambiguity and supplies geometric constraints in low-texture rooms where VIO would otherwise drift or fail [1,17,58].</w:t>
+        <w:t>Loose coupling treats each sensor as a black-box pose or twist and fuses them in an extended or unscented Kalman filter. The implementation is modular and cheap; the estimate is statistically suboptimal and cannot correct inner calibration errors [31,76]. Lynen et al. showed that a modular multi-sensor filter is enough to fly a MAV if each sensor is treated as a delayed pose update [76]. Tight coupling, as in keyframe visual-inertial odometry (VIO), jointly optimizes visual residuals and IMU preintegration in a sliding window [77,78,79,80,81,82]. OpenVINS and related platforms made that estimator reproducible [81,82]. Adding metric depth yields visual-inertial-depth odometry: depth removes the monocular scale-gauge ambiguity and supplies geometric constraints in low-texture rooms where VIO would otherwise drift or fail [1,17,79].</w:t>
       </w:r>
     </w:p>
     <w:p>
@@ -2570,7 +3993,7 @@
           <w:i w:val="0"/>
           <w:sz w:val="22"/>
         </w:rPr>
-        <w:t>Dense RGB-D fusion, from KinectFusion through ElasticFusion and BundleFusion, maintains a truncated signed distance function (TSDF) or surfel map for close-range interaction [17,60,61]. The KinectFusion loop is still the mental model: track the live depth against the model, integrate the new frame into a volume, and raycast a synthetic depth for the next track [17,18]. ElasticFusion dropped the explicit pose graph in favour of dense deformation; BundleFusion restored global consistency with on-the-fly reintegration [60,61]. Those maps are excellent for a tabletop and expensive for a warehouse. Graph-based SLAM adds loop closures so that local odometry does not accumulate without bound [1,55]. RGB-D SLAM systems and the TUM RGB-D benchmark made this stack reproducible [19,62,63]. Later systems (ORB-SLAM2/3, Kimera) combine sparse or semi-dense tracking with optional metric-semantic mapping and multi-robot extensions [46,64,65,66]. ORB-SLAM3 in particular folded visual-inertial and multi-map operation into a library that many robot teams actually run [46]. Direct methods such as LSD-SLAM showed that dense photometric residuals can replace sparse features when exposure is well modelled [67]. Visual-LiDAR fusion surveys document the complementary pair used outdoors: cameras for semantics and texture, LiDAR for metric structure and lighting invariance [41,42].</w:t>
+        <w:t>Dense RGB-D fusion, from KinectFusion through ElasticFusion and BundleFusion, maintains a truncated signed distance function (TSDF) or surfel map for close-range interaction [17,83,84]. The KinectFusion loop is still the mental model: track the live depth against the model, integrate the new frame into a volume, and raycast a synthetic depth for the next track [17,18]. ElasticFusion dropped the explicit pose graph in favour of dense deformation; BundleFusion restored global consistency with on-the-fly reintegration [83,84]. Those maps are excellent for a tabletop and expensive for a warehouse. Graph-based SLAM adds loop closures so that local odometry does not accumulate without bound [1,31]. RGB-D SLAM systems and the TUM RGB-D benchmark made this stack reproducible [19,85,86,87]. Kerl et al. showed that a dense photometric+depth residual already works on a CPU-era RGB-D camera if exposure is modelled [87]. Later systems (ORB-SLAM, ORB-SLAM2/3, Kimera) combine sparse or semi-dense tracking with optional metric-semantic mapping and multi-robot extensions [62,88,89,90,91]. ORB-SLAM3 in particular folded visual-inertial and multi-map operation into a library that many robot teams actually run [62]. Direct methods such as LSD-SLAM showed that dense photometric residuals can replace sparse features when exposure is well modelled [92]. Learned dense trackers such as DROID-SLAM, and neural implicit maps (iMAP, NICE-SLAM, Point-SLAM), raise map fidelity again, at a compute cost that still sits above most embedded robot computers [93,94,95,96].</w:t>
       </w:r>
     </w:p>
     <w:p>
@@ -2586,7 +4009,23 @@
           <w:i w:val="0"/>
           <w:sz w:val="22"/>
         </w:rPr>
-        <w:t>Point-cloud infrastructure (PCL, iterative closest point, OctoMap, Voxblox) determines whether these estimators can run online on a real chassis [68,69,70,71]. For control engineers the interface that matters is usually a pose with covariance plus a costmap, not a research SLAM paper. Table 4 compares the fusion patterns that those libraries usually sit under.</w:t>
+        <w:t>Outdoors, the front-end is usually LiDAR, not RGB-D. LOAM and LeGO-LOAM established feature-based lidar odometry [38,97]. Tight lidar-inertial systems (LIO-SAM, FAST-LIO2) then made solid-state and spinning clouds usable on UAVs and handheld platforms without a separate visual pipeline [39,40]. FAST-LIO2 in particular registers raw points into an incremental k-d tree and has been demonstrated on solid-state LiDARs with a small field of view [40]. Visual-lidar odometry (V-LOAM) and later fusion surveys document the complementary pair: cameras for semantics and texture, LiDAR for metric structure and lighting invariance [57,58,98].</w:t>
+      </w:r>
+    </w:p>
+    <w:p>
+      <w:pPr>
+        <w:spacing w:after="160" w:line="360" w:lineRule="auto"/>
+        <w:ind w:firstLine="432"/>
+        <w:jc w:val="both"/>
+      </w:pPr>
+      <w:r>
+        <w:rPr>
+          <w:rFonts w:ascii="Times New Roman" w:hAnsi="Times New Roman" w:eastAsia="Times New Roman"/>
+          <w:b w:val="0"/>
+          <w:i w:val="0"/>
+          <w:sz w:val="22"/>
+        </w:rPr>
+        <w:t>Point-cloud infrastructure (PCL, iterative closest point, OctoMap, Voxblox) determines whether these estimators can run online on a real chassis [99,100,101,102]. For control engineers the interface that matters is usually a pose with covariance plus a costmap, not a research SLAM paper. Table 5 compares the fusion patterns that those libraries usually sit under.</w:t>
       </w:r>
     </w:p>
     <w:p>
@@ -2602,7 +4041,7 @@
           <w:i/>
           <w:sz w:val="20"/>
         </w:rPr>
-        <w:t>Table 4. Fusion patterns used in mechatronic state estimation.</w:t>
+        <w:t>Table 5. Fusion patterns used in mechatronic state estimation.</w:t>
       </w:r>
     </w:p>
     <w:tbl>
@@ -3239,7 +4678,111 @@
                 <w:i w:val="0"/>
                 <w:sz w:val="16"/>
               </w:rPr>
-              <w:t>Sync and extrinsics [41]</w:t>
+              <w:t>Sync and extrinsics [57,98]</w:t>
+            </w:r>
+          </w:p>
+        </w:tc>
+      </w:tr>
+      <w:tr>
+        <w:tc>
+          <w:tcPr>
+            <w:tcW w:type="dxa" w:w="1560"/>
+          </w:tcPr>
+          <w:p>
+            <w:r/>
+            <w:r>
+              <w:rPr>
+                <w:rFonts w:ascii="Times New Roman" w:hAnsi="Times New Roman" w:eastAsia="Times New Roman"/>
+                <w:b w:val="0"/>
+                <w:i w:val="0"/>
+                <w:sz w:val="16"/>
+              </w:rPr>
+              <w:t>LiDAR-inertial</w:t>
+            </w:r>
+          </w:p>
+        </w:tc>
+        <w:tc>
+          <w:tcPr>
+            <w:tcW w:type="dxa" w:w="1560"/>
+          </w:tcPr>
+          <w:p>
+            <w:r/>
+            <w:r>
+              <w:rPr>
+                <w:rFonts w:ascii="Times New Roman" w:hAnsi="Times New Roman" w:eastAsia="Times New Roman"/>
+                <w:b w:val="0"/>
+                <w:i w:val="0"/>
+                <w:sz w:val="16"/>
+              </w:rPr>
+              <w:t>LiDAR + IMU</w:t>
+            </w:r>
+          </w:p>
+        </w:tc>
+        <w:tc>
+          <w:tcPr>
+            <w:tcW w:type="dxa" w:w="1560"/>
+          </w:tcPr>
+          <w:p>
+            <w:r/>
+            <w:r>
+              <w:rPr>
+                <w:rFonts w:ascii="Times New Roman" w:hAnsi="Times New Roman" w:eastAsia="Times New Roman"/>
+                <w:b w:val="0"/>
+                <w:i w:val="0"/>
+                <w:sz w:val="16"/>
+              </w:rPr>
+              <w:t>iEKF or factor graph</w:t>
+            </w:r>
+          </w:p>
+        </w:tc>
+        <w:tc>
+          <w:tcPr>
+            <w:tcW w:type="dxa" w:w="1560"/>
+          </w:tcPr>
+          <w:p>
+            <w:r/>
+            <w:r>
+              <w:rPr>
+                <w:rFonts w:ascii="Times New Roman" w:hAnsi="Times New Roman" w:eastAsia="Times New Roman"/>
+                <w:b w:val="0"/>
+                <w:i w:val="0"/>
+                <w:sz w:val="16"/>
+              </w:rPr>
+              <w:t>Pose + sparse map</w:t>
+            </w:r>
+          </w:p>
+        </w:tc>
+        <w:tc>
+          <w:tcPr>
+            <w:tcW w:type="dxa" w:w="1560"/>
+          </w:tcPr>
+          <w:p>
+            <w:r/>
+            <w:r>
+              <w:rPr>
+                <w:rFonts w:ascii="Times New Roman" w:hAnsi="Times New Roman" w:eastAsia="Times New Roman"/>
+                <w:b w:val="0"/>
+                <w:i w:val="0"/>
+                <w:sz w:val="16"/>
+              </w:rPr>
+              <w:t>UAV, handheld SSL</w:t>
+            </w:r>
+          </w:p>
+        </w:tc>
+        <w:tc>
+          <w:tcPr>
+            <w:tcW w:type="dxa" w:w="1560"/>
+          </w:tcPr>
+          <w:p>
+            <w:r/>
+            <w:r>
+              <w:rPr>
+                <w:rFonts w:ascii="Times New Roman" w:hAnsi="Times New Roman" w:eastAsia="Times New Roman"/>
+                <w:b w:val="0"/>
+                <w:i w:val="0"/>
+                <w:sz w:val="16"/>
+              </w:rPr>
+              <w:t>Needs a structured cloud [39,40]</w:t>
             </w:r>
           </w:p>
         </w:tc>
@@ -3271,7 +4814,7 @@
           <w:i w:val="0"/>
           <w:sz w:val="22"/>
         </w:rPr>
-        <w:t>Once a metric cloud exists, the next questions are what the object is and where the robot may go. Classical 3D detectors used hand-crafted histograms. Current networks consume raw points, voxels, or range images [54,72,73]. Semantic segmentation labels every point; instance segmentation separates two chairs of the same class. RGB remains useful for texture and class priors; depth remains useful for scale and occlusion. Pose-estimation benchmarks such as BOP and methods such as PoseCNN made 6-DoF object pose a measurable industrial problem rather than a one-off demonstration [74,75].</w:t>
+        <w:t>Once a metric cloud exists, the next questions are what the object is and where the robot may go. Classical 3D detectors used hand-crafted histograms. Current networks consume raw points, voxels, or range images [75,103,104]. Semantic segmentation labels every point; instance segmentation separates two chairs of the same class. RGB remains useful for texture and class priors; depth remains useful for scale and occlusion. Pose-estimation benchmarks such as BOP and methods such as PoseCNN made 6-DoF object pose a measurable industrial problem rather than a one-off demonstration [105,106].</w:t>
       </w:r>
     </w:p>
     <w:p>
@@ -3287,7 +4830,35 @@
           <w:i w:val="0"/>
           <w:sz w:val="22"/>
         </w:rPr>
-        <w:t>Beyond labels, mechatronic systems care about affordances: surface normals and curvature for grasp stability, traversable floor versus negative obstacles, and dynamic scene graphs that persist over time [44,65,66]. These layers are not unique to depth sensors, but they become cheaper when scale is observed rather than inferred. In dynamic scenes, geometric SLAM without semantics remains brittle; recent surveys document the shift toward semantic and robust dynamic SLAM [27,76].</w:t>
+        <w:t>Beyond labels, mechatronic systems care about affordances: surface normals and curvature for grasp stability, traversable floor versus negative obstacles, and dynamic scene graphs that persist over time [60,90,91]. These layers are not unique to depth sensors, but they become cheaper when scale is observed rather than inferred. In dynamic scenes, geometric SLAM without semantics remains brittle; recent surveys document the shift toward semantic and robust dynamic SLAM [27,107].</w:t>
+      </w:r>
+    </w:p>
+    <w:p>
+      <w:pPr>
+        <w:pStyle w:val="Heading2"/>
+      </w:pPr>
+      <w:r>
+        <w:rPr>
+          <w:rFonts w:ascii="Times New Roman" w:hAnsi="Times New Roman"/>
+          <w:color w:val="1F2937"/>
+        </w:rPr>
+        <w:t>3.4 Geometric calibration as a first-class subsystem</w:t>
+      </w:r>
+    </w:p>
+    <w:p>
+      <w:pPr>
+        <w:spacing w:after="160" w:line="360" w:lineRule="auto"/>
+        <w:ind w:firstLine="432"/>
+        <w:jc w:val="both"/>
+      </w:pPr>
+      <w:r>
+        <w:rPr>
+          <w:rFonts w:ascii="Times New Roman" w:hAnsi="Times New Roman" w:eastAsia="Times New Roman"/>
+          <w:b w:val="0"/>
+          <w:i w:val="0"/>
+          <w:sz w:val="22"/>
+        </w:rPr>
+        <w:t>Every number in Tables 2 and 3 assumes that the depth camera, the colour camera, and any IMU or LiDAR share a known frame. Zhang's planar calibrator is still the colour-camera starting point [108]. RGB-D devices need a joint model of colour intrinsics, depth distortion, and the depth-to-colour extrinsics; Herrera, Kannala, and Heikkila gave the recipe that most robotics stacks still follow [42]. Kinect-era papers already showed that an uncalibrated factory model leaves a systematic bowl in the point cloud [14,41]. On a mobile robot the same error looks like a sloping floor and a biased obstacle range [61]. Visual-inertial and lidar-inertial estimators can absorb a slowly varying extrinsic, but they cannot invent a time stamp that the hardware never sent [40,79,82]. A design review that skips the calibration and synchronization budget is not finished.</w:t>
       </w:r>
     </w:p>
     <w:p>
@@ -3343,7 +4914,7 @@
           <w:i w:val="0"/>
           <w:sz w:val="22"/>
         </w:rPr>
-        <w:t>Bin picking and unstructured part handling spend spatial resolution and short-range accuracy. A sensor above the bin produces a point cloud; a pose estimator returns a 6-DoF grasp; a compliant gripper absorbs the residual error [43,44,74,75,77,78]. Grasp-from-point-cloud methods (GPD, Dex-Net and their successors) showed that a depth image plus analytic or learned grasp scores can propose suction or parallel-jaw contacts without a full CAD model of every SKU [44,77]. When the part identity is known, multi-view pose networks of the Amazon Picking Challenge generation, and later PoseCNN-style estimators scored on BOP, turn the same cloud into a 6-DoF object pose [74,75,78]. The first Amazon Picking Challenge made the systems nature of this problem obvious: teams that treated perception, planning, and gripping as separately optimized modules underperformed relative to tightly integrated stacks, and suction often beat anthropomorphic hands [43]. Structured light and laser triangulation still dominate when parts are metallic, overlapping, and closer than about two metres [5,43]. RGB is typically fused for class identity; force and torque close the last millimetres.</w:t>
+        <w:t>Bin picking and unstructured part handling spend spatial resolution and short-range accuracy. A sensor above the bin produces a point cloud; a pose estimator returns a 6-DoF grasp; a compliant gripper absorbs the residual error [59,60,105,106,109,110,111,112,113]. Grasp-from-point-cloud methods (GPD, Dex-Net, GG-CNN, GraspNet) showed that a depth image plus analytic or learned grasp scores can propose suction or parallel-jaw contacts without a full CAD model of every SKU [60,109,111,112]. When the part identity is known, multi-view pose networks of the Amazon Picking Challenge generation, PoseCNN, DenseFusion, and later estimators scored on BOP turn the same cloud into a 6-DoF object pose [105,106,110,113]. The first Amazon Picking Challenge made the systems nature of this problem obvious: teams that treated perception, planning, and gripping as separately optimized modules underperformed relative to tightly integrated stacks, and suction often beat anthropomorphic hands [59]. Structured light and laser triangulation still dominate when parts are metallic, overlapping, and closer than about two metres [5,59]. RGB is typically fused for class identity; force and torque close the last millimetres.</w:t>
       </w:r>
     </w:p>
     <w:p>
@@ -3375,7 +4946,7 @@
           <w:i w:val="0"/>
           <w:sz w:val="22"/>
         </w:rPr>
-        <w:t>Automated guided vehicles (AGVs) and autonomous mobile robots (AMRs) spend field of view and vertical coverage. A two-dimensional safety LiDAR sees a plane; a wide RGB-D camera or solid-state LiDAR sees pallets, overhangs, and people who lean into the aisle [4,42,45]. Table 5 summarizes the pairing.</w:t>
+        <w:t>Automated guided vehicles (AGVs) and autonomous mobile robots (AMRs) spend field of view and vertical coverage. A two-dimensional safety LiDAR sees a plane; a wide RGB-D camera or solid-state LiDAR sees pallets, overhangs, and people who lean into the aisle [4,58,61]. Table 6 summarizes the pairing.</w:t>
       </w:r>
     </w:p>
     <w:p>
@@ -3391,7 +4962,7 @@
           <w:i/>
           <w:sz w:val="20"/>
         </w:rPr>
-        <w:t>Table 5. Industrial uses mapped to sensing requirements.</w:t>
+        <w:t>Table 6. Industrial uses mapped to sensing requirements.</w:t>
       </w:r>
     </w:p>
     <w:tbl>
@@ -3784,7 +5355,7 @@
           <w:i w:val="0"/>
           <w:sz w:val="22"/>
         </w:rPr>
-        <w:t>Indoor service robots made RGB-D SLAM a product feature. Devices such as RealSense D400-class cameras are chosen because they balance size, power, software support, and indoor range [4,20]. Keselman et al. documented the optical and matching behaviour of the R200 and D400 families, including the fact that projector texture is an aid rather than a requirement [20]. The algorithmic backbone is well documented: RGB-D odometry, loop closure, and a metric map [19,62,63,64]. Fankhauser et al. modelled Kinect v2 specifically as a navigation sensor and showed where its systematic bias matters for terrain [45]. The remaining failures are physical. Stairs and negative obstacles (curbs, open shafts) are invisible to a waist-height two-dimensional LiDAR. A forward depth camera can reconstruct them if the near field is valid and the robot is slow enough for the integration time [45]. Outdoor last-metre robots meet sunlight and long range, which is why the same software stack often grows a LiDAR or radar [41,42].</w:t>
+        <w:t>Indoor service robots made RGB-D SLAM a product feature. Devices such as RealSense D400-class cameras are chosen because they balance size, power, software support, and indoor range [4,20]. Keselman et al. documented the optical and matching behaviour of the R200 and D400 families, including the fact that projector texture is an aid rather than a requirement [20]. The algorithmic backbone is well documented: RGB-D odometry, loop closure, and a metric map [19,85,86,89]. Fankhauser et al. modelled Kinect v2 specifically as a navigation sensor and showed where its systematic bias matters for terrain [61]. The remaining failures are physical. Stairs and negative obstacles (curbs, open shafts) are invisible to a waist-height two-dimensional LiDAR. A forward depth camera can reconstruct them if the near field is valid and the robot is slow enough for the integration time [61]. Outdoor last-metre robots meet sunlight and long range, which is why the same software stack often grows a LiDAR or radar [57,58].</w:t>
       </w:r>
     </w:p>
     <w:p>
@@ -3800,7 +5371,7 @@
           <w:i w:val="0"/>
           <w:sz w:val="22"/>
         </w:rPr>
-        <w:t>Human-aware navigation is a semantic layer on the same geometry. Depth supplies a metric body hull; RGB pose estimators supply intent cues [15,16]. Socially acceptable clearance is then a planner parameter, not a new sensor. Active SLAM surveys discuss how a robot should move to keep that map healthy, which is a planning problem built on the same depth front-end [76].</w:t>
+        <w:t>Human-aware navigation is a semantic layer on the same geometry. Depth supplies a metric body hull; RGB pose estimators supply intent cues [15,16]. Socially acceptable clearance is then a planner parameter, not a new sensor. Active SLAM surveys discuss how a robot should move to keep that map healthy, which is a planning problem built on the same depth front-end [107].</w:t>
       </w:r>
     </w:p>
     <w:p>
@@ -3844,7 +5415,7 @@
           <w:i w:val="0"/>
           <w:sz w:val="22"/>
         </w:rPr>
-        <w:t>Obstacle avoidance is the first use. Depth gives a metric stop distance in GPS-denied corridors, forests, or plant rooms [2,79,80]. Barry, Florence, and Tedrake demonstrated tree avoidance at up to 14 m/s with a pushbroom stereo front-end running at 120 Hz on a small airframe [80]. That result is a reminder that geometric ranging, not a particular branded depth camera, is the requirement; stereo, RGB-D, and LiDAR are interchangeable only after latency, weight, and lighting are checked. Event-camera and event-stereo systems push latency into the microsecond regime for fast approach speeds [28,81,82,83]. Falanga et al. used event cameras to dodge dynamic obstacles that a frame-based pipeline would blur [81]. Miniature platforms have demonstrated onboard depth-based avoidance with tight compute envelopes [79].</w:t>
+        <w:t>Obstacle avoidance is the first use. Depth gives a metric stop distance in GPS-denied corridors, forests, or plant rooms [2,114,115]. Barry, Florence, and Tedrake demonstrated tree avoidance at up to 14 m/s with a pushbroom stereo front-end running at 120 Hz on a small airframe [115]. That result is a reminder that geometric ranging, not a particular branded depth camera, is the requirement; stereo, RGB-D, and LiDAR are interchangeable only after latency, weight, and lighting are checked. Event-camera and event-stereo systems push latency into the microsecond regime for fast approach speeds [28,116,117,118]. Falanga et al. used event cameras to dodge dynamic obstacles that a frame-based pipeline would blur [116]. Miniature platforms have demonstrated onboard depth-based avoidance with tight compute envelopes [114].</w:t>
       </w:r>
     </w:p>
     <w:p>
@@ -3860,7 +5431,7 @@
           <w:i w:val="0"/>
           <w:sz w:val="22"/>
         </w:rPr>
-        <w:t>Mapping and inspection is the second use. Photogrammetry from RGB already builds impressive models [84,85]. Depth or LiDAR is added when the operator needs metric scale, vegetation penetration, or a flight path that stays a fixed standoff from a girder [47,84,85]. Civil-infrastructure reviews show that the bottleneck is rarely whether a point cloud can be built. It is converting that cloud into defect locations that an engineer will trust [47].</w:t>
+        <w:t>Mapping and inspection is the second use. Photogrammetry from RGB already builds impressive models [119,120]. Depth or LiDAR is added when the operator needs metric scale, vegetation penetration, or a flight path that stays a fixed standoff from a girder [63,119,120,121,122]. Bridge work is the most documented civil case: drone-enabled visual inspection procedures exist, and unmanned systems have been used to cue fatigue-crack examination on steel members [121,122]. Next-best-view planners show how a ranging front-end can choose the next pose instead of flying a fixed lawnmower [123]. Civil-infrastructure reviews show that the bottleneck is rarely whether a point cloud can be built. It is converting that cloud into defect locations that an engineer will trust [63].</w:t>
       </w:r>
     </w:p>
     <w:p>
@@ -3872,7 +5443,7 @@
         <w:drawing>
           <wp:inline xmlns:a="http://schemas.openxmlformats.org/drawingml/2006/main" xmlns:pic="http://schemas.openxmlformats.org/drawingml/2006/picture">
             <wp:extent cx="5760720" cy="2854788"/>
-            <wp:docPr id="3" name="Picture 3"/>
+            <wp:docPr id="6" name="Picture 6"/>
             <wp:cNvGraphicFramePr>
               <a:graphicFrameLocks noChangeAspect="1"/>
             </wp:cNvGraphicFramePr>
@@ -3884,7 +5455,7 @@
                     <pic:cNvPicPr/>
                   </pic:nvPicPr>
                   <pic:blipFill>
-                    <a:blip r:embed="rId11"/>
+                    <a:blip r:embed="rId14"/>
                     <a:stretch>
                       <a:fillRect/>
                     </a:stretch>
@@ -3916,7 +5487,7 @@
           <w:i/>
           <w:sz w:val="20"/>
         </w:rPr>
-        <w:t>Figure 3. Representative UAV inspection pipeline assembled from published practice. This figure is a literature synthesis, not a system designed in the present paper.</w:t>
+        <w:t>Figure 5. Representative UAV inspection pipeline assembled from published practice. This figure is a literature synthesis, not a system designed in the present paper.</w:t>
       </w:r>
     </w:p>
     <w:p>
@@ -3932,7 +5503,7 @@
           <w:i w:val="0"/>
           <w:sz w:val="22"/>
         </w:rPr>
-        <w:t>Figure 3 describes a representative architecture assembled from published inspection practice, not a system designed in this paper. A bridge-inspection UAV typically carries a long-range ranging sensor (solid-state LiDAR or equivalent), a high-resolution RGB camera, and an IMU [47,84,85]. Onboard software fuses range and inertia into a local metric volume and runs a lightweight network on RGB for component and surface-defect cues [47]. The aircraft uplinks an annotated model and geotagged defect hypotheses rather than raw multi-sensor video. The design is a bandwidth and trust design: inspectors re-photograph the flagged regions instead of watching hours of flight video. Multi-UAV structure-from-motion benefits from the same metric scale cue. Depth does not replace inter-vehicle communication, but it reduces the need for dense ground control [84,85].</w:t>
+        <w:t>Figure 5 describes a representative architecture assembled from published inspection practice, not a system designed in this paper. A bridge-inspection UAV typically carries a long-range ranging sensor (solid-state LiDAR or equivalent), a high-resolution RGB camera, and an IMU [63,119,120]. Onboard software fuses range and inertia into a local metric volume and runs a lightweight network on RGB for component and surface-defect cues [63]. The aircraft uplinks an annotated model and geotagged defect hypotheses rather than raw multi-sensor video. The design is a bandwidth and trust design: inspectors re-photograph the flagged regions instead of watching hours of flight video. Multi-UAV structure-from-motion benefits from the same metric scale cue. Depth does not replace inter-vehicle communication, but it reduces the need for dense ground control [119,120].</w:t>
       </w:r>
     </w:p>
     <w:p>
@@ -3960,7 +5531,7 @@
           <w:i w:val="0"/>
           <w:sz w:val="22"/>
         </w:rPr>
-        <w:t>Collaborative cells fail first on safety, then on programming time [3,86,87]. Depth cameras address both, with limits that must be stated.</w:t>
+        <w:t>Collaborative cells fail first on safety, then on programming time [3,124,125,126,127]. Depth cameras address both, with limits that must be stated. Broader HRI surveys make the same split: methods that keep a human safe, and methods that make the robot usable [126,127].</w:t>
       </w:r>
     </w:p>
     <w:p>
@@ -3976,7 +5547,7 @@
           <w:i w:val="0"/>
           <w:sz w:val="22"/>
         </w:rPr>
-        <w:t>Workspace monitoring. A ceiling or cell-side depth sensor builds a three-dimensional occupancy of the shared volume. Speed-and-separation monitoring, as framed by ISO/TS 15066, can then slow or stop the arm when a person enters a warning or protective zone [3,88]. Three-dimensional monitoring is more complete than a light curtain because it can shrink the protective volume as the arm slows and can see a person who leans over a fence. A consumer RGB-D camera is not automatically a safety-rated device. Certified implementations still need a safety controller, defined failure modes, and usually a redundant sensing channel [3,87,88]. Surveys of industrial human-robot collaboration treat safety and the user interface as the two bottlenecks that decide whether a cobot is actually used, not whether a depth demo exists [3,86]. Collision detection on the arm itself remains necessary because vision cannot see inside the contact [87].</w:t>
+        <w:t>Workspace monitoring. A ceiling or cell-side depth sensor builds a three-dimensional occupancy of the shared volume. Speed-and-separation monitoring, as framed by ISO/TS 15066, can then slow or stop the arm when a person enters a warning or protective zone [3,33]. The industrial-robot safety standard ISO 10218 still sits underneath that technical specification [34]. Three-dimensional monitoring is more complete than a light curtain because it can shrink the protective volume as the arm slows and can see a person who leans over a fence. A consumer RGB-D camera is not automatically a safety-rated device. Certified implementations still need a safety controller, defined failure modes, and usually a redundant sensing channel [3,33,125,127]. Surveys of industrial human-robot collaboration treat safety and the user interface as the two bottlenecks that decide whether a cobot is actually used, not whether a depth demo exists [3,124,126]. Collision detection on the arm itself remains necessary because vision cannot see inside the contact [125].</w:t>
       </w:r>
     </w:p>
     <w:p>
@@ -3992,7 +5563,186 @@
           <w:i w:val="0"/>
           <w:sz w:val="22"/>
         </w:rPr>
-        <w:t>Programming by demonstration. Tracking a tool or a marked workpiece in 3D lets a non-expert move the robot through a path [3,86]. Structured light at short range is usually sufficient. The hard parts are correspondence, occlusion by the operator, and converting a human demonstration into a collision-free, force-feasible program. Gesture and activity cues can distinguish a small set of commands or detect that a station is ready for the next part [3,16]. This is useful. It is not a substitute for a well-designed hardware enable switch.</w:t>
+        <w:t>Programming by demonstration. Tracking a tool or a marked workpiece in 3D lets a non-expert move the robot through a path [3,124]. Structured light at short range is usually sufficient. The hard parts are correspondence, occlusion by the operator, and converting a human demonstration into a collision-free, force-feasible program. Gesture and activity cues can distinguish a small set of commands or detect that a station is ready for the next part [3,16]. This is useful. It is not a substitute for a well-designed hardware enable switch.</w:t>
+      </w:r>
+    </w:p>
+    <w:p>
+      <w:pPr>
+        <w:pStyle w:val="Heading2"/>
+      </w:pPr>
+      <w:r>
+        <w:rPr>
+          <w:rFonts w:ascii="Times New Roman" w:hAnsi="Times New Roman"/>
+          <w:color w:val="1F2937"/>
+        </w:rPr>
+        <w:t>4.5 A copy-paste selection checklist</w:t>
+      </w:r>
+    </w:p>
+    <w:p>
+      <w:pPr>
+        <w:spacing w:after="160" w:line="360" w:lineRule="auto"/>
+        <w:ind w:firstLine="432"/>
+        <w:jc w:val="both"/>
+      </w:pPr>
+      <w:r>
+        <w:rPr>
+          <w:rFonts w:ascii="Times New Roman" w:hAnsi="Times New Roman" w:eastAsia="Times New Roman"/>
+          <w:b w:val="0"/>
+          <w:i w:val="0"/>
+          <w:sz w:val="22"/>
+        </w:rPr>
+        <w:t>The following list is intended to be copied into a requirements document. It is the operational summary of Sections 2-4.</w:t>
+      </w:r>
+    </w:p>
+    <w:p>
+      <w:pPr>
+        <w:spacing w:after="160" w:line="360" w:lineRule="auto"/>
+        <w:jc w:val="both"/>
+      </w:pPr>
+      <w:r>
+        <w:rPr>
+          <w:rFonts w:ascii="Times New Roman" w:hAnsi="Times New Roman" w:eastAsia="Times New Roman"/>
+          <w:b w:val="0"/>
+          <w:i w:val="0"/>
+          <w:sz w:val="22"/>
+        </w:rPr>
+        <w:t>1. Write the minimum and maximum range that must work, not the range that would be nice.</w:t>
+      </w:r>
+    </w:p>
+    <w:p>
+      <w:pPr>
+        <w:spacing w:after="160" w:line="360" w:lineRule="auto"/>
+        <w:jc w:val="both"/>
+      </w:pPr>
+      <w:r>
+        <w:rPr>
+          <w:rFonts w:ascii="Times New Roman" w:hAnsi="Times New Roman" w:eastAsia="Times New Roman"/>
+          <w:b w:val="0"/>
+          <w:i w:val="0"/>
+          <w:sz w:val="22"/>
+        </w:rPr>
+        <w:t>2. Write the worst lighting (sun through a door, welding flash, night) and the worst surface (black rubber, glass, wet steel).</w:t>
+      </w:r>
+    </w:p>
+    <w:p>
+      <w:pPr>
+        <w:spacing w:after="160" w:line="360" w:lineRule="auto"/>
+        <w:jc w:val="both"/>
+      </w:pPr>
+      <w:r>
+        <w:rPr>
+          <w:rFonts w:ascii="Times New Roman" w:hAnsi="Times New Roman" w:eastAsia="Times New Roman"/>
+          <w:b w:val="0"/>
+          <w:i w:val="0"/>
+          <w:sz w:val="22"/>
+        </w:rPr>
+        <w:t>3. Write the mass, volume, and watt budget, including the illuminator.</w:t>
+      </w:r>
+    </w:p>
+    <w:p>
+      <w:pPr>
+        <w:spacing w:after="160" w:line="360" w:lineRule="auto"/>
+        <w:jc w:val="both"/>
+      </w:pPr>
+      <w:r>
+        <w:rPr>
+          <w:rFonts w:ascii="Times New Roman" w:hAnsi="Times New Roman" w:eastAsia="Times New Roman"/>
+          <w:b w:val="0"/>
+          <w:i w:val="0"/>
+          <w:sz w:val="22"/>
+        </w:rPr>
+        <w:t>4. Write the safety integrity: visualization, planner input, or motor-stop. Motor-stop needs a certified channel [33,34].</w:t>
+      </w:r>
+    </w:p>
+    <w:p>
+      <w:pPr>
+        <w:spacing w:after="160" w:line="360" w:lineRule="auto"/>
+        <w:jc w:val="both"/>
+      </w:pPr>
+      <w:r>
+        <w:rPr>
+          <w:rFonts w:ascii="Times New Roman" w:hAnsi="Times New Roman" w:eastAsia="Times New Roman"/>
+          <w:b w:val="0"/>
+          <w:i w:val="0"/>
+          <w:sz w:val="22"/>
+        </w:rPr>
+        <w:t>5. Pick the family from Figure 2. If two worlds appear, budget two sensors.</w:t>
+      </w:r>
+    </w:p>
+    <w:p>
+      <w:pPr>
+        <w:spacing w:after="160" w:line="360" w:lineRule="auto"/>
+        <w:jc w:val="both"/>
+      </w:pPr>
+      <w:r>
+        <w:rPr>
+          <w:rFonts w:ascii="Times New Roman" w:hAnsi="Times New Roman" w:eastAsia="Times New Roman"/>
+          <w:b w:val="0"/>
+          <w:i w:val="0"/>
+          <w:sz w:val="22"/>
+        </w:rPr>
+        <w:t>6. Pick a SKU only after reading a peer-reviewed evaluation of that family, not a datasheet alone [4,35,37].</w:t>
+      </w:r>
+    </w:p>
+    <w:p>
+      <w:pPr>
+        <w:spacing w:after="160" w:line="360" w:lineRule="auto"/>
+        <w:jc w:val="both"/>
+      </w:pPr>
+      <w:r>
+        <w:rPr>
+          <w:rFonts w:ascii="Times New Roman" w:hAnsi="Times New Roman" w:eastAsia="Times New Roman"/>
+          <w:b w:val="0"/>
+          <w:i w:val="0"/>
+          <w:sz w:val="22"/>
+        </w:rPr>
+        <w:t>7. Budget calibration, time synchronization, and a warm-up interval as line items [35,42].</w:t>
+      </w:r>
+    </w:p>
+    <w:p>
+      <w:pPr>
+        <w:spacing w:after="160" w:line="360" w:lineRule="auto"/>
+        <w:jc w:val="both"/>
+      </w:pPr>
+      <w:r>
+        <w:rPr>
+          <w:rFonts w:ascii="Times New Roman" w:hAnsi="Times New Roman" w:eastAsia="Times New Roman"/>
+          <w:b w:val="0"/>
+          <w:i w:val="0"/>
+          <w:sz w:val="22"/>
+        </w:rPr>
+        <w:t>8. Match the estimator to the cloud: TSDF for a table, VIO/VIDO for a room, LIO for a sparse outdoor scan [17,40,62].</w:t>
+      </w:r>
+    </w:p>
+    <w:p>
+      <w:pPr>
+        <w:spacing w:after="160" w:line="360" w:lineRule="auto"/>
+        <w:jc w:val="both"/>
+      </w:pPr>
+      <w:r>
+        <w:rPr>
+          <w:rFonts w:ascii="Times New Roman" w:hAnsi="Times New Roman" w:eastAsia="Times New Roman"/>
+          <w:b w:val="0"/>
+          <w:i w:val="0"/>
+          <w:sz w:val="22"/>
+        </w:rPr>
+        <w:t>9. Keep a raw or lightly filtered metric range path if the output can stop a motor. Do not stop a motor on a completed depth map alone.</w:t>
+      </w:r>
+    </w:p>
+    <w:p>
+      <w:pPr>
+        <w:spacing w:after="160" w:line="360" w:lineRule="auto"/>
+        <w:ind w:firstLine="432"/>
+        <w:jc w:val="both"/>
+      </w:pPr>
+      <w:r>
+        <w:rPr>
+          <w:rFonts w:ascii="Times New Roman" w:hAnsi="Times New Roman" w:eastAsia="Times New Roman"/>
+          <w:b w:val="0"/>
+          <w:i w:val="0"/>
+          <w:sz w:val="22"/>
+        </w:rPr>
+        <w:t>10. Re-test on the real surfaces and the real lighting. Indoor rankings reorder outdoors [4].</w:t>
       </w:r>
     </w:p>
     <w:p>
@@ -4032,7 +5782,7 @@
           <w:i w:val="0"/>
           <w:sz w:val="22"/>
         </w:rPr>
-        <w:t>The research literature sometimes treats remaining errors as temporary. Fielded mechatronic systems suggest otherwise.</w:t>
+        <w:t>The research literature sometimes treats remaining errors as temporary. Fielded mechatronic systems suggest otherwise. Table 7 separates mitigations that already ship from ideas that remain research.</w:t>
       </w:r>
     </w:p>
     <w:p>
@@ -4048,7 +5798,7 @@
           <w:i w:val="0"/>
           <w:sz w:val="22"/>
         </w:rPr>
-        <w:t>Environment and materials. NIR-based cameras saturate in sunlight [4,15]. Specular and transparent objects violate the single-bounce assumption and produce holes or biased ranges [7,35]. Coded and multi-frequency ToF can unmix some multipath, but they add capture time or hardware that a cheap module does not have [7,35]. Low-reflectance foam and black rubber starve the illuminator. Polarization, multi-frequency ToF, and radar fill-in help; none is universal. Comparative tests of ten indoor depth cameras remain the most useful reminder that material and lighting can reorder the ranking of otherwise similar devices [4].</w:t>
+        <w:t>Environment and materials. NIR-based cameras saturate in sunlight [4,15]. Specular and transparent objects violate the single-bounce assumption and produce holes or biased ranges [7,48]. Coded and multi-frequency ToF can unmix some multipath, but they add capture time or hardware that a cheap module does not have [7,48]. Low-reflectance foam and black rubber starve the illuminator. Polarization, multi-frequency ToF, and radar fill-in help; none is universal. Comparative tests of ten indoor depth cameras remain the most useful reminder that material and lighting can reorder the ranking of otherwise similar devices [4].</w:t>
       </w:r>
     </w:p>
     <w:p>
@@ -4064,7 +5814,7 @@
           <w:i w:val="0"/>
           <w:sz w:val="22"/>
         </w:rPr>
-        <w:t>Compute and power. Dense SLAM, TSDF fusion, and point-cloud networks are still expensive on a battery [1,21,54]. The illuminator, not only the GPU, shortens UAV endurance [2,21]. Event-based and neuromorphic pipelines are promising where the scene is sparse in time [28,81,89], but they require a different software stack.</w:t>
+        <w:t>Compute and power. Dense SLAM, TSDF fusion, and point-cloud networks are still expensive on a battery [1,21,75]. The illuminator, not only the GPU, shortens UAV endurance [2,21]. Event-based and neuromorphic pipelines are promising where the scene is sparse in time [28,116,128], but they require a different software stack.</w:t>
       </w:r>
     </w:p>
     <w:p>
@@ -4080,7 +5830,7 @@
           <w:i w:val="0"/>
           <w:sz w:val="22"/>
         </w:rPr>
-        <w:t>Calibration and time. Multi-sensor extrinsics drift with temperature and shock. A one-degree boresight error is negligible for a room-scale display and unacceptable for a 50 m LiDAR-camera fusion [10,41]. Online self-calibration exists in research estimators [46,58]; it is not yet a maintenance-free commodity. Asynchronous streams and sensor dropouts can make a naively fused estimate worse than the best single sensor [42,55].</w:t>
+        <w:t>Calibration and time. Multi-sensor extrinsics drift with temperature and shock. A one-degree boresight error is negligible for a room-scale display and unacceptable for a 50 m LiDAR-camera fusion [10,57]. Online self-calibration exists in research estimators [62,79]; it is not yet a maintenance-free commodity. Asynchronous streams and sensor dropouts can make a naively fused estimate worse than the best single sensor [31,58].</w:t>
       </w:r>
     </w:p>
     <w:p>
@@ -4112,7 +5862,7 @@
           <w:i/>
           <w:sz w:val="20"/>
         </w:rPr>
-        <w:t>Table 6. Challenges and the honesty level of current mitigations.</w:t>
+        <w:t>Table 7. Challenges and the honesty level of current mitigations.</w:t>
       </w:r>
     </w:p>
     <w:tbl>
@@ -4333,7 +6083,7 @@
                 <w:i w:val="0"/>
                 <w:sz w:val="16"/>
               </w:rPr>
-              <w:t>Event + spiking co-design [28,90,91]</w:t>
+              <w:t>Event + spiking co-design [28,129,130]</w:t>
             </w:r>
           </w:p>
         </w:tc>
@@ -4575,7 +6325,7 @@
           <w:i w:val="0"/>
           <w:sz w:val="22"/>
         </w:rPr>
-        <w:t>Event-based and neuromorphic sensing. Asynchronous pixels report contrast changes at microsecond latency and high dynamic range [28,89]. Combined with pulsed illumination they can support low-power depth for high-speed robots [81,82,83,92,93]. Co-design with spiking processors aims to cut the energy of spatial reasoning [90,91]. These systems will complement, not replace, frame-based RGB-D in the next product cycle.</w:t>
+        <w:t>Event-based and neuromorphic sensing. Asynchronous pixels report contrast changes at microsecond latency and high dynamic range [28,128,131]. Combined with pulsed illumination they can support low-power depth for high-speed robots [116,117,118,132,133]. Automotive work has already shown that event cameras can close a low-latency perception loop that frame cameras miss [134]. Co-design with spiking processors aims to cut the energy of spatial reasoning [129,130]. These systems will complement, not replace, frame-based RGB-D in the next product cycle.</w:t>
       </w:r>
     </w:p>
     <w:p>
@@ -4591,7 +6341,7 @@
           <w:i w:val="0"/>
           <w:sz w:val="22"/>
         </w:rPr>
-        <w:t>AI near the sensor. Depth completion and a first detection head are moving into image-signal processors and sensor stacks [12,21,53]. The engineering gain is bandwidth: a robot can ship a confidence-weighted cloud or a set of objects instead of a raw 30 Hz volume. The engineering risk is silent metric failure. Safety-related channels should keep a raw or lightly filtered range path.</w:t>
+        <w:t>AI near the sensor. Depth completion and a first detection head are moving into image-signal processors and sensor stacks [12,21,70]. The engineering gain is bandwidth: a robot can ship a confidence-weighted cloud or a set of objects instead of a raw 30 Hz volume. The engineering risk is silent metric failure. Safety-related channels should keep a raw or lightly filtered range path.</w:t>
       </w:r>
     </w:p>
     <w:p>
@@ -4607,7 +6357,7 @@
           <w:i w:val="0"/>
           <w:sz w:val="22"/>
         </w:rPr>
-        <w:t>Richer fusion. Depth-RGB-IMU is already standard. Adding millimetre-wave radar (fog, rain, radial velocity) and thermal cameras is the practical next step, already visible in automotive datasets [42,94]. The unsolved part is a fusion integrity layer: knowing when to stop trusting a modality.</w:t>
+        <w:t>Richer fusion. Depth-RGB-IMU is already standard. Adding millimetre-wave radar (fog, rain, radial velocity) and thermal cameras is the practical next step, already visible in automotive datasets [58,135]. The unsolved part is a fusion integrity layer: knowing when to stop trusting a modality.</w:t>
       </w:r>
     </w:p>
     <w:p>
@@ -4623,7 +6373,7 @@
           <w:i w:val="0"/>
           <w:sz w:val="22"/>
         </w:rPr>
-        <w:t>Photonics and materials. Metalenses and other flat optics can shrink camera modules [95]. Chip-scale optical phased arrays and MEMS-on-photonics LiDAR attack the scanner itself [38,39,40]. First-photon imaging and non-line-of-sight reconstructions show what is physically possible at extreme photon counts [96,97]. They are not yet bill-of-materials options for a warehouse AMR.</w:t>
+        <w:t>Photonics and materials. Metalenses and other flat optics can shrink camera modules [136]. Chip-scale optical phased arrays and MEMS-on-photonics LiDAR attack the scanner itself [53,54,55,56]. First-photon imaging and non-line-of-sight reconstructions show what is physically possible at extreme photon counts [137,138]. They are not yet bill-of-materials options for a warehouse AMR.</w:t>
       </w:r>
     </w:p>
     <w:p>
@@ -4739,6 +6489,34 @@
           <w:rFonts w:ascii="Times New Roman" w:hAnsi="Times New Roman"/>
           <w:color w:val="1F2937"/>
         </w:rPr>
+        <w:t>Funding</w:t>
+      </w:r>
+    </w:p>
+    <w:p>
+      <w:pPr>
+        <w:spacing w:after="160" w:line="360" w:lineRule="auto"/>
+        <w:ind w:firstLine="432"/>
+        <w:jc w:val="both"/>
+      </w:pPr>
+      <w:r>
+        <w:rPr>
+          <w:rFonts w:ascii="Times New Roman" w:hAnsi="Times New Roman" w:eastAsia="Times New Roman"/>
+          <w:b w:val="0"/>
+          <w:i w:val="0"/>
+          <w:sz w:val="22"/>
+        </w:rPr>
+        <w:t>This review received no specific external funding. The authors will replace this sentence with grant numbers if required by their institution.</w:t>
+      </w:r>
+    </w:p>
+    <w:p>
+      <w:pPr>
+        <w:pStyle w:val="Heading1"/>
+      </w:pPr>
+      <w:r>
+        <w:rPr>
+          <w:rFonts w:ascii="Times New Roman" w:hAnsi="Times New Roman"/>
+          <w:color w:val="1F2937"/>
+        </w:rPr>
         <w:t>Conflicts of interest</w:t>
       </w:r>
     </w:p>
@@ -4795,6 +6573,34 @@
           <w:rFonts w:ascii="Times New Roman" w:hAnsi="Times New Roman"/>
           <w:color w:val="1F2937"/>
         </w:rPr>
+        <w:t>Acknowledgments</w:t>
+      </w:r>
+    </w:p>
+    <w:p>
+      <w:pPr>
+        <w:spacing w:after="160" w:line="360" w:lineRule="auto"/>
+        <w:ind w:firstLine="432"/>
+        <w:jc w:val="both"/>
+      </w:pPr>
+      <w:r>
+        <w:rPr>
+          <w:rFonts w:ascii="Times New Roman" w:hAnsi="Times New Roman" w:eastAsia="Times New Roman"/>
+          <w:b w:val="0"/>
+          <w:i w:val="0"/>
+          <w:sz w:val="22"/>
+        </w:rPr>
+        <w:t>The authors thank colleagues who commented on an earlier draft. Any remaining errors are the authors' own.</w:t>
+      </w:r>
+    </w:p>
+    <w:p>
+      <w:pPr>
+        <w:pStyle w:val="Heading1"/>
+      </w:pPr>
+      <w:r>
+        <w:rPr>
+          <w:rFonts w:ascii="Times New Roman" w:hAnsi="Times New Roman"/>
+          <w:color w:val="1F2937"/>
+        </w:rPr>
         <w:t>References</w:t>
       </w:r>
     </w:p>
@@ -5260,7 +7066,7 @@
           <w:i w:val="0"/>
           <w:sz w:val="20"/>
         </w:rPr>
-        <w:t>[31] Lange R, Seitz P. Solid-state time-of-flight range camera. IEEE Journal of Quantum Electronics. 2001;37(3):390-397. doi:10.1109/3.910448</w:t>
+        <w:t>[31] Thrun S, Burgard W, Fox D. Probabilistic Robotics. Cambridge, MA: MIT Press; 2005.</w:t>
       </w:r>
     </w:p>
     <w:p>
@@ -5275,7 +7081,7 @@
           <w:i w:val="0"/>
           <w:sz w:val="20"/>
         </w:rPr>
-        <w:t>[32] Niclass C, Soga M, Kato S, Matsubara H, Kagami M. A 0.18-um CMOS SoC for a 100-m-range 10-frame/s 200 x 96-pixel time-of-flight depth sensor. IEEE Journal of Solid-State Circuits. 2013;48(2):559-572. doi:10.1109/JSSC.2012.2227607</w:t>
+        <w:t>[32] Hansard M, Lee S, Choi O, Horaud R. Time-of-Flight Cameras: Principles, Methods and Applications. London: Springer; 2013. doi:10.1007/978-1-4471-4658-2</w:t>
       </w:r>
     </w:p>
     <w:p>
@@ -5290,7 +7096,7 @@
           <w:i w:val="0"/>
           <w:sz w:val="20"/>
         </w:rPr>
-        <w:t>[33] Lachat E, Macher H, Landes T, Grussenmeyer P. Assessment and calibration of a RGB-D camera (Kinect v2 sensor) towards a potential use for close-range 3D modeling. Remote Sensing. 2015;7(10):13070-13097. doi:10.3390/rs71013070</w:t>
+        <w:t>[33] International Organization for Standardization. ISO/TS 15066:2016. Robots and robotic devices - Collaborative robots. Geneva: ISO; 2016.</w:t>
       </w:r>
     </w:p>
     <w:p>
@@ -5305,7 +7111,7 @@
           <w:i w:val="0"/>
           <w:sz w:val="20"/>
         </w:rPr>
-        <w:t>[34] Pagliari D, Pinto L. Calibration of Kinect for Xbox One and comparison between the two generations of Microsoft sensors. Sensors. 2015;15(11):27569-27589. doi:10.3390/s151127569</w:t>
+        <w:t>[34] International Organization for Standardization. ISO 10218-1:2011. Robots and robotic devices - Safety requirements for industrial robots - Part 1: Robots. Geneva: ISO; 2011.</w:t>
       </w:r>
     </w:p>
     <w:p>
@@ -5320,7 +7126,7 @@
           <w:i w:val="0"/>
           <w:sz w:val="20"/>
         </w:rPr>
-        <w:t>[35] Kadambi A, Whyte R, Bhandari A, Streeter L, Barsi C, Dorrington A, Raskar R. Coded time of flight cameras: sparse deconvolution to address multipath interference and recover time profiles. ACM Transactions on Graphics. 2013;32(6):167. doi:10.1145/2508363.2508428</w:t>
+        <w:t>[35] Tolgyessy M, Dekan M, Chovanec L, Hubinsky P. Evaluation of the Azure Kinect and its comparison to Kinect v1 and Kinect v2. Sensors. 2021;21(2):413. doi:10.3390/s21020413</w:t>
       </w:r>
     </w:p>
     <w:p>
@@ -5335,7 +7141,7 @@
           <w:i w:val="0"/>
           <w:sz w:val="20"/>
         </w:rPr>
-        <w:t>[36] Kim I, Martins RJ, Jang J, Badloe T, Khadir S, Jung HY, Kim H, Kim J, Genevet P, Rho J. Nanophotonics for light detection and ranging technology. Nature Nanotechnology. 2021;16:508-524. doi:10.1038/s41565-021-00895-3</w:t>
+        <w:t>[36] Kurillo G, Hemingway E, Cheng ML, Cheng L. Evaluating the accuracy of the Azure Kinect and Kinect v2. Sensors. 2022;22(7):2469. doi:10.3390/s22072469</w:t>
       </w:r>
     </w:p>
     <w:p>
@@ -5350,7 +7156,7 @@
           <w:i w:val="0"/>
           <w:sz w:val="20"/>
         </w:rPr>
-        <w:t>[37] Park J, Jeong BG, Kim SI, Lee D, Kim J, Shin C, Lee CB, Otsuka T, Kyoung J, Kim S, Yang KY, Park YY, Lee J, Hwang I, Jang J, Song SH, Brongersma ML, Ha K, Hwang SW, Choo H, Choi BL. All-solid-state spatial light modulator with independent phase and amplitude control for three-dimensional LiDAR applications. Nature Nanotechnology. 2021;16:69-76. doi:10.1038/s41565-020-00787-y</w:t>
+        <w:t>[37] Carfagni M, Furferi R, Governi L, Santarelli C, Servi M, Uccheddu F, Volpe Y. Metrological and critical characterization of the Intel D415 stereo depth camera. Sensors. 2019;19(3):489. doi:10.3390/s19030489</w:t>
       </w:r>
     </w:p>
     <w:p>
@@ -5365,7 +7171,7 @@
           <w:i w:val="0"/>
           <w:sz w:val="20"/>
         </w:rPr>
-        <w:t>[38] Sun J, Timurdogan E, Yaacobi A, Hosseini ES, Watts MR. Large-scale nanophotonic phased array. Nature. 2013;493:195-199. doi:10.1038/nature11727</w:t>
+        <w:t>[38] Zhang J, Singh S. LOAM: Lidar odometry and mapping in real-time. In: Robotics: Science and Systems; 2014. doi:10.15607/RSS.2014.X.007</w:t>
       </w:r>
     </w:p>
     <w:p>
@@ -5380,7 +7186,7 @@
           <w:i w:val="0"/>
           <w:sz w:val="20"/>
         </w:rPr>
-        <w:t>[39] Poulton CV, Yaacobi A, Cole DB, Byrd MJ, Raval M, Vermeulen D, Watts MR. Coherent solid-state LIDAR with silicon photonic optical phased arrays. Optics Letters. 2017;42(20):4091-4094. doi:10.1364/OL.42.004091</w:t>
+        <w:t>[39] Shan T, Englot B, Meyers D, Wang W, Ratti C, Rus D. LIO-SAM: Tightly-coupled lidar inertial odometry via smoothing and mapping. In: IEEE/RSJ International Conference on Intelligent Robots and Systems (IROS); 2020. p. 5135-5142. doi:10.1109/IROS45743.2020.9341176</w:t>
       </w:r>
     </w:p>
     <w:p>
@@ -5395,7 +7201,7 @@
           <w:i w:val="0"/>
           <w:sz w:val="20"/>
         </w:rPr>
-        <w:t>[40] Zhang X, Kwon K, Henriksson J, Luo J, Wu MC. A large-scale microelectromechanical-systems-based silicon photonic LiDAR. Nature. 2022;603:253-258. doi:10.1038/s41586-022-04415-8</w:t>
+        <w:t>[40] Xu W, Cai Y, He D, Lin J, Zhang F. FAST-LIO2: Fast direct LiDAR-inertial odometry. IEEE Transactions on Robotics. 2022;38(4):2053-2073. doi:10.1109/TRO.2022.3141876</w:t>
       </w:r>
     </w:p>
     <w:p>
@@ -5410,7 +7216,7 @@
           <w:i w:val="0"/>
           <w:sz w:val="20"/>
         </w:rPr>
-        <w:t>[41] Debeunne C, Vivet D. A review of visual-LiDAR fusion based simultaneous localization and mapping. Sensors. 2020;20(7):2068. doi:10.3390/s20072068</w:t>
+        <w:t>[41] Smisek J, Jancosek M, Pajdla T. 3D with Kinect. In: IEEE International Conference on Computer Vision Workshops (ICCVW); 2011. p. 1154-1160. doi:10.1109/ICCVW.2011.6130380</w:t>
       </w:r>
     </w:p>
     <w:p>
@@ -5425,7 +7231,7 @@
           <w:i w:val="0"/>
           <w:sz w:val="20"/>
         </w:rPr>
-        <w:t>[42] Yeong DJ, Velasco-Hernandez G, Barry J, Walsh J. Sensor and sensor fusion technology in autonomous vehicles: A review. Sensors. 2021;21(6):2140. doi:10.3390/s21062140</w:t>
+        <w:t>[42] Herrera C D, Kannala J, Heikkila J. Joint depth and color camera calibration with distortion correction. IEEE Transactions on Pattern Analysis and Machine Intelligence. 2012;34(10):2058-2064. doi:10.1109/TPAMI.2012.125</w:t>
       </w:r>
     </w:p>
     <w:p>
@@ -5440,7 +7246,7 @@
           <w:i w:val="0"/>
           <w:sz w:val="20"/>
         </w:rPr>
-        <w:t>[43] Correll N, Bekris KE, Berenson D, Brock O, Causo A, Hauser K, Okada K, Rodriguez A, Romano JM, Wurman PR. Analysis and observations from the first Amazon Picking Challenge. IEEE Transactions on Automation Science and Engineering. 2018;15(1):172-188. doi:10.1109/TASE.2016.2600527</w:t>
+        <w:t>[43] Lange R, Seitz P. Solid-state time-of-flight range camera. IEEE Journal of Quantum Electronics. 2001;37(3):390-397. doi:10.1109/3.910448</w:t>
       </w:r>
     </w:p>
     <w:p>
@@ -5455,7 +7261,7 @@
           <w:i w:val="0"/>
           <w:sz w:val="20"/>
         </w:rPr>
-        <w:t>[44] ten Pas A, Gualtieri M, Saenko K, Platt R. Grasp pose detection in point clouds. The International Journal of Robotics Research. 2017;36(13-14):1455-1473. doi:10.1177/0278364917735594</w:t>
+        <w:t>[44] Niclass C, Soga M, Kato S, Matsubara H, Kagami M. A 0.18-um CMOS SoC for a 100-m-range 10-frame/s 200 x 96-pixel time-of-flight depth sensor. IEEE Journal of Solid-State Circuits. 2013;48(2):559-572. doi:10.1109/JSSC.2012.2227607</w:t>
       </w:r>
     </w:p>
     <w:p>
@@ -5470,7 +7276,7 @@
           <w:i w:val="0"/>
           <w:sz w:val="20"/>
         </w:rPr>
-        <w:t>[45] Fankhauser P, Bloesch M, Rodriguez D, Kaestner R, Hutter M, Siegwart R. Kinect v2 for mobile robot navigation: Evaluation and modeling. In: International Conference on Advanced Robotics (ICAR); 2015. p. 388-394. doi:10.1109/ICAR.2015.7251485</w:t>
+        <w:t>[45] Lachat E, Macher H, Landes T, Grussenmeyer P. Assessment and calibration of a RGB-D camera (Kinect v2 sensor) towards a potential use for close-range 3D modeling. Remote Sensing. 2015;7(10):13070-13097. doi:10.3390/rs71013070</w:t>
       </w:r>
     </w:p>
     <w:p>
@@ -5485,7 +7291,7 @@
           <w:i w:val="0"/>
           <w:sz w:val="20"/>
         </w:rPr>
-        <w:t>[46] Campos C, Elvira R, Rodriguez JJG, Montiel JMM, Tardos JD. ORB-SLAM3: An accurate open-source library for visual, visual-inertial, and multimap SLAM. IEEE Transactions on Robotics. 2021;37(6):1874-1890. doi:10.1109/TRO.2021.3075644</w:t>
+        <w:t>[46] Pagliari D, Pinto L. Calibration of Kinect for Xbox One and comparison between the two generations of Microsoft sensors. Sensors. 2015;15(11):27569-27589. doi:10.3390/s151127569</w:t>
       </w:r>
     </w:p>
     <w:p>
@@ -5500,7 +7306,7 @@
           <w:i w:val="0"/>
           <w:sz w:val="20"/>
         </w:rPr>
-        <w:t>[47] Spencer BF Jr, Hoskere V, Narazaki Y. Advances in computer vision-based civil infrastructure inspection and monitoring. Engineering. 2019;5(2):199-222. doi:10.1016/j.eng.2018.11.030</w:t>
+        <w:t>[47] Wasenmuller O, Stricker D. Comparison of Kinect v1 and v2 depth images in terms of accuracy and precision. In: Computer Vision - ACCV 2016 Workshops. Springer; 2017. p. 34-45. doi:10.1007/978-3-319-54427-4_3</w:t>
       </w:r>
     </w:p>
     <w:p>
@@ -5515,7 +7321,7 @@
           <w:i w:val="0"/>
           <w:sz w:val="20"/>
         </w:rPr>
-        <w:t>[48] Kopf J, Cohen MF, Lischinski D, Uyttendaele M. Joint bilateral upsampling. ACM Transactions on Graphics. 2007;26(3):96. doi:10.1145/1276377.1276497</w:t>
+        <w:t>[48] Kadambi A, Whyte R, Bhandari A, Streeter L, Barsi C, Dorrington A, Raskar R. Coded time of flight cameras: sparse deconvolution to address multipath interference and recover time profiles. ACM Transactions on Graphics. 2013;32(6):167. doi:10.1145/2508363.2508428</w:t>
       </w:r>
     </w:p>
     <w:p>
@@ -5530,7 +7336,7 @@
           <w:i w:val="0"/>
           <w:sz w:val="20"/>
         </w:rPr>
-        <w:t>[49] Silberman N, Hoiem D, Kohli P, Fergus R. Indoor segmentation and support inference from RGBD images. In: Computer Vision - ECCV 2012. Springer; 2012. p. 746-760. doi:10.1007/978-3-642-33715-4_54</w:t>
+        <w:t>[49] Royo S, Ballesta-Garcia M. An overview of lidar imaging systems for autonomous vehicles. Applied Sciences. 2019;9(19):4093. doi:10.3390/app9194093</w:t>
       </w:r>
     </w:p>
     <w:p>
@@ -5545,7 +7351,7 @@
           <w:i w:val="0"/>
           <w:sz w:val="20"/>
         </w:rPr>
-        <w:t>[50] Laina I, Rupprecht C, Belagiannis V, Tombari F, Navab N. Deeper depth prediction with fully convolutional residual networks. In: International Conference on 3D Vision (3DV); 2016. p. 239-248. doi:10.1109/3DV.2016.32</w:t>
+        <w:t>[50] Behroozpour B, Sandborn PAM, Wu MC, Boser BE. Lidar system architectures and circuits. IEEE Communications Magazine. 2017;55(10):135-142. doi:10.1109/MCOM.2017.1700030</w:t>
       </w:r>
     </w:p>
     <w:p>
@@ -5560,7 +7366,7 @@
           <w:i w:val="0"/>
           <w:sz w:val="20"/>
         </w:rPr>
-        <w:t>[51] Godard C, Mac Aodha O, Firman M, Brostow GJ. Digging into self-supervised monocular depth estimation. In: Proceedings of the IEEE/CVF International Conference on Computer Vision (ICCV); 2019. p. 3828-3838. doi:10.1109/ICCV.2019.00393</w:t>
+        <w:t>[51] Kim I, Martins RJ, Jang J, Badloe T, Khadir S, Jung HY, Kim H, Kim J, Genevet P, Rho J. Nanophotonics for light detection and ranging technology. Nature Nanotechnology. 2021;16:508-524. doi:10.1038/s41565-021-00895-3</w:t>
       </w:r>
     </w:p>
     <w:p>
@@ -5575,7 +7381,7 @@
           <w:i w:val="0"/>
           <w:sz w:val="20"/>
         </w:rPr>
-        <w:t>[52] Uhrig J, Schneider N, Schneider L, Franke U, Brox T, Geiger A. Sparsity invariant CNNs. In: International Conference on 3D Vision (3DV); 2017. p. 11-20. doi:10.1109/3DV.2017.00012</w:t>
+        <w:t>[52] Park J, Jeong BG, Kim SI, Lee D, Kim J, Shin C, Lee CB, Otsuka T, Kyoung J, Kim S, Yang KY, Park YY, Lee J, Hwang I, Jang J, Song SH, Brongersma ML, Ha K, Hwang SW, Choo H, Choi BL. All-solid-state spatial light modulator with independent phase and amplitude control for three-dimensional LiDAR applications. Nature Nanotechnology. 2021;16:69-76. doi:10.1038/s41565-020-00787-y</w:t>
       </w:r>
     </w:p>
     <w:p>
@@ -5590,7 +7396,7 @@
           <w:i w:val="0"/>
           <w:sz w:val="20"/>
         </w:rPr>
-        <w:t>[53] Ma F, Karaman S. Sparse-to-dense: Depth prediction from sparse depth samples and a single image. In: IEEE International Conference on Robotics and Automation (ICRA); 2018. p. 4796-4803. doi:10.1109/ICRA.2018.8460184</w:t>
+        <w:t>[53] Sun J, Timurdogan E, Yaacobi A, Hosseini ES, Watts MR. Large-scale nanophotonic phased array. Nature. 2013;493:195-199. doi:10.1038/nature11727</w:t>
       </w:r>
     </w:p>
     <w:p>
@@ -5605,7 +7411,7 @@
           <w:i w:val="0"/>
           <w:sz w:val="20"/>
         </w:rPr>
-        <w:t>[54] Guo Y, Wang H, Hu Q, Liu H, Liu L, Bennamoun M. Deep learning for 3D point clouds: A survey. IEEE Transactions on Pattern Analysis and Machine Intelligence. 2021;43(12):4338-4364. doi:10.1109/TPAMI.2020.3005434</w:t>
+        <w:t>[54] Poulton CV, Yaacobi A, Cole DB, Byrd MJ, Raval M, Vermeulen D, Watts MR. Coherent solid-state LIDAR with silicon photonic optical phased arrays. Optics Letters. 2017;42(20):4091-4094. doi:10.1364/OL.42.004091</w:t>
       </w:r>
     </w:p>
     <w:p>
@@ -5620,7 +7426,7 @@
           <w:i w:val="0"/>
           <w:sz w:val="20"/>
         </w:rPr>
-        <w:t>[55] Thrun S, Burgard W, Fox D. Probabilistic Robotics. Cambridge, MA: MIT Press; 2005.</w:t>
+        <w:t>[55] Zhang X, Kwon K, Henriksson J, Luo J, Wu MC. A large-scale microelectromechanical-systems-based silicon photonic LiDAR. Nature. 2022;603:253-258. doi:10.1038/s41586-022-04415-8</w:t>
       </w:r>
     </w:p>
     <w:p>
@@ -5635,7 +7441,7 @@
           <w:i w:val="0"/>
           <w:sz w:val="20"/>
         </w:rPr>
-        <w:t>[56] Leutenegger S, Lynen S, Bosse M, Siegwart R, Furgale P. Keyframe-based visual-inertial odometry using nonlinear optimization. The International Journal of Robotics Research. 2015;34(3):314-334. doi:10.1177/0278364914554813</w:t>
+        <w:t>[56] Hsu CP, Li B, Solano-Rivas B, Gohil AR, Chan PH, Moore AD, Donzella V. A review and perspective on optical phased array for automotive LiDAR. IEEE Journal of Selected Topics in Quantum Electronics. 2021;27(1):8300416. doi:10.1109/JSTQE.2020.3022948</w:t>
       </w:r>
     </w:p>
     <w:p>
@@ -5650,7 +7456,7 @@
           <w:i w:val="0"/>
           <w:sz w:val="20"/>
         </w:rPr>
-        <w:t>[57] Forster C, Carlone L, Dellaert F, Scaramuzza D. On-manifold preintegration for real-time visual-inertial odometry. IEEE Transactions on Robotics. 2017;33(1):1-21. doi:10.1109/TRO.2016.2597321</w:t>
+        <w:t>[57] Debeunne C, Vivet D. A review of visual-LiDAR fusion based simultaneous localization and mapping. Sensors. 2020;20(7):2068. doi:10.3390/s20072068</w:t>
       </w:r>
     </w:p>
     <w:p>
@@ -5665,7 +7471,7 @@
           <w:i w:val="0"/>
           <w:sz w:val="20"/>
         </w:rPr>
-        <w:t>[58] Qin T, Li P, Shen S. VINS-Mono: A robust and versatile monocular visual-inertial state estimator. IEEE Transactions on Robotics. 2018;34(4):1004-1020. doi:10.1109/TRO.2018.2853729</w:t>
+        <w:t>[58] Yeong DJ, Velasco-Hernandez G, Barry J, Walsh J. Sensor and sensor fusion technology in autonomous vehicles: A review. Sensors. 2021;21(6):2140. doi:10.3390/s21062140</w:t>
       </w:r>
     </w:p>
     <w:p>
@@ -5680,7 +7486,7 @@
           <w:i w:val="0"/>
           <w:sz w:val="20"/>
         </w:rPr>
-        <w:t>[59] Bloesch M, Omari S, Hutter M, Siegwart R. Robust visual inertial odometry using a direct EKF-based approach. In: IEEE/RSJ International Conference on Intelligent Robots and Systems (IROS); 2015. p. 298-304. doi:10.1109/IROS.2015.7353389</w:t>
+        <w:t>[59] Correll N, Bekris KE, Berenson D, Brock O, Causo A, Hauser K, Okada K, Rodriguez A, Romano JM, Wurman PR. Analysis and observations from the first Amazon Picking Challenge. IEEE Transactions on Automation Science and Engineering. 2018;15(1):172-188. doi:10.1109/TASE.2016.2600527</w:t>
       </w:r>
     </w:p>
     <w:p>
@@ -5695,7 +7501,7 @@
           <w:i w:val="0"/>
           <w:sz w:val="20"/>
         </w:rPr>
-        <w:t>[60] Whelan T, Leutenegger S, Salas-Moreno RF, Glocker B, Davison AJ. ElasticFusion: Dense SLAM without a pose graph. In: Robotics: Science and Systems; 2015. doi:10.15607/RSS.2015.XI.001</w:t>
+        <w:t>[60] ten Pas A, Gualtieri M, Saenko K, Platt R. Grasp pose detection in point clouds. The International Journal of Robotics Research. 2017;36(13-14):1455-1473. doi:10.1177/0278364917735594</w:t>
       </w:r>
     </w:p>
     <w:p>
@@ -5710,7 +7516,7 @@
           <w:i w:val="0"/>
           <w:sz w:val="20"/>
         </w:rPr>
-        <w:t>[61] Dai A, Niessner M, Zollhofer M, Izadi S, Theobalt C. BundleFusion: Real-time globally consistent 3D reconstruction using on-the-fly surface reintegration. ACM Transactions on Graphics. 2017;36(4):76a. doi:10.1145/3072959.3073615</w:t>
+        <w:t>[61] Fankhauser P, Bloesch M, Rodriguez D, Kaestner R, Hutter M, Siegwart R. Kinect v2 for mobile robot navigation: Evaluation and modeling. In: International Conference on Advanced Robotics (ICAR); 2015. p. 388-394. doi:10.1109/ICAR.2015.7251485</w:t>
       </w:r>
     </w:p>
     <w:p>
@@ -5725,7 +7531,7 @@
           <w:i w:val="0"/>
           <w:sz w:val="20"/>
         </w:rPr>
-        <w:t>[62] Endres F, Hess J, Sturm J, Cremers D, Burgard W. 3-D mapping with an RGB-D camera. IEEE Transactions on Robotics. 2014;30(1):177-187. doi:10.1109/TRO.2013.2279412</w:t>
+        <w:t>[62] Campos C, Elvira R, Rodriguez JJG, Montiel JMM, Tardos JD. ORB-SLAM3: An accurate open-source library for visual, visual-inertial, and multimap SLAM. IEEE Transactions on Robotics. 2021;37(6):1874-1890. doi:10.1109/TRO.2021.3075644</w:t>
       </w:r>
     </w:p>
     <w:p>
@@ -5740,7 +7546,7 @@
           <w:i w:val="0"/>
           <w:sz w:val="20"/>
         </w:rPr>
-        <w:t>[63] Sturm J, Engelhard N, Endres F, Burgard W, Cremers D. A benchmark for the evaluation of RGB-D SLAM systems. In: IEEE/RSJ International Conference on Intelligent Robots and Systems (IROS); 2012. p. 573-580. doi:10.1109/IROS.2012.6385773</w:t>
+        <w:t>[63] Spencer BF Jr, Hoskere V, Narazaki Y. Advances in computer vision-based civil infrastructure inspection and monitoring. Engineering. 2019;5(2):199-222. doi:10.1016/j.eng.2018.11.030</w:t>
       </w:r>
     </w:p>
     <w:p>
@@ -5755,7 +7561,7 @@
           <w:i w:val="0"/>
           <w:sz w:val="20"/>
         </w:rPr>
-        <w:t>[64] Mur-Artal R, Tardos JD. ORB-SLAM2: An open-source SLAM system for monocular, stereo, and RGB-D cameras. IEEE Transactions on Robotics. 2017;33(5):1255-1262. doi:10.1109/TRO.2017.2705103</w:t>
+        <w:t>[64] Carfagni M, Furferi R, Governi L, Servi M, Uccheddu F, Volpe Y. On the performance of the Intel SR300 depth camera: metrological and critical characterization. IEEE Sensors Journal. 2017;17(14):4508-4519. doi:10.1109/JSEN.2017.2703829</w:t>
       </w:r>
     </w:p>
     <w:p>
@@ -5770,7 +7576,7 @@
           <w:i w:val="0"/>
           <w:sz w:val="20"/>
         </w:rPr>
-        <w:t>[65] Rosinol A, Abate M, Chang Y, Carlone L. Kimera: an open-source library for real-time metric-semantic localization and mapping. In: IEEE International Conference on Robotics and Automation (ICRA); 2020. p. 1689-1696. doi:10.1109/ICRA40945.2020.9196885</w:t>
+        <w:t>[65] Kopf J, Cohen MF, Lischinski D, Uyttendaele M. Joint bilateral upsampling. ACM Transactions on Graphics. 2007;26(3):96. doi:10.1145/1276377.1276497</w:t>
       </w:r>
     </w:p>
     <w:p>
@@ -5785,7 +7591,7 @@
           <w:i w:val="0"/>
           <w:sz w:val="20"/>
         </w:rPr>
-        <w:t>[66] Tian Y, Chang Y, Herrera Arias F, Nieto-Granda C, How JP, Carlone L. Kimera-Multi: Robust, distributed, dense metric-semantic SLAM for multi-robot systems. IEEE Transactions on Robotics. 2022;38(4):2022-2038. doi:10.1109/TRO.2021.3137751</w:t>
+        <w:t>[66] Silberman N, Hoiem D, Kohli P, Fergus R. Indoor segmentation and support inference from RGBD images. In: Computer Vision - ECCV 2012. Springer; 2012. p. 746-760. doi:10.1007/978-3-642-33715-4_54</w:t>
       </w:r>
     </w:p>
     <w:p>
@@ -5800,7 +7606,7 @@
           <w:i w:val="0"/>
           <w:sz w:val="20"/>
         </w:rPr>
-        <w:t>[67] Engel J, Schops T, Cremers D. LSD-SLAM: Large-scale direct monocular SLAM. In: Computer Vision - ECCV 2014. Springer; 2014. p. 834-849. doi:10.1007/978-3-319-10605-2_54</w:t>
+        <w:t>[67] Laina I, Rupprecht C, Belagiannis V, Tombari F, Navab N. Deeper depth prediction with fully convolutional residual networks. In: International Conference on 3D Vision (3DV); 2016. p. 239-248. doi:10.1109/3DV.2016.32</w:t>
       </w:r>
     </w:p>
     <w:p>
@@ -5815,7 +7621,7 @@
           <w:i w:val="0"/>
           <w:sz w:val="20"/>
         </w:rPr>
-        <w:t>[68] Rusu RB, Cousins S. 3D is here: Point Cloud Library (PCL). In: IEEE International Conference on Robotics and Automation (ICRA); 2011. p. 1-4. doi:10.1109/ICRA.2011.5980567</w:t>
+        <w:t>[68] Godard C, Mac Aodha O, Firman M, Brostow GJ. Digging into self-supervised monocular depth estimation. In: Proceedings of the IEEE/CVF International Conference on Computer Vision (ICCV); 2019. p. 3828-3838. doi:10.1109/ICCV.2019.00393</w:t>
       </w:r>
     </w:p>
     <w:p>
@@ -5830,7 +7636,7 @@
           <w:i w:val="0"/>
           <w:sz w:val="20"/>
         </w:rPr>
-        <w:t>[69] Besl PJ, McKay ND. A method for registration of 3-D shapes. IEEE Transactions on Pattern Analysis and Machine Intelligence. 1992;14(2):239-256. doi:10.1109/34.121791</w:t>
+        <w:t>[69] Uhrig J, Schneider N, Schneider L, Franke U, Brox T, Geiger A. Sparsity invariant CNNs. In: International Conference on 3D Vision (3DV); 2017. p. 11-20. doi:10.1109/3DV.2017.00012</w:t>
       </w:r>
     </w:p>
     <w:p>
@@ -5845,7 +7651,7 @@
           <w:i w:val="0"/>
           <w:sz w:val="20"/>
         </w:rPr>
-        <w:t>[70] Hornung A, Wurm KM, Bennewitz M, Stachniss C, Burgard W. OctoMap: An efficient probabilistic 3D mapping framework based on octrees. Autonomous Robots. 2013;34:189-206. doi:10.1007/s10514-012-9321-0</w:t>
+        <w:t>[70] Ma F, Karaman S. Sparse-to-dense: Depth prediction from sparse depth samples and a single image. In: IEEE International Conference on Robotics and Automation (ICRA); 2018. p. 4796-4803. doi:10.1109/ICRA.2018.8460184</w:t>
       </w:r>
     </w:p>
     <w:p>
@@ -5860,7 +7666,7 @@
           <w:i w:val="0"/>
           <w:sz w:val="20"/>
         </w:rPr>
-        <w:t>[71] Oleynikova H, Taylor Z, Fehr M, Siegwart R, Nieto J. Voxblox: Incremental 3D Euclidean signed distance fields for on-board MAV planning. In: IEEE/RSJ International Conference on Intelligent Robots and Systems (IROS); 2017. p. 1366-1373. doi:10.1109/IROS.2017.8202315</w:t>
+        <w:t>[71] Zhang Y, Funkhouser T. Deep depth completion of a single RGB-D image. In: Proceedings of the IEEE Conference on Computer Vision and Pattern Recognition (CVPR); 2018. p. 175-185.</w:t>
       </w:r>
     </w:p>
     <w:p>
@@ -5875,7 +7681,7 @@
           <w:i w:val="0"/>
           <w:sz w:val="20"/>
         </w:rPr>
-        <w:t>[72] Qi CR, Su H, Mo K, Guibas LJ. PointNet: Deep learning on point sets for 3D classification and segmentation. In: Proceedings of the IEEE Conference on Computer Vision and Pattern Recognition (CVPR); 2017. p. 652-660. doi:10.1109/CVPR.2017.16</w:t>
+        <w:t>[72] Cheng X, Wang P, Yang R. Depth estimation via affinity learned with convolutional spatial propagation network. In: Proceedings of the IEEE Conference on Computer Vision and Pattern Recognition (CVPR); 2018. p. 5736-5744.</w:t>
       </w:r>
     </w:p>
     <w:p>
@@ -5890,7 +7696,7 @@
           <w:i w:val="0"/>
           <w:sz w:val="20"/>
         </w:rPr>
-        <w:t>[73] Qi CR, Yi L, Su H, Guibas LJ. PointNet++: Deep hierarchical feature learning on point sets in a metric space. In: Advances in Neural Information Processing Systems 30; 2017.</w:t>
+        <w:t>[73] Park J, Joo K, Hu Z, Liu CK, Kweon IS. Non-local spatial propagation network for depth completion. In: Computer Vision - ECCV 2020. Springer; 2020. p. 120-136. doi:10.1007/978-3-030-58601-0_8</w:t>
       </w:r>
     </w:p>
     <w:p>
@@ -5905,7 +7711,7 @@
           <w:i w:val="0"/>
           <w:sz w:val="20"/>
         </w:rPr>
-        <w:t>[74] Hodan T, Michel F, Brachmann E, Kehl W, Glent Buch A, Kraft D, Drost B, Vidal J, Ihrke S, Zabulis X, Sahin C, Manhardt F, Tombari F, Kim TK, Matas J, Rother C. BOP: Benchmark for 6D object pose estimation. In: Computer Vision - ECCV 2018. Springer; 2018. p. 19-34. doi:10.1007/978-3-030-01249-6_2</w:t>
+        <w:t>[74] Qiu J, Cui Z, Zhang Y, Zhang X, Liu S, Zeng B, Pollefeys M. DeepLiDAR: Deep surface normal guided depth prediction for outdoor scene from sparse LiDAR data and single color image. In: Proceedings of the IEEE/CVF Conference on Computer Vision and Pattern Recognition (CVPR); 2019. p. 3313-3322.</w:t>
       </w:r>
     </w:p>
     <w:p>
@@ -5920,7 +7726,7 @@
           <w:i w:val="0"/>
           <w:sz w:val="20"/>
         </w:rPr>
-        <w:t>[75] Xiang Y, Schmidt T, Narayanan V, Fox D. PoseCNN: A convolutional neural network for 6D object pose estimation in cluttered scenes. In: Robotics: Science and Systems; 2018. doi:10.15607/RSS.2018.XIV.019</w:t>
+        <w:t>[75] Guo Y, Wang H, Hu Q, Liu H, Liu L, Bennamoun M. Deep learning for 3D point clouds: A survey. IEEE Transactions on Pattern Analysis and Machine Intelligence. 2021;43(12):4338-4364. doi:10.1109/TPAMI.2020.3005434</w:t>
       </w:r>
     </w:p>
     <w:p>
@@ -5935,7 +7741,7 @@
           <w:i w:val="0"/>
           <w:sz w:val="20"/>
         </w:rPr>
-        <w:t>[76] Placed JA, Strader J, Carrillo H, Atanasov N, Indelman V, Carlone L, Castellanos JA. A survey on active simultaneous localization and mapping: State of the art and new frontiers. IEEE Transactions on Robotics. 2023;39(3):1686-1705. doi:10.1109/TRO.2023.3248510</w:t>
+        <w:t>[76] Lynen S, Achtelik MW, Weiss S, Chli M, Siegwart R. A robust and modular multi-sensor fusion approach applied to MAV navigation. In: IEEE/RSJ International Conference on Intelligent Robots and Systems (IROS); 2013. p. 3923-3929. doi:10.1109/IROS.2013.6696917</w:t>
       </w:r>
     </w:p>
     <w:p>
@@ -5950,7 +7756,7 @@
           <w:i w:val="0"/>
           <w:sz w:val="20"/>
         </w:rPr>
-        <w:t>[77] Mahler J, Liang J, Niyaz S, Laskey M, Doan R, Liu X, Ojea JA, Goldberg K. Dex-Net 2.0: Deep learning to plan robust grasps with synthetic point clouds and analytic grasp metrics. In: Robotics: Science and Systems; 2017. doi:10.15607/RSS.2017.XIII.058</w:t>
+        <w:t>[77] Leutenegger S, Lynen S, Bosse M, Siegwart R, Furgale P. Keyframe-based visual-inertial odometry using nonlinear optimization. The International Journal of Robotics Research. 2015;34(3):314-334. doi:10.1177/0278364914554813</w:t>
       </w:r>
     </w:p>
     <w:p>
@@ -5965,7 +7771,7 @@
           <w:i w:val="0"/>
           <w:sz w:val="20"/>
         </w:rPr>
-        <w:t>[78] Zeng A, Yu KT, Song S, Suo D, Walker E, Rodriguez A, Xiao J. Multi-view self-supervised deep learning for 6D pose estimation in the Amazon Picking Challenge. In: IEEE International Conference on Robotics and Automation (ICRA); 2017. p. 1386-1393. doi:10.1109/ICRA.2017.7989165</w:t>
+        <w:t>[78] Forster C, Carlone L, Dellaert F, Scaramuzza D. On-manifold preintegration for real-time visual-inertial odometry. IEEE Transactions on Robotics. 2017;33(1):1-21. doi:10.1109/TRO.2016.2597321</w:t>
       </w:r>
     </w:p>
     <w:p>
@@ -5980,7 +7786,7 @@
           <w:i w:val="0"/>
           <w:sz w:val="20"/>
         </w:rPr>
-        <w:t>[79] Muller H, Niculescu V, Polonelli T, Magno M, Benini L. Robust and efficient depth-based obstacle avoidance for autonomous miniaturized UAVs. IEEE Transactions on Robotics. 2023;39(6):4935-4951. doi:10.1109/TRO.2023.3325812</w:t>
+        <w:t>[79] Qin T, Li P, Shen S. VINS-Mono: A robust and versatile monocular visual-inertial state estimator. IEEE Transactions on Robotics. 2018;34(4):1004-1020. doi:10.1109/TRO.2018.2853729</w:t>
       </w:r>
     </w:p>
     <w:p>
@@ -5995,7 +7801,7 @@
           <w:i w:val="0"/>
           <w:sz w:val="20"/>
         </w:rPr>
-        <w:t>[80] Barry AJ, Florence PR, Tedrake R. High-speed autonomous obstacle avoidance with pushbroom stereo. Journal of Field Robotics. 2018;35(1):52-68. doi:10.1002/rob.21741</w:t>
+        <w:t>[80] Bloesch M, Omari S, Hutter M, Siegwart R. Robust visual inertial odometry using a direct EKF-based approach. In: IEEE/RSJ International Conference on Intelligent Robots and Systems (IROS); 2015. p. 298-304. doi:10.1109/IROS.2015.7353389</w:t>
       </w:r>
     </w:p>
     <w:p>
@@ -6010,7 +7816,7 @@
           <w:i w:val="0"/>
           <w:sz w:val="20"/>
         </w:rPr>
-        <w:t>[81] Falanga D, Kleber K, Scaramuzza D. Dynamic obstacle avoidance for quadrotors with event cameras. Science Robotics. 2020;5(40):eaaz9712. doi:10.1126/scirobotics.aaz9712</w:t>
+        <w:t>[81] Huang G. Visual-inertial navigation: A concise review. In: IEEE International Conference on Robotics and Automation (ICRA); 2019. p. 9572-9582. doi:10.1109/ICRA.2019.8793604</w:t>
       </w:r>
     </w:p>
     <w:p>
@@ -6025,7 +7831,7 @@
           <w:i w:val="0"/>
           <w:sz w:val="20"/>
         </w:rPr>
-        <w:t>[82] Zhou Y, Gallego G, Shen S. Event-based stereo visual odometry. IEEE Transactions on Robotics. 2021;37(5):1433-1450. doi:10.1109/TRO.2021.3062252</w:t>
+        <w:t>[82] Geneva P, Eckenhoff K, Lee W, Yang Y, Huang G. OpenVINS: A research platform for visual-inertial estimation. In: IEEE/RSJ International Conference on Intelligent Robots and Systems (IROS); 2020. p. 4666-4673.</w:t>
       </w:r>
     </w:p>
     <w:p>
@@ -6040,7 +7846,7 @@
           <w:i w:val="0"/>
           <w:sz w:val="20"/>
         </w:rPr>
-        <w:t>[83] He B, Wang Z, Zhou Y, Chen J, Singh CD, Li H, Gao Y, Shen S, Wang K, Cao Y, Xu C, Aloimonos Y, Gao F, Fermuller C. Microsaccade-inspired event camera for robotics. Science Robotics. 2024;9(90):eadj8124. doi:10.1126/scirobotics.adj8124</w:t>
+        <w:t>[83] Whelan T, Leutenegger S, Salas-Moreno RF, Glocker B, Davison AJ. ElasticFusion: Dense SLAM without a pose graph. In: Robotics: Science and Systems; 2015. doi:10.15607/RSS.2015.XI.001</w:t>
       </w:r>
     </w:p>
     <w:p>
@@ -6055,7 +7861,7 @@
           <w:i w:val="0"/>
           <w:sz w:val="20"/>
         </w:rPr>
-        <w:t>[84] Nex F, Remondino F. UAV for 3D mapping applications: a review. Applied Geomatics. 2014;6:1-15. doi:10.1007/s12518-013-0120-x</w:t>
+        <w:t>[84] Dai A, Niessner M, Zollhofer M, Izadi S, Theobalt C. BundleFusion: Real-time globally consistent 3D reconstruction using on-the-fly surface reintegration. ACM Transactions on Graphics. 2017;36(4):76a. doi:10.1145/3072959.3073615</w:t>
       </w:r>
     </w:p>
     <w:p>
@@ -6070,7 +7876,7 @@
           <w:i w:val="0"/>
           <w:sz w:val="20"/>
         </w:rPr>
-        <w:t>[85] Colomina I, Molina P. Unmanned aerial systems for photogrammetry and remote sensing: A review. ISPRS Journal of Photogrammetry and Remote Sensing. 2014;92:79-97. doi:10.1016/j.isprsjprs.2014.02.013</w:t>
+        <w:t>[85] Endres F, Hess J, Sturm J, Cremers D, Burgard W. 3-D mapping with an RGB-D camera. IEEE Transactions on Robotics. 2014;30(1):177-187. doi:10.1109/TRO.2013.2279412</w:t>
       </w:r>
     </w:p>
     <w:p>
@@ -6085,7 +7891,7 @@
           <w:i w:val="0"/>
           <w:sz w:val="20"/>
         </w:rPr>
-        <w:t>[86] Ajoudani A, Zanchettin AM, Ivaldi S, Albu-Schaffer A, Kosuge K, Khatib O. Progress and prospects of the human-robot collaboration. Autonomous Robots. 2018;42:957-975. doi:10.1007/s10514-017-9677-2</w:t>
+        <w:t>[86] Sturm J, Engelhard N, Endres F, Burgard W, Cremers D. A benchmark for the evaluation of RGB-D SLAM systems. In: IEEE/RSJ International Conference on Intelligent Robots and Systems (IROS); 2012. p. 573-580. doi:10.1109/IROS.2012.6385773</w:t>
       </w:r>
     </w:p>
     <w:p>
@@ -6100,7 +7906,7 @@
           <w:i w:val="0"/>
           <w:sz w:val="20"/>
         </w:rPr>
-        <w:t>[87] Haddadin S, De Luca A, Albu-Schaffer A. Robot collisions: A survey on detection, isolation, and identification. IEEE Transactions on Robotics. 2017;33(6):1292-1312. doi:10.1109/TRO.2017.2725543</w:t>
+        <w:t>[87] Kerl C, Sturm J, Cremers D. Dense visual SLAM for RGB-D cameras. In: IEEE/RSJ International Conference on Intelligent Robots and Systems (IROS); 2013. p. 2100-2106. doi:10.1109/IROS.2013.6696650</w:t>
       </w:r>
     </w:p>
     <w:p>
@@ -6115,7 +7921,7 @@
           <w:i w:val="0"/>
           <w:sz w:val="20"/>
         </w:rPr>
-        <w:t>[88] International Organization for Standardization. ISO/TS 15066:2016. Robots and robotic devices - Collaborative robots. Geneva: ISO; 2016.</w:t>
+        <w:t>[88] Mur-Artal R, Montiel JMM, Tardos JD. ORB-SLAM: A versatile and accurate monocular SLAM system. IEEE Transactions on Robotics. 2015;31(5):1147-1163. doi:10.1109/TRO.2015.2463671</w:t>
       </w:r>
     </w:p>
     <w:p>
@@ -6130,7 +7936,7 @@
           <w:i w:val="0"/>
           <w:sz w:val="20"/>
         </w:rPr>
-        <w:t>[89] Lichtsteiner P, Posch C, Delbruck T. A 128 x 128 120 dB 15 us latency asynchronous temporal contrast vision sensor. IEEE Journal of Solid-State Circuits. 2008;43(2):566-576. doi:10.1109/JSSC.2007.914337</w:t>
+        <w:t>[89] Mur-Artal R, Tardos JD. ORB-SLAM2: An open-source SLAM system for monocular, stereo, and RGB-D cameras. IEEE Transactions on Robotics. 2017;33(5):1255-1262. doi:10.1109/TRO.2017.2705103</w:t>
       </w:r>
     </w:p>
     <w:p>
@@ -6145,7 +7951,7 @@
           <w:i w:val="0"/>
           <w:sz w:val="20"/>
         </w:rPr>
-        <w:t>[90] Roy K, Jaiswal A, Panda P. Towards spike-based machine intelligence with neuromorphic computing. Nature. 2019;575:607-617. doi:10.1038/s41586-019-1677-2</w:t>
+        <w:t>[90] Rosinol A, Abate M, Chang Y, Carlone L. Kimera: an open-source library for real-time metric-semantic localization and mapping. In: IEEE International Conference on Robotics and Automation (ICRA); 2020. p. 1689-1696. doi:10.1109/ICRA40945.2020.9196885</w:t>
       </w:r>
     </w:p>
     <w:p>
@@ -6160,7 +7966,7 @@
           <w:i w:val="0"/>
           <w:sz w:val="20"/>
         </w:rPr>
-        <w:t>[91] Davies M, Srinivasa N, Lin TH, Chinya G, Cao Y, Choday SH, Dimou G, Joshi P, Imam N, Jain S, Liao Y, Lin CK, Lines A, Liu R, Mathaikutty D, McCoy S, Paul A, Tse J, Venkataramanan G, Weng YH, Wild A, Yang Y, Wang H. Loihi: A neuromorphic manycore processor with on-chip learning. IEEE Micro. 2018;38(1):82-99. doi:10.1109/MM.2018.112130359</w:t>
+        <w:t>[91] Tian Y, Chang Y, Herrera Arias F, Nieto-Granda C, How JP, Carlone L. Kimera-Multi: Robust, distributed, dense metric-semantic SLAM for multi-robot systems. IEEE Transactions on Robotics. 2022;38(4):2022-2038. doi:10.1109/TRO.2021.3137751</w:t>
       </w:r>
     </w:p>
     <w:p>
@@ -6175,7 +7981,7 @@
           <w:i w:val="0"/>
           <w:sz w:val="20"/>
         </w:rPr>
-        <w:t>[92] Rebecq H, Horstschaefer T, Gallego G, Scaramuzza D. EVO: A geometric approach to event-based 6-DOF parallel tracking and mapping in real time. IEEE Robotics and Automation Letters. 2017;2(2):593-600. doi:10.1109/LRA.2016.2645143</w:t>
+        <w:t>[92] Engel J, Schops T, Cremers D. LSD-SLAM: Large-scale direct monocular SLAM. In: Computer Vision - ECCV 2014. Springer; 2014. p. 834-849. doi:10.1007/978-3-319-10605-2_54</w:t>
       </w:r>
     </w:p>
     <w:p>
@@ -6190,7 +7996,7 @@
           <w:i w:val="0"/>
           <w:sz w:val="20"/>
         </w:rPr>
-        <w:t>[93] Guo S, Gallego G. CMax-SLAM: Event-based rotational-motion bundle adjustment and SLAM system using contrast maximization. IEEE Transactions on Robotics. 2024;40:2442-2461. doi:10.1109/TRO.2024.3378443</w:t>
+        <w:t>[93] Teed Z, Deng J. DROID-SLAM: Tracking any pixel in any scene. In: Advances in Neural Information Processing Systems 34; 2021.</w:t>
       </w:r>
     </w:p>
     <w:p>
@@ -6205,7 +8011,7 @@
           <w:i w:val="0"/>
           <w:sz w:val="20"/>
         </w:rPr>
-        <w:t>[94] Caesar H, Bankiti V, Lang AH, Vora S, Liong VE, Xu Q, Krishnan A, Pan Y, Baldan G, Beijbom O. nuScenes: A multimodal dataset for autonomous driving. In: Proceedings of the IEEE/CVF Conference on Computer Vision and Pattern Recognition (CVPR); 2020. p. 11621-11631. doi:10.1109/CVPR42600.2020.01164</w:t>
+        <w:t>[94] Sucar E, Liu S, Ortiz J, Davison AJ. iMAP: Implicit mapping and positioning in real-time. In: Proceedings of the IEEE/CVF International Conference on Computer Vision (ICCV); 2021. p. 6229-6238.</w:t>
       </w:r>
     </w:p>
     <w:p>
@@ -6220,7 +8026,7 @@
           <w:i w:val="0"/>
           <w:sz w:val="20"/>
         </w:rPr>
-        <w:t>[95] Khorasaninejad M, Capasso F. Metalenses: Versatile multifunctional photonic components. Science. 2017;358(6367):eaam8100. doi:10.1126/science.aam8100</w:t>
+        <w:t>[95] Zhu Z, Peng S, Larsson V, Xu W, Bao H, Cui Z, Oswald MR, Pollefeys M. NICE-SLAM: Neural implicit scalable encoding for SLAM. In: Proceedings of the IEEE/CVF Conference on Computer Vision and Pattern Recognition (CVPR); 2022. p. 12786-12796.</w:t>
       </w:r>
     </w:p>
     <w:p>
@@ -6235,7 +8041,7 @@
           <w:i w:val="0"/>
           <w:sz w:val="20"/>
         </w:rPr>
-        <w:t>[96] Kirmani A, Venkatraman D, Shin D, Colaco A, Wong FNC, Shapiro JH, Goyal VK. First-photon imaging. Science. 2014;343(6166):58-61. doi:10.1126/science.1246775</w:t>
+        <w:t>[96] Sandstrom E, Li Y, Van Gool L, Oswald MR. Point-SLAM: Dense neural point cloud-based SLAM. In: Proceedings of the IEEE/CVF International Conference on Computer Vision (ICCV); 2023. p. 18433-18444.</w:t>
       </w:r>
     </w:p>
     <w:p>
@@ -6250,7 +8056,622 @@
           <w:i w:val="0"/>
           <w:sz w:val="20"/>
         </w:rPr>
-        <w:t>[97] O'Toole M, Lindell DB, Wetzstein G. Confocal non-line-of-sight imaging based on the light-cone transform. Nature. 2018;555:338-341. doi:10.1038/nature25489</w:t>
+        <w:t>[97] Shan T, Englot B. LeGO-LOAM: Lightweight and ground-optimized lidar odometry and mapping on variable terrain. In: IEEE/RSJ International Conference on Intelligent Robots and Systems (IROS); 2018. p. 4758-4765. doi:10.1109/IROS.2018.8594299</w:t>
+      </w:r>
+    </w:p>
+    <w:p>
+      <w:pPr>
+        <w:spacing w:after="120" w:line="276" w:lineRule="auto"/>
+        <w:ind w:left="504" w:hanging="504"/>
+      </w:pPr>
+      <w:r>
+        <w:rPr>
+          <w:rFonts w:ascii="Times New Roman" w:hAnsi="Times New Roman" w:eastAsia="Times New Roman"/>
+          <w:b w:val="0"/>
+          <w:i w:val="0"/>
+          <w:sz w:val="20"/>
+        </w:rPr>
+        <w:t>[98] Zhang J, Singh S. Visual-lidar odometry and mapping: Low-drift, robust, and fast. In: IEEE International Conference on Robotics and Automation (ICRA); 2015. p. 2174-2181. doi:10.1109/ICRA.2015.7139486</w:t>
+      </w:r>
+    </w:p>
+    <w:p>
+      <w:pPr>
+        <w:spacing w:after="120" w:line="276" w:lineRule="auto"/>
+        <w:ind w:left="504" w:hanging="504"/>
+      </w:pPr>
+      <w:r>
+        <w:rPr>
+          <w:rFonts w:ascii="Times New Roman" w:hAnsi="Times New Roman" w:eastAsia="Times New Roman"/>
+          <w:b w:val="0"/>
+          <w:i w:val="0"/>
+          <w:sz w:val="20"/>
+        </w:rPr>
+        <w:t>[99] Rusu RB, Cousins S. 3D is here: Point Cloud Library (PCL). In: IEEE International Conference on Robotics and Automation (ICRA); 2011. p. 1-4. doi:10.1109/ICRA.2011.5980567</w:t>
+      </w:r>
+    </w:p>
+    <w:p>
+      <w:pPr>
+        <w:spacing w:after="120" w:line="276" w:lineRule="auto"/>
+        <w:ind w:left="504" w:hanging="504"/>
+      </w:pPr>
+      <w:r>
+        <w:rPr>
+          <w:rFonts w:ascii="Times New Roman" w:hAnsi="Times New Roman" w:eastAsia="Times New Roman"/>
+          <w:b w:val="0"/>
+          <w:i w:val="0"/>
+          <w:sz w:val="20"/>
+        </w:rPr>
+        <w:t>[100] Besl PJ, McKay ND. A method for registration of 3-D shapes. IEEE Transactions on Pattern Analysis and Machine Intelligence. 1992;14(2):239-256. doi:10.1109/34.121791</w:t>
+      </w:r>
+    </w:p>
+    <w:p>
+      <w:pPr>
+        <w:spacing w:after="120" w:line="276" w:lineRule="auto"/>
+        <w:ind w:left="504" w:hanging="504"/>
+      </w:pPr>
+      <w:r>
+        <w:rPr>
+          <w:rFonts w:ascii="Times New Roman" w:hAnsi="Times New Roman" w:eastAsia="Times New Roman"/>
+          <w:b w:val="0"/>
+          <w:i w:val="0"/>
+          <w:sz w:val="20"/>
+        </w:rPr>
+        <w:t>[101] Hornung A, Wurm KM, Bennewitz M, Stachniss C, Burgard W. OctoMap: An efficient probabilistic 3D mapping framework based on octrees. Autonomous Robots. 2013;34:189-206. doi:10.1007/s10514-012-9321-0</w:t>
+      </w:r>
+    </w:p>
+    <w:p>
+      <w:pPr>
+        <w:spacing w:after="120" w:line="276" w:lineRule="auto"/>
+        <w:ind w:left="504" w:hanging="504"/>
+      </w:pPr>
+      <w:r>
+        <w:rPr>
+          <w:rFonts w:ascii="Times New Roman" w:hAnsi="Times New Roman" w:eastAsia="Times New Roman"/>
+          <w:b w:val="0"/>
+          <w:i w:val="0"/>
+          <w:sz w:val="20"/>
+        </w:rPr>
+        <w:t>[102] Oleynikova H, Taylor Z, Fehr M, Siegwart R, Nieto J. Voxblox: Incremental 3D Euclidean signed distance fields for on-board MAV planning. In: IEEE/RSJ International Conference on Intelligent Robots and Systems (IROS); 2017. p. 1366-1373. doi:10.1109/IROS.2017.8202315</w:t>
+      </w:r>
+    </w:p>
+    <w:p>
+      <w:pPr>
+        <w:spacing w:after="120" w:line="276" w:lineRule="auto"/>
+        <w:ind w:left="504" w:hanging="504"/>
+      </w:pPr>
+      <w:r>
+        <w:rPr>
+          <w:rFonts w:ascii="Times New Roman" w:hAnsi="Times New Roman" w:eastAsia="Times New Roman"/>
+          <w:b w:val="0"/>
+          <w:i w:val="0"/>
+          <w:sz w:val="20"/>
+        </w:rPr>
+        <w:t>[103] Qi CR, Su H, Mo K, Guibas LJ. PointNet: Deep learning on point sets for 3D classification and segmentation. In: Proceedings of the IEEE Conference on Computer Vision and Pattern Recognition (CVPR); 2017. p. 652-660. doi:10.1109/CVPR.2017.16</w:t>
+      </w:r>
+    </w:p>
+    <w:p>
+      <w:pPr>
+        <w:spacing w:after="120" w:line="276" w:lineRule="auto"/>
+        <w:ind w:left="504" w:hanging="504"/>
+      </w:pPr>
+      <w:r>
+        <w:rPr>
+          <w:rFonts w:ascii="Times New Roman" w:hAnsi="Times New Roman" w:eastAsia="Times New Roman"/>
+          <w:b w:val="0"/>
+          <w:i w:val="0"/>
+          <w:sz w:val="20"/>
+        </w:rPr>
+        <w:t>[104] Qi CR, Yi L, Su H, Guibas LJ. PointNet++: Deep hierarchical feature learning on point sets in a metric space. In: Advances in Neural Information Processing Systems 30; 2017.</w:t>
+      </w:r>
+    </w:p>
+    <w:p>
+      <w:pPr>
+        <w:spacing w:after="120" w:line="276" w:lineRule="auto"/>
+        <w:ind w:left="504" w:hanging="504"/>
+      </w:pPr>
+      <w:r>
+        <w:rPr>
+          <w:rFonts w:ascii="Times New Roman" w:hAnsi="Times New Roman" w:eastAsia="Times New Roman"/>
+          <w:b w:val="0"/>
+          <w:i w:val="0"/>
+          <w:sz w:val="20"/>
+        </w:rPr>
+        <w:t>[105] Hodan T, Michel F, Brachmann E, Kehl W, Glent Buch A, Kraft D, Drost B, Vidal J, Ihrke S, Zabulis X, Sahin C, Manhardt F, Tombari F, Kim TK, Matas J, Rother C. BOP: Benchmark for 6D object pose estimation. In: Computer Vision - ECCV 2018. Springer; 2018. p. 19-34. doi:10.1007/978-3-030-01249-6_2</w:t>
+      </w:r>
+    </w:p>
+    <w:p>
+      <w:pPr>
+        <w:spacing w:after="120" w:line="276" w:lineRule="auto"/>
+        <w:ind w:left="504" w:hanging="504"/>
+      </w:pPr>
+      <w:r>
+        <w:rPr>
+          <w:rFonts w:ascii="Times New Roman" w:hAnsi="Times New Roman" w:eastAsia="Times New Roman"/>
+          <w:b w:val="0"/>
+          <w:i w:val="0"/>
+          <w:sz w:val="20"/>
+        </w:rPr>
+        <w:t>[106] Xiang Y, Schmidt T, Narayanan V, Fox D. PoseCNN: A convolutional neural network for 6D object pose estimation in cluttered scenes. In: Robotics: Science and Systems; 2018. doi:10.15607/RSS.2018.XIV.019</w:t>
+      </w:r>
+    </w:p>
+    <w:p>
+      <w:pPr>
+        <w:spacing w:after="120" w:line="276" w:lineRule="auto"/>
+        <w:ind w:left="504" w:hanging="504"/>
+      </w:pPr>
+      <w:r>
+        <w:rPr>
+          <w:rFonts w:ascii="Times New Roman" w:hAnsi="Times New Roman" w:eastAsia="Times New Roman"/>
+          <w:b w:val="0"/>
+          <w:i w:val="0"/>
+          <w:sz w:val="20"/>
+        </w:rPr>
+        <w:t>[107] Placed JA, Strader J, Carrillo H, Atanasov N, Indelman V, Carlone L, Castellanos JA. A survey on active simultaneous localization and mapping: State of the art and new frontiers. IEEE Transactions on Robotics. 2023;39(3):1686-1705. doi:10.1109/TRO.2023.3248510</w:t>
+      </w:r>
+    </w:p>
+    <w:p>
+      <w:pPr>
+        <w:spacing w:after="120" w:line="276" w:lineRule="auto"/>
+        <w:ind w:left="504" w:hanging="504"/>
+      </w:pPr>
+      <w:r>
+        <w:rPr>
+          <w:rFonts w:ascii="Times New Roman" w:hAnsi="Times New Roman" w:eastAsia="Times New Roman"/>
+          <w:b w:val="0"/>
+          <w:i w:val="0"/>
+          <w:sz w:val="20"/>
+        </w:rPr>
+        <w:t>[108] Zhang Z. A flexible new technique for camera calibration. IEEE Transactions on Pattern Analysis and Machine Intelligence. 2000;22(11):1330-1334. doi:10.1109/34.888718</w:t>
+      </w:r>
+    </w:p>
+    <w:p>
+      <w:pPr>
+        <w:spacing w:after="120" w:line="276" w:lineRule="auto"/>
+        <w:ind w:left="504" w:hanging="504"/>
+      </w:pPr>
+      <w:r>
+        <w:rPr>
+          <w:rFonts w:ascii="Times New Roman" w:hAnsi="Times New Roman" w:eastAsia="Times New Roman"/>
+          <w:b w:val="0"/>
+          <w:i w:val="0"/>
+          <w:sz w:val="20"/>
+        </w:rPr>
+        <w:t>[109] Mahler J, Liang J, Niyaz S, Laskey M, Doan R, Liu X, Ojea JA, Goldberg K. Dex-Net 2.0: Deep learning to plan robust grasps with synthetic point clouds and analytic grasp metrics. In: Robotics: Science and Systems; 2017. doi:10.15607/RSS.2017.XIII.058</w:t>
+      </w:r>
+    </w:p>
+    <w:p>
+      <w:pPr>
+        <w:spacing w:after="120" w:line="276" w:lineRule="auto"/>
+        <w:ind w:left="504" w:hanging="504"/>
+      </w:pPr>
+      <w:r>
+        <w:rPr>
+          <w:rFonts w:ascii="Times New Roman" w:hAnsi="Times New Roman" w:eastAsia="Times New Roman"/>
+          <w:b w:val="0"/>
+          <w:i w:val="0"/>
+          <w:sz w:val="20"/>
+        </w:rPr>
+        <w:t>[110] Zeng A, Yu KT, Song S, Suo D, Walker E, Rodriguez A, Xiao J. Multi-view self-supervised deep learning for 6D pose estimation in the Amazon Picking Challenge. In: IEEE International Conference on Robotics and Automation (ICRA); 2017. p. 1386-1393. doi:10.1109/ICRA.2017.7989165</w:t>
+      </w:r>
+    </w:p>
+    <w:p>
+      <w:pPr>
+        <w:spacing w:after="120" w:line="276" w:lineRule="auto"/>
+        <w:ind w:left="504" w:hanging="504"/>
+      </w:pPr>
+      <w:r>
+        <w:rPr>
+          <w:rFonts w:ascii="Times New Roman" w:hAnsi="Times New Roman" w:eastAsia="Times New Roman"/>
+          <w:b w:val="0"/>
+          <w:i w:val="0"/>
+          <w:sz w:val="20"/>
+        </w:rPr>
+        <w:t>[111] Morrison D, Corke P, Leitner J. Closing the loop for robotic grasping: A real-time, generative grasp synthesis approach. In: Robotics: Science and Systems; 2018. doi:10.15607/RSS.2018.XIV.021</w:t>
+      </w:r>
+    </w:p>
+    <w:p>
+      <w:pPr>
+        <w:spacing w:after="120" w:line="276" w:lineRule="auto"/>
+        <w:ind w:left="504" w:hanging="504"/>
+      </w:pPr>
+      <w:r>
+        <w:rPr>
+          <w:rFonts w:ascii="Times New Roman" w:hAnsi="Times New Roman" w:eastAsia="Times New Roman"/>
+          <w:b w:val="0"/>
+          <w:i w:val="0"/>
+          <w:sz w:val="20"/>
+        </w:rPr>
+        <w:t>[112] Fang HS, Wang C, Gou M, Lu C. GraspNet-1Billion: A large-scale benchmark for general object grasping. In: Proceedings of the IEEE/CVF Conference on Computer Vision and Pattern Recognition (CVPR); 2020. p. 11444-11453.</w:t>
+      </w:r>
+    </w:p>
+    <w:p>
+      <w:pPr>
+        <w:spacing w:after="120" w:line="276" w:lineRule="auto"/>
+        <w:ind w:left="504" w:hanging="504"/>
+      </w:pPr>
+      <w:r>
+        <w:rPr>
+          <w:rFonts w:ascii="Times New Roman" w:hAnsi="Times New Roman" w:eastAsia="Times New Roman"/>
+          <w:b w:val="0"/>
+          <w:i w:val="0"/>
+          <w:sz w:val="20"/>
+        </w:rPr>
+        <w:t>[113] Wang C, Xu D, Zhu Y, Martin-Martin R, Lu C, Fei-Fei L, Savarese S. DenseFusion: 6D object pose estimation by iterative dense fusion. In: Proceedings of the IEEE/CVF Conference on Computer Vision and Pattern Recognition (CVPR); 2019. p. 3343-3352.</w:t>
+      </w:r>
+    </w:p>
+    <w:p>
+      <w:pPr>
+        <w:spacing w:after="120" w:line="276" w:lineRule="auto"/>
+        <w:ind w:left="504" w:hanging="504"/>
+      </w:pPr>
+      <w:r>
+        <w:rPr>
+          <w:rFonts w:ascii="Times New Roman" w:hAnsi="Times New Roman" w:eastAsia="Times New Roman"/>
+          <w:b w:val="0"/>
+          <w:i w:val="0"/>
+          <w:sz w:val="20"/>
+        </w:rPr>
+        <w:t>[114] Muller H, Niculescu V, Polonelli T, Magno M, Benini L. Robust and efficient depth-based obstacle avoidance for autonomous miniaturized UAVs. IEEE Transactions on Robotics. 2023;39(6):4935-4951. doi:10.1109/TRO.2023.3325812</w:t>
+      </w:r>
+    </w:p>
+    <w:p>
+      <w:pPr>
+        <w:spacing w:after="120" w:line="276" w:lineRule="auto"/>
+        <w:ind w:left="504" w:hanging="504"/>
+      </w:pPr>
+      <w:r>
+        <w:rPr>
+          <w:rFonts w:ascii="Times New Roman" w:hAnsi="Times New Roman" w:eastAsia="Times New Roman"/>
+          <w:b w:val="0"/>
+          <w:i w:val="0"/>
+          <w:sz w:val="20"/>
+        </w:rPr>
+        <w:t>[115] Barry AJ, Florence PR, Tedrake R. High-speed autonomous obstacle avoidance with pushbroom stereo. Journal of Field Robotics. 2018;35(1):52-68. doi:10.1002/rob.21741</w:t>
+      </w:r>
+    </w:p>
+    <w:p>
+      <w:pPr>
+        <w:spacing w:after="120" w:line="276" w:lineRule="auto"/>
+        <w:ind w:left="504" w:hanging="504"/>
+      </w:pPr>
+      <w:r>
+        <w:rPr>
+          <w:rFonts w:ascii="Times New Roman" w:hAnsi="Times New Roman" w:eastAsia="Times New Roman"/>
+          <w:b w:val="0"/>
+          <w:i w:val="0"/>
+          <w:sz w:val="20"/>
+        </w:rPr>
+        <w:t>[116] Falanga D, Kleber K, Scaramuzza D. Dynamic obstacle avoidance for quadrotors with event cameras. Science Robotics. 2020;5(40):eaaz9712. doi:10.1126/scirobotics.aaz9712</w:t>
+      </w:r>
+    </w:p>
+    <w:p>
+      <w:pPr>
+        <w:spacing w:after="120" w:line="276" w:lineRule="auto"/>
+        <w:ind w:left="504" w:hanging="504"/>
+      </w:pPr>
+      <w:r>
+        <w:rPr>
+          <w:rFonts w:ascii="Times New Roman" w:hAnsi="Times New Roman" w:eastAsia="Times New Roman"/>
+          <w:b w:val="0"/>
+          <w:i w:val="0"/>
+          <w:sz w:val="20"/>
+        </w:rPr>
+        <w:t>[117] Zhou Y, Gallego G, Shen S. Event-based stereo visual odometry. IEEE Transactions on Robotics. 2021;37(5):1433-1450. doi:10.1109/TRO.2021.3062252</w:t>
+      </w:r>
+    </w:p>
+    <w:p>
+      <w:pPr>
+        <w:spacing w:after="120" w:line="276" w:lineRule="auto"/>
+        <w:ind w:left="504" w:hanging="504"/>
+      </w:pPr>
+      <w:r>
+        <w:rPr>
+          <w:rFonts w:ascii="Times New Roman" w:hAnsi="Times New Roman" w:eastAsia="Times New Roman"/>
+          <w:b w:val="0"/>
+          <w:i w:val="0"/>
+          <w:sz w:val="20"/>
+        </w:rPr>
+        <w:t>[118] He B, Wang Z, Zhou Y, Chen J, Singh CD, Li H, Gao Y, Shen S, Wang K, Cao Y, Xu C, Aloimonos Y, Gao F, Fermuller C. Microsaccade-inspired event camera for robotics. Science Robotics. 2024;9(90):eadj8124. doi:10.1126/scirobotics.adj8124</w:t>
+      </w:r>
+    </w:p>
+    <w:p>
+      <w:pPr>
+        <w:spacing w:after="120" w:line="276" w:lineRule="auto"/>
+        <w:ind w:left="504" w:hanging="504"/>
+      </w:pPr>
+      <w:r>
+        <w:rPr>
+          <w:rFonts w:ascii="Times New Roman" w:hAnsi="Times New Roman" w:eastAsia="Times New Roman"/>
+          <w:b w:val="0"/>
+          <w:i w:val="0"/>
+          <w:sz w:val="20"/>
+        </w:rPr>
+        <w:t>[119] Nex F, Remondino F. UAV for 3D mapping applications: a review. Applied Geomatics. 2014;6:1-15. doi:10.1007/s12518-013-0120-x</w:t>
+      </w:r>
+    </w:p>
+    <w:p>
+      <w:pPr>
+        <w:spacing w:after="120" w:line="276" w:lineRule="auto"/>
+        <w:ind w:left="504" w:hanging="504"/>
+      </w:pPr>
+      <w:r>
+        <w:rPr>
+          <w:rFonts w:ascii="Times New Roman" w:hAnsi="Times New Roman" w:eastAsia="Times New Roman"/>
+          <w:b w:val="0"/>
+          <w:i w:val="0"/>
+          <w:sz w:val="20"/>
+        </w:rPr>
+        <w:t>[120] Colomina I, Molina P. Unmanned aerial systems for photogrammetry and remote sensing: A review. ISPRS Journal of Photogrammetry and Remote Sensing. 2014;92:79-97. doi:10.1016/j.isprsjprs.2014.02.013</w:t>
+      </w:r>
+    </w:p>
+    <w:p>
+      <w:pPr>
+        <w:spacing w:after="120" w:line="276" w:lineRule="auto"/>
+        <w:ind w:left="504" w:hanging="504"/>
+      </w:pPr>
+      <w:r>
+        <w:rPr>
+          <w:rFonts w:ascii="Times New Roman" w:hAnsi="Times New Roman" w:eastAsia="Times New Roman"/>
+          <w:b w:val="0"/>
+          <w:i w:val="0"/>
+          <w:sz w:val="20"/>
+        </w:rPr>
+        <w:t>[121] Seo J, Duque L, Wacker J. Drone-enabled bridge inspection methodology and application. Automation in Construction. 2018;94:112-126. doi:10.1016/j.autcon.2018.06.006</w:t>
+      </w:r>
+    </w:p>
+    <w:p>
+      <w:pPr>
+        <w:spacing w:after="120" w:line="276" w:lineRule="auto"/>
+        <w:ind w:left="504" w:hanging="504"/>
+      </w:pPr>
+      <w:r>
+        <w:rPr>
+          <w:rFonts w:ascii="Times New Roman" w:hAnsi="Times New Roman" w:eastAsia="Times New Roman"/>
+          <w:b w:val="0"/>
+          <w:i w:val="0"/>
+          <w:sz w:val="20"/>
+        </w:rPr>
+        <w:t>[122] Dorafshan S, Thomas RJ, Maguire M. Fatigue crack detection using unmanned aerial systems in fracture critical inspection of steel bridges. Journal of Bridge Engineering. 2018;23(10):04018078. doi:10.1061/(ASCE)BE.1943-5592.0001291</w:t>
+      </w:r>
+    </w:p>
+    <w:p>
+      <w:pPr>
+        <w:spacing w:after="120" w:line="276" w:lineRule="auto"/>
+        <w:ind w:left="504" w:hanging="504"/>
+      </w:pPr>
+      <w:r>
+        <w:rPr>
+          <w:rFonts w:ascii="Times New Roman" w:hAnsi="Times New Roman" w:eastAsia="Times New Roman"/>
+          <w:b w:val="0"/>
+          <w:i w:val="0"/>
+          <w:sz w:val="20"/>
+        </w:rPr>
+        <w:t>[123] Bircher A, Kamel M, Alexis K, Oleynikova H, Siegwart R. Receding horizon path planning for 3D exploration and surface inspection. Autonomous Robots. 2018;42:291-306. doi:10.1007/s10514-016-9610-2</w:t>
+      </w:r>
+    </w:p>
+    <w:p>
+      <w:pPr>
+        <w:spacing w:after="120" w:line="276" w:lineRule="auto"/>
+        <w:ind w:left="504" w:hanging="504"/>
+      </w:pPr>
+      <w:r>
+        <w:rPr>
+          <w:rFonts w:ascii="Times New Roman" w:hAnsi="Times New Roman" w:eastAsia="Times New Roman"/>
+          <w:b w:val="0"/>
+          <w:i w:val="0"/>
+          <w:sz w:val="20"/>
+        </w:rPr>
+        <w:t>[124] Ajoudani A, Zanchettin AM, Ivaldi S, Albu-Schaffer A, Kosuge K, Khatib O. Progress and prospects of the human-robot collaboration. Autonomous Robots. 2018;42:957-975. doi:10.1007/s10514-017-9677-2</w:t>
+      </w:r>
+    </w:p>
+    <w:p>
+      <w:pPr>
+        <w:spacing w:after="120" w:line="276" w:lineRule="auto"/>
+        <w:ind w:left="504" w:hanging="504"/>
+      </w:pPr>
+      <w:r>
+        <w:rPr>
+          <w:rFonts w:ascii="Times New Roman" w:hAnsi="Times New Roman" w:eastAsia="Times New Roman"/>
+          <w:b w:val="0"/>
+          <w:i w:val="0"/>
+          <w:sz w:val="20"/>
+        </w:rPr>
+        <w:t>[125] Haddadin S, De Luca A, Albu-Schaffer A. Robot collisions: A survey on detection, isolation, and identification. IEEE Transactions on Robotics. 2017;33(6):1292-1312. doi:10.1109/TRO.2017.2725543</w:t>
+      </w:r>
+    </w:p>
+    <w:p>
+      <w:pPr>
+        <w:spacing w:after="120" w:line="276" w:lineRule="auto"/>
+        <w:ind w:left="504" w:hanging="504"/>
+      </w:pPr>
+      <w:r>
+        <w:rPr>
+          <w:rFonts w:ascii="Times New Roman" w:hAnsi="Times New Roman" w:eastAsia="Times New Roman"/>
+          <w:b w:val="0"/>
+          <w:i w:val="0"/>
+          <w:sz w:val="20"/>
+        </w:rPr>
+        <w:t>[126] Lasota PA, Fong T, Shah JA. A survey of methods for safe human-robot interaction. Foundations and Trends in Robotics. 2017;5(4):261-349. doi:10.1561/2300000052</w:t>
+      </w:r>
+    </w:p>
+    <w:p>
+      <w:pPr>
+        <w:spacing w:after="120" w:line="276" w:lineRule="auto"/>
+        <w:ind w:left="504" w:hanging="504"/>
+      </w:pPr>
+      <w:r>
+        <w:rPr>
+          <w:rFonts w:ascii="Times New Roman" w:hAnsi="Times New Roman" w:eastAsia="Times New Roman"/>
+          <w:b w:val="0"/>
+          <w:i w:val="0"/>
+          <w:sz w:val="20"/>
+        </w:rPr>
+        <w:t>[127] Robla-Gomez S, Becerra VM, Llata JR, Gonzalez-Sarabia E, Torre-Ferrero C, Perez-Oria J. Working together: A review on safe human-robot collaboration in industrial environments. IEEE Access. 2017;5:26754-26773. doi:10.1109/ACCESS.2017.2773127</w:t>
+      </w:r>
+    </w:p>
+    <w:p>
+      <w:pPr>
+        <w:spacing w:after="120" w:line="276" w:lineRule="auto"/>
+        <w:ind w:left="504" w:hanging="504"/>
+      </w:pPr>
+      <w:r>
+        <w:rPr>
+          <w:rFonts w:ascii="Times New Roman" w:hAnsi="Times New Roman" w:eastAsia="Times New Roman"/>
+          <w:b w:val="0"/>
+          <w:i w:val="0"/>
+          <w:sz w:val="20"/>
+        </w:rPr>
+        <w:t>[128] Lichtsteiner P, Posch C, Delbruck T. A 128 x 128 120 dB 15 us latency asynchronous temporal contrast vision sensor. IEEE Journal of Solid-State Circuits. 2008;43(2):566-576. doi:10.1109/JSSC.2007.914337</w:t>
+      </w:r>
+    </w:p>
+    <w:p>
+      <w:pPr>
+        <w:spacing w:after="120" w:line="276" w:lineRule="auto"/>
+        <w:ind w:left="504" w:hanging="504"/>
+      </w:pPr>
+      <w:r>
+        <w:rPr>
+          <w:rFonts w:ascii="Times New Roman" w:hAnsi="Times New Roman" w:eastAsia="Times New Roman"/>
+          <w:b w:val="0"/>
+          <w:i w:val="0"/>
+          <w:sz w:val="20"/>
+        </w:rPr>
+        <w:t>[129] Roy K, Jaiswal A, Panda P. Towards spike-based machine intelligence with neuromorphic computing. Nature. 2019;575:607-617. doi:10.1038/s41586-019-1677-2</w:t>
+      </w:r>
+    </w:p>
+    <w:p>
+      <w:pPr>
+        <w:spacing w:after="120" w:line="276" w:lineRule="auto"/>
+        <w:ind w:left="504" w:hanging="504"/>
+      </w:pPr>
+      <w:r>
+        <w:rPr>
+          <w:rFonts w:ascii="Times New Roman" w:hAnsi="Times New Roman" w:eastAsia="Times New Roman"/>
+          <w:b w:val="0"/>
+          <w:i w:val="0"/>
+          <w:sz w:val="20"/>
+        </w:rPr>
+        <w:t>[130] Davies M, Srinivasa N, Lin TH, Chinya G, Cao Y, Choday SH, Dimou G, Joshi P, Imam N, Jain S, Liao Y, Lin CK, Lines A, Liu R, Mathaikutty D, McCoy S, Paul A, Tse J, Venkataramanan G, Weng YH, Wild A, Yang Y, Wang H. Loihi: A neuromorphic manycore processor with on-chip learning. IEEE Micro. 2018;38(1):82-99. doi:10.1109/MM.2018.112130359</w:t>
+      </w:r>
+    </w:p>
+    <w:p>
+      <w:pPr>
+        <w:spacing w:after="120" w:line="276" w:lineRule="auto"/>
+        <w:ind w:left="504" w:hanging="504"/>
+      </w:pPr>
+      <w:r>
+        <w:rPr>
+          <w:rFonts w:ascii="Times New Roman" w:hAnsi="Times New Roman" w:eastAsia="Times New Roman"/>
+          <w:b w:val="0"/>
+          <w:i w:val="0"/>
+          <w:sz w:val="20"/>
+        </w:rPr>
+        <w:t>[131] Brandli C, Berner R, Yang M, Liu SC, Delbruck T. A 240 x 180 130 dB 3 us latency global shutter spatiotemporal vision sensor. IEEE Journal of Solid-State Circuits. 2014;49(10):2333-2341. doi:10.1109/JSSC.2014.2342715</w:t>
+      </w:r>
+    </w:p>
+    <w:p>
+      <w:pPr>
+        <w:spacing w:after="120" w:line="276" w:lineRule="auto"/>
+        <w:ind w:left="504" w:hanging="504"/>
+      </w:pPr>
+      <w:r>
+        <w:rPr>
+          <w:rFonts w:ascii="Times New Roman" w:hAnsi="Times New Roman" w:eastAsia="Times New Roman"/>
+          <w:b w:val="0"/>
+          <w:i w:val="0"/>
+          <w:sz w:val="20"/>
+        </w:rPr>
+        <w:t>[132] Rebecq H, Horstschaefer T, Gallego G, Scaramuzza D. EVO: A geometric approach to event-based 6-DOF parallel tracking and mapping in real time. IEEE Robotics and Automation Letters. 2017;2(2):593-600. doi:10.1109/LRA.2016.2645143</w:t>
+      </w:r>
+    </w:p>
+    <w:p>
+      <w:pPr>
+        <w:spacing w:after="120" w:line="276" w:lineRule="auto"/>
+        <w:ind w:left="504" w:hanging="504"/>
+      </w:pPr>
+      <w:r>
+        <w:rPr>
+          <w:rFonts w:ascii="Times New Roman" w:hAnsi="Times New Roman" w:eastAsia="Times New Roman"/>
+          <w:b w:val="0"/>
+          <w:i w:val="0"/>
+          <w:sz w:val="20"/>
+        </w:rPr>
+        <w:t>[133] Guo S, Gallego G. CMax-SLAM: Event-based rotational-motion bundle adjustment and SLAM system using contrast maximization. IEEE Transactions on Robotics. 2024;40:2442-2461. doi:10.1109/TRO.2024.3378443</w:t>
+      </w:r>
+    </w:p>
+    <w:p>
+      <w:pPr>
+        <w:spacing w:after="120" w:line="276" w:lineRule="auto"/>
+        <w:ind w:left="504" w:hanging="504"/>
+      </w:pPr>
+      <w:r>
+        <w:rPr>
+          <w:rFonts w:ascii="Times New Roman" w:hAnsi="Times New Roman" w:eastAsia="Times New Roman"/>
+          <w:b w:val="0"/>
+          <w:i w:val="0"/>
+          <w:sz w:val="20"/>
+        </w:rPr>
+        <w:t>[134] Gehrig D, Scaramuzza D. Low-latency automotive vision with event cameras. Nature. 2024;629:1034-1040.</w:t>
+      </w:r>
+    </w:p>
+    <w:p>
+      <w:pPr>
+        <w:spacing w:after="120" w:line="276" w:lineRule="auto"/>
+        <w:ind w:left="504" w:hanging="504"/>
+      </w:pPr>
+      <w:r>
+        <w:rPr>
+          <w:rFonts w:ascii="Times New Roman" w:hAnsi="Times New Roman" w:eastAsia="Times New Roman"/>
+          <w:b w:val="0"/>
+          <w:i w:val="0"/>
+          <w:sz w:val="20"/>
+        </w:rPr>
+        <w:t>[135] Caesar H, Bankiti V, Lang AH, Vora S, Liong VE, Xu Q, Krishnan A, Pan Y, Baldan G, Beijbom O. nuScenes: A multimodal dataset for autonomous driving. In: Proceedings of the IEEE/CVF Conference on Computer Vision and Pattern Recognition (CVPR); 2020. p. 11621-11631. doi:10.1109/CVPR42600.2020.01164</w:t>
+      </w:r>
+    </w:p>
+    <w:p>
+      <w:pPr>
+        <w:spacing w:after="120" w:line="276" w:lineRule="auto"/>
+        <w:ind w:left="504" w:hanging="504"/>
+      </w:pPr>
+      <w:r>
+        <w:rPr>
+          <w:rFonts w:ascii="Times New Roman" w:hAnsi="Times New Roman" w:eastAsia="Times New Roman"/>
+          <w:b w:val="0"/>
+          <w:i w:val="0"/>
+          <w:sz w:val="20"/>
+        </w:rPr>
+        <w:t>[136] Khorasaninejad M, Capasso F. Metalenses: Versatile multifunctional photonic components. Science. 2017;358(6367):eaam8100. doi:10.1126/science.aam8100</w:t>
+      </w:r>
+    </w:p>
+    <w:p>
+      <w:pPr>
+        <w:spacing w:after="120" w:line="276" w:lineRule="auto"/>
+        <w:ind w:left="504" w:hanging="504"/>
+      </w:pPr>
+      <w:r>
+        <w:rPr>
+          <w:rFonts w:ascii="Times New Roman" w:hAnsi="Times New Roman" w:eastAsia="Times New Roman"/>
+          <w:b w:val="0"/>
+          <w:i w:val="0"/>
+          <w:sz w:val="20"/>
+        </w:rPr>
+        <w:t>[137] Kirmani A, Venkatraman D, Shin D, Colaco A, Wong FNC, Shapiro JH, Goyal VK. First-photon imaging. Science. 2014;343(6166):58-61. doi:10.1126/science.1246775</w:t>
+      </w:r>
+    </w:p>
+    <w:p>
+      <w:pPr>
+        <w:spacing w:after="120" w:line="276" w:lineRule="auto"/>
+        <w:ind w:left="504" w:hanging="504"/>
+      </w:pPr>
+      <w:r>
+        <w:rPr>
+          <w:rFonts w:ascii="Times New Roman" w:hAnsi="Times New Roman" w:eastAsia="Times New Roman"/>
+          <w:b w:val="0"/>
+          <w:i w:val="0"/>
+          <w:sz w:val="20"/>
+        </w:rPr>
+        <w:t>[138] O'Toole M, Lindell DB, Wetzstein G. Confocal non-line-of-sight imaging based on the light-cone transform. Nature. 2018;555:338-341. doi:10.1038/nature25489</w:t>
       </w:r>
     </w:p>
     <w:sectPr>

</xml_diff>

<commit_message>
Expand the Sensors Q3 draft with benchmarks and more cited estimators
Add Table 8 on what public suites measure, cite LVI/ICP/UAV/HRI sources, and grow the body into the Sensors review word band.

Co-authored-by: Reze13omb <Reze13omb@users.noreply.github.com>
</commit_message>
<xml_diff>
--- a/manuscripts/depth_vision_sensors/Zhang_Cui_Depth_Vision_Sensors_Review_revised.docx
+++ b/manuscripts/depth_vision_sensors/Zhang_Cui_Depth_Vision_Sensors_Review_revised.docx
@@ -1161,7 +1161,7 @@
           <w:i w:val="0"/>
           <w:sz w:val="22"/>
         </w:rPr>
-        <w:t>This protocol is enough for a Sensors-style review to be reproducible in spirit. It is not enough to support a meta-analysis of depth RMSE across all consumer cameras, because experimental setups are not commensurate [4,24,35,36].</w:t>
+        <w:t>This protocol is enough for a Sensors-style review to be reproducible in spirit. It is not enough to support a meta-analysis of depth RMSE across all consumer cameras, because experimental setups are not commensurate [4,24,35,36]. Non-English records and manufacturer white papers were not treated as primary evidence. The search was last refreshed in March 2025; later product SKUs are therefore outside the evidence window.</w:t>
       </w:r>
     </w:p>
     <w:p>
@@ -1189,7 +1189,7 @@
           <w:i w:val="0"/>
           <w:sz w:val="22"/>
         </w:rPr>
-        <w:t>The paper makes five contributions aimed at mechatronic designers rather than at optics specialists. First, it compares structured light, active stereo, iToF, dToF, and solid-state LiDAR by principle, reported range and error, and role. Second, it compiles device-level numbers from peer-reviewed evaluations of Kinect-class, RealSense-class, and Azure Kinect cameras so that Table 3 can be opened during a design review [14,15,35,36,37]. Third, it links raw artifacts to the estimators that machines actually run, including LiDAR-inertial odometry for sparse long-range clouds [38,39,40]. Fourth, it organizes applications by the depth property that is spent. Fifth, it gives an explicit selection flowchart and a checklist that can be copied into a requirements document. Section 2 reviews hardware. Section 3 reviews enabling algorithms. Section 4 reviews applications and selection. Section 5 discusses open problems. Section 6 concludes.</w:t>
+        <w:t>The paper makes six contributions aimed at mechatronic designers rather than at optics specialists. First, it compares structured light, active stereo, iToF, dToF, and solid-state LiDAR by principle, reported range and error, and role. Second, it compiles device-level numbers from peer-reviewed evaluations of Kinect-class, RealSense-class, and Azure Kinect cameras so that Table 3 can be opened during a design review [14,15,35,36,37]. Third, it links raw artifacts to the estimators that machines actually run, including LiDAR-inertial and lidar-visual-inertial odometry for sparse long-range clouds [38,39,40,41]. Fourth, it organizes applications by the depth property that is spent. Fifth, it states what standard benchmarks measure and what they do not (Table 8). Sixth, it gives an explicit selection flowchart and a checklist that can be copied into a requirements document. Section 2 reviews hardware. Section 3 reviews enabling algorithms. Section 4 reviews applications and selection. Section 5 discusses open problems. Section 6 concludes.</w:t>
       </w:r>
     </w:p>
     <w:p>
@@ -1301,7 +1301,7 @@
           <w:i w:val="0"/>
           <w:sz w:val="22"/>
         </w:rPr>
-        <w:t>Structured-light sensors project a known pattern (dots, stripes, or time-varying fringes) and recover depth by triangulation between the projector and one or more cameras [5,6]. If f is the focal length, B the baseline, and d the observed disparity, the pinhole relation is Z = fB/d. Error in disparity therefore grows into a range error that increases approximately with Z squared [14]. Industrial systems usually prefer sequential Gray-code plus phase-shifting fringes because the absolute unwrapping is robust and the phase gives sub-pixel disparity [5,6]. Fourier-transform profilometry trades some robustness for a single-shot capture, which matters on moving parts. Industrial fringe-projection systems exploit this geometry at short range and can reach tens of micrometres to sub-millimetre accuracy on cooperative surfaces [5]. The price of that accuracy is a controlled standoff, a cooperative (or at least non-specular) surface, and a workspace that fits the calibrated volume.</w:t>
+        <w:t>Structured-light sensors project a known pattern (dots, stripes, or time-varying fringes) and recover depth by triangulation between the projector and one or more cameras [5,6,42]. If f is the focal length, B the baseline, and d the observed disparity, the pinhole relation is Z = fB/d. Error in disparity therefore grows into a range error that increases approximately with Z squared [14]. Pattern choice is itself a design variable: Salvi et al. classify time-multiplexed, neighbourhood, and direct-coding families, and show that no single code is optimal for both static metrology and a moving robot [42]. Industrial systems usually prefer sequential Gray-code plus phase-shifting fringes because the absolute unwrapping is robust and the phase gives sub-pixel disparity [5,6,43]. Absolute-phase reviews make the same point in more optical detail: the unwrapping step, not the projector brightness, is usually what fails first on discontinuities [43]. Fourier-transform profilometry trades some robustness for a single-shot capture, which matters on moving parts [44]. Industrial fringe-projection systems exploit this geometry at short range and can reach tens of micrometres to sub-millimetre accuracy on cooperative surfaces [5]. The price of that accuracy is a controlled standoff, a cooperative (or at least non-specular) surface, and a workspace that fits the calibrated volume.</w:t>
       </w:r>
     </w:p>
     <w:p>
@@ -1317,7 +1317,7 @@
           <w:i w:val="0"/>
           <w:sz w:val="22"/>
         </w:rPr>
-        <w:t>Consumer devices traded metrology-grade projectors for a static pseudo-random speckle and on-chip matching. Kinect v1 is the canonical example: a near-infrared (NIR) projector, an infrared camera, and a colour camera. Khoshelham and Elberink showed that its random depth error grows from a few millimetres near the sensor to about 4 cm near 5 m, while axial point spacing can reach about 7 cm at that range [14]. Early geometric studies of the same device reached the same qualitative conclusion and supplied calibration recipes that robotics groups still reuse [41,42]. Those numbers explain both the success of KinectFusion-style indoor reconstruction [17,18] and the unsuitability of the same sensor as an outdoor navigation camera.</w:t>
+        <w:t>Consumer devices traded metrology-grade projectors for a static pseudo-random speckle and on-chip matching. Kinect v1 is the canonical example: a near-infrared (NIR) projector, an infrared camera, and a colour camera. Khoshelham and Elberink showed that its random depth error grows from a few millimetres near the sensor to about 4 cm near 5 m, while axial point spacing can reach about 7 cm at that range [14]. Early geometric studies of the same device reached the same qualitative conclusion and supplied calibration recipes that robotics groups still reuse [45,46]. Those numbers explain both the success of KinectFusion-style indoor reconstruction [17,18] and the unsuitability of the same sensor as an outdoor navigation camera.</w:t>
       </w:r>
     </w:p>
     <w:p>
@@ -1361,7 +1361,7 @@
           <w:i w:val="0"/>
           <w:sz w:val="22"/>
         </w:rPr>
-        <w:t>A ToF pixel estimates range from the travel time of light. Indirect ToF (iToF; lock-in or continuous-wave) measures the phase shift of a modulated source [7,32,43]. For a modulation frequency f_m the unambiguous range is on the order of c/(2 f_m); a typical 30 MHz tone wraps near 5 m, which is why multi-frequency operation appears on industrial iToF cameras [7,8,32]. Direct ToF (dToF) timestamps a short pulse, often with single-photon avalanche diode (SPAD) arrays and time-to-digital converters [8,21,44]. iToF became practical in compact cameras because a single illuminator and a single sensor replace a precision stereo baseline [7,15]. Reported indoor working distances for consumer iToF, including Kinect v2, are typically 0.5-4.5 m [15,45,46]. Side-by-side studies of Kinect v1 and v2 show that the ToF unit reduced some structured-light artifacts (texture dependence, multi-device interference) while introducing others (multipath in corners, flying pixels, wiggling) [15,45,46,47]. Azure Kinect, the later Microsoft ToF camera, reduced random depth noise relative to Kinect v2 in near-FOV modes under about 3 m and improved spatial accuracy beyond about 2.5 m in laser-scanner comparisons, without removing sunlight or multipath as design limits [35,36]. Sunlight, multipath, and flying pixels remain first-order limitations [15,45,48].</w:t>
+        <w:t>A ToF pixel estimates range from the travel time of light. Indirect ToF (iToF; lock-in or continuous-wave) measures the phase shift of a modulated source [7,32,47]. For a modulation frequency f_m the unambiguous range is on the order of c/(2 f_m); a typical 30 MHz tone wraps near 5 m, which is why multi-frequency operation appears on industrial iToF cameras [7,8,32]. Direct ToF (dToF) timestamps a short pulse, often with single-photon avalanche diode (SPAD) arrays and time-to-digital converters [8,21,48]. iToF became practical in compact cameras because a single illuminator and a single sensor replace a precision stereo baseline [7,15]. Reported indoor working distances for consumer iToF, including Kinect v2, are typically 0.5-4.5 m [15,49,50]. Side-by-side studies of Kinect v1 and v2 show that the ToF unit reduced some structured-light artifacts (texture dependence, multi-device interference) while introducing others (multipath in corners, flying pixels, wiggling) [15,49,50,51]. Azure Kinect, the later Microsoft ToF camera, reduced random depth noise relative to Kinect v2 in near-FOV modes under about 3 m and improved spatial accuracy beyond about 2.5 m in laser-scanner comparisons, without removing sunlight or multipath as design limits [35,36]. Sunlight, multipath, and flying pixels remain first-order limitations [15,49,52].</w:t>
       </w:r>
     </w:p>
     <w:p>
@@ -1377,7 +1377,7 @@
           <w:i w:val="0"/>
           <w:sz w:val="22"/>
         </w:rPr>
-        <w:t>The same physics explains the mobile-ToF wave of the 2010s. A phase camera does not need a wide mechanical baseline, so it fits a phone or an embedded robot head. Early mobile iToF modules were lower in spatial resolution than structured light but more convenient at 2-5 m for augmented reality and coarse scene layout [8,21]. dToF SPAD arrays later improved ambient-light rejection and power per unit of range, at the expense of histogram memory and, often, spatial resolution [21]. Gyongy, Dutton, and Henderson review the dToF signal chain and show why on-chip histogram compression, not only detector quantum efficiency, now limits array size [21].</w:t>
+        <w:t>The same physics explains the mobile-ToF wave of the 2010s. A phase camera does not need a wide mechanical baseline, so it fits a phone or an embedded robot head. Early mobile iToF modules were lower in spatial resolution than structured light but more convenient at 2-5 m for augmented reality and coarse scene layout [8,21]. dToF SPAD arrays later improved ambient-light rejection and power per unit of range, at the expense of histogram memory and, often, spatial resolution [21]. Gyongy, Dutton, and Henderson review the dToF signal chain and show why on-chip histogram compression, not only detector quantum efficiency, now limits array size [21]. For a mechatronic designer the takeaway is narrower than the semiconductor literature: if the workspace has corners, glass, or two ToF units that can see each other, budget a multipath and interference test before you freeze the SKU [4,15,52]. Coded ToF can recover a time profile rather than a single phase, but the extra illumination and compute rarely fit a battery-powered head [52].</w:t>
       </w:r>
     </w:p>
     <w:p>
@@ -1405,7 +1405,7 @@
           <w:i w:val="0"/>
           <w:sz w:val="22"/>
         </w:rPr>
-        <w:t>Once the task leaves the room (warehouse aisles, yards, roads, bridge girders) consumer RGB-D cameras run out of photons and out of unambiguous range. Mechanical spinning LiDAR already solved long-range ranging. Solid-state and semi-solid designs try to keep that range while removing a bulky rotator [9,10,29,30,49,50]. MEMS mirrors scan a laser with a small moving mass and are the most commercially mature semi-solid option. Flash LiDAR illuminates a patch at once and is closer to a ToF camera, with range and resolution set by peak power and pixel count. Optical phased arrays and metasurface beam steerers aim at a fully solid-state scanner [51,52,53,54,55,56]. Large-scale silicon photonic arrays and MEMS-on-photonics demonstrators show that chip-scale beam steering is no longer only a laboratory sketch [53,55]. Circuit- and architecture-level reviews stress that the scanner is only one block: laser, detector, timing, and eye-safety set the range as much as the steering method [49,50]. For mechatronic integration the practical facts are simpler: solid-state units are smaller and potentially more robust to vibration, but they are still sparse compared with RGB-D, still expensive at automotive grade, and still require careful time synchronization with cameras and IMUs [10,29,57]. Automotive surveys also stress eye-safety, rain/fog backscatter, and the need for a perception stack that does not treat a sparse cloud as if it were a Kinect frame [10,29].</w:t>
+        <w:t>Once the task leaves the room (warehouse aisles, yards, roads, bridge girders) consumer RGB-D cameras run out of photons and out of unambiguous range. Mechanical spinning LiDAR already solved long-range ranging. Solid-state and semi-solid designs try to keep that range while removing a bulky rotator [9,10,29,30,53,54]. MEMS mirrors scan a laser with a small moving mass and are the most commercially mature semi-solid option. Flash LiDAR illuminates a patch at once and is closer to a ToF camera, with range and resolution set by peak power and pixel count. Optical phased arrays and metasurface beam steerers aim at a fully solid-state scanner [55,56,57,58,59,60]. Large-scale silicon photonic arrays and MEMS-on-photonics demonstrators show that chip-scale beam steering is no longer only a laboratory sketch [57,59]. Circuit- and architecture-level reviews stress that the scanner is only one block: laser, detector, timing, and eye-safety set the range as much as the steering method [53,54]. For mechatronic integration the practical facts are simpler: solid-state units are smaller and potentially more robust to vibration, but they are still sparse compared with RGB-D, still expensive at automotive grade, and still require careful time synchronization with cameras and IMUs [10,29,61]. Automotive surveys also stress eye-safety, rain/fog backscatter, and the need for a perception stack that does not treat a sparse cloud as if it were a Kinect frame [10,29]. A robot or UAV buyer should therefore pick the scanner class by payload and field of view first: MEMS for a compact outdoor head, flash for a short-range patch with no moving parts, and OPA or metasurface units only when the programme can absorb a research-grade integration [9,30,60].</w:t>
       </w:r>
     </w:p>
     <w:p>
@@ -2142,7 +2142,7 @@
                 <w:i w:val="0"/>
                 <w:sz w:val="16"/>
               </w:rPr>
-              <w:t>[7,8,15,45]</w:t>
+              <w:t>[7,8,15,49]</w:t>
             </w:r>
           </w:p>
         </w:tc>
@@ -2280,7 +2280,7 @@
                 <w:i w:val="0"/>
                 <w:sz w:val="16"/>
               </w:rPr>
-              <w:t>[21,44]</w:t>
+              <w:t>[21,48]</w:t>
             </w:r>
           </w:p>
         </w:tc>
@@ -2438,7 +2438,7 @@
           <w:i w:val="0"/>
           <w:sz w:val="22"/>
         </w:rPr>
-        <w:t>A practical selection sequence used in many robot shops is: write down the minimum and maximum range, the worst lighting, the worst surface, the allowed mass and watts, and the safety integrity level. Only then open a catalogue (Figure 2). Indoor rooms with matte walls still suit RGB-D [4,14,20]. Fixed cells with metal parts still suit industrial structured light [5]. Yards and roads still suit LiDAR, usually fused with cameras [10,57,58]. If two of those worlds appear on one machine, budget two sensors and a calibration procedure, not a single "universal" depth camera.</w:t>
+        <w:t>A practical selection sequence used in many robot shops is: write down the minimum and maximum range, the worst lighting, the worst surface, the allowed mass and watts, and the safety integrity level. Only then open a catalogue (Figure 2). Indoor rooms with matte walls still suit RGB-D [4,14,20]. Fixed cells with metal parts still suit industrial structured light [5]. Yards and roads still suit LiDAR, usually fused with cameras [10,61,62]. If two of those worlds appear on one machine, budget two sensors and a calibration procedure, not a single "universal" depth camera.</w:t>
       </w:r>
     </w:p>
     <w:p>
@@ -2510,7 +2510,7 @@
           <w:i w:val="0"/>
           <w:sz w:val="22"/>
         </w:rPr>
-        <w:t>Three short examples make the same point. A bin-picking cell with a 1.2 m standoff and oily steel parts should start from industrial structured light, a 6-DoF pose estimator, and a compliant grasp, not from a 100 m LiDAR [5,59,60]. An indoor delivery base that must see a pallet toe and a person in a corridor should start from a wide RGB-D camera plus a two-dimensional safety LiDAR and a visual-inertial estimator [20,61,62]. A bridge-inspection UAV that must hold a 5-15 m standoff in wind should start from a lightweight solid-state ranger, an IMU, and a compact RGB inspector, and should not expect a phone-class ToF module to carry the ranging load [2,9,63].</w:t>
+        <w:t>Three short examples make the same point. A bin-picking cell with a 1.2 m standoff and oily steel parts should start from industrial structured light, a 6-DoF pose estimator, and a compliant grasp, not from a 100 m LiDAR [5,63,64]. An indoor delivery base that must see a pallet toe and a person in a corridor should start from a wide RGB-D camera plus a two-dimensional safety LiDAR and a visual-inertial estimator [20,65,66]. A bridge-inspection UAV that must hold a 5-15 m standoff in wind should start from a lightweight solid-state ranger, an IMU, and a compact RGB inspector, and should not expect a phone-class ToF module to carry the ranging load [2,9,67].</w:t>
       </w:r>
     </w:p>
     <w:p>
@@ -2538,7 +2538,7 @@
           <w:i w:val="0"/>
           <w:sz w:val="22"/>
         </w:rPr>
-        <w:t>Family envelopes are not enough when a buyer has to choose a SKU. Table 3 lists numbers that peer-reviewed evaluations actually measured, not marketing ranges. Kinect v1 remains the best-documented structured-light consumer camera [14,41]. Kinect v2 and Azure Kinect document the ToF path, including the fact that Azure Kinect is not uniformly better than v2 at every distance and FOV mode [15,35,36,47]. RealSense SR300 and D415 document the coded-light and active-stereo Intel line with metrological characterizations rather than blog tests [20,37,64]. Halmetschlager-Funek et al. remain the widest indoor multi-device comparison and should be read before any single-camera ranking is trusted [4].</w:t>
+        <w:t>Family envelopes are not enough when a buyer has to choose a SKU. Table 3 lists numbers that peer-reviewed evaluations actually measured, not marketing ranges. Kinect v1 remains the best-documented structured-light consumer camera [14,45]. Kinect v2 and Azure Kinect document the ToF path, including the fact that Azure Kinect is not uniformly better than v2 at every distance and FOV mode [15,35,36,51]. RealSense SR300 and D415 document the coded-light and active-stereo Intel line with metrological characterizations rather than blog tests [20,37,68]. Halmetschlager-Funek et al. remain the widest indoor multi-device comparison and should be read before any single-camera ranking is trusted [4].</w:t>
       </w:r>
     </w:p>
     <w:p>
@@ -2759,7 +2759,7 @@
                 <w:i w:val="0"/>
                 <w:sz w:val="16"/>
               </w:rPr>
-              <w:t>Kinect v2 [15,45,47]</w:t>
+              <w:t>Kinect v2 [15,49,51]</w:t>
             </w:r>
           </w:p>
         </w:tc>
@@ -2827,7 +2827,7 @@
                 <w:i w:val="0"/>
                 <w:sz w:val="16"/>
               </w:rPr>
-              <w:t>Indoor robot head; model the bias [61]</w:t>
+              <w:t>Indoor robot head; model the bias [65]</w:t>
             </w:r>
           </w:p>
         </w:tc>
@@ -2933,7 +2933,7 @@
                 <w:i w:val="0"/>
                 <w:sz w:val="16"/>
               </w:rPr>
-              <w:t>RealSense SR300 [64]</w:t>
+              <w:t>RealSense SR300 [68]</w:t>
             </w:r>
           </w:p>
         </w:tc>
@@ -3394,7 +3394,7 @@
           <w:i w:val="0"/>
           <w:sz w:val="22"/>
         </w:rPr>
-        <w:t>Consumer and automotive depth images share a small set of artifacts: impulse noise, invalid pixels (holes) on occlusions, black or specular surfaces, flying pixels on depth edges, and ToF multipath [4,7,15]. Classical spatial median filters and temporal averaging remain the first firmware line of defence. When a registered RGB image is available, joint bilateral or guided filtering uses colour edges to protect object boundaries while smoothing planar interiors [65]. These filters are cheap enough for embedded GPUs. They do not invent missing geometry.</w:t>
+        <w:t>Consumer and automotive depth images share a small set of artifacts: impulse noise, invalid pixels (holes) on occlusions, black or specular surfaces, flying pixels on depth edges, and ToF multipath [4,7,15]. Classical spatial median filters and temporal averaging remain the first firmware line of defence. When a registered RGB image is available, joint bilateral or guided filtering uses colour edges to protect object boundaries while smoothing planar interiors [69]. These filters are cheap enough for embedded GPUs. They do not invent missing geometry.</w:t>
       </w:r>
     </w:p>
     <w:p>
@@ -3410,7 +3410,7 @@
           <w:i w:val="0"/>
           <w:sz w:val="22"/>
         </w:rPr>
-        <w:t>Depth completion does. Early methods inpainted by diffusion or multi-view geometry. Learning-based completion trained on RGB-D or RGB-plus-sparse-LiDAR pairs now dominates the literature [12,13,66,67,68,69,70,71,72,73,74]. Eigen et al. showed that a multi-scale network can predict depth from a single RGB image [12]; later residual and self-supervised models reduced the need for dense ground truth [13,67,68]. Indoor work still leans on NYU-Depth v2-style labelled apartments [66]. Zhang and Funkhouser showed that even a single RGB-D frame with holes can be completed if surface normals and occlusion boundaries are used as intermediate cues [71]. Outdoor work leans on KITTI-style projected LiDAR, which is sparse and biased toward the road plane [69]. For that setting, Uhrig et al. introduced sparsity-invariant convolutions [69], and Ma and Karaman showed that even a few hundred metric samples plus RGB yield a dense metric map [70]. Spatial-propagation networks (CSPN, NLSPN) and DeepLiDAR-style normal guidance then became the standard way to spread those sparse metric seeds [72,73,74]. Later non-local and transformer architectures improve large holes by using long-range context, at a cost that still challenges small onboard computers [75]. A mechatronic reading of these papers is that completion is a good virtual sensor for visualization and mid-level planning, and a bad sole input to a safety-rated stop.</w:t>
+        <w:t>Depth completion does. Early methods inpainted by diffusion or multi-view geometry. Learning-based completion trained on RGB-D or RGB-plus-sparse-LiDAR pairs now dominates the literature [12,13,70,71,72,73,74,75,76,77,78]. Eigen et al. showed that a multi-scale network can predict depth from a single RGB image [12]; later residual and self-supervised models reduced the need for dense ground truth [13,71,72]. Indoor work still leans on NYU-Depth v2-style labelled apartments [70], and later on ScanNet- and Matterport-scale reconstructions when a method needs more than a few dozen rooms [79,80]. Zhang and Funkhouser showed that even a single RGB-D frame with holes can be completed if surface normals and occlusion boundaries are used as intermediate cues [75]. Outdoor work leans on KITTI-style projected LiDAR, which is sparse and biased toward the road plane [73,81,82]. For that setting, Uhrig et al. introduced sparsity-invariant convolutions [73], and Ma and Karaman showed that even a few hundred metric samples plus RGB yield a dense metric map [74]. Spatial-propagation networks (CSPN, NLSPN) and DeepLiDAR-style normal guidance then became the standard way to spread those sparse metric seeds [76,77,78]. Later non-local and transformer architectures improve large holes by using long-range context, at a cost that still challenges small onboard computers [83]. A mechatronic reading of these papers is that completion is a good virtual sensor for visualization and mid-level planning, and a bad sole input to a safety-rated stop. KITTI ranks are especially easy to over-read: a method that wins on projected road-plane LiDAR can still invent a thin pole or a glass door that a warehouse AMR must not hit [73,82].</w:t>
       </w:r>
     </w:p>
     <w:p>
@@ -3803,7 +3803,7 @@
                 <w:i w:val="0"/>
                 <w:sz w:val="16"/>
               </w:rPr>
-              <w:t>Maturing on high-end iToF; still hard on cheap single-frequency units [7,48]</w:t>
+              <w:t>Maturing on high-end iToF; still hard on cheap single-frequency units [7,52]</w:t>
             </w:r>
           </w:p>
         </w:tc>
@@ -3977,7 +3977,7 @@
           <w:i w:val="0"/>
           <w:sz w:val="22"/>
         </w:rPr>
-        <w:t>Loose coupling treats each sensor as a black-box pose or twist and fuses them in an extended or unscented Kalman filter. The implementation is modular and cheap; the estimate is statistically suboptimal and cannot correct inner calibration errors [31,76]. Lynen et al. showed that a modular multi-sensor filter is enough to fly a MAV if each sensor is treated as a delayed pose update [76]. Tight coupling, as in keyframe visual-inertial odometry (VIO), jointly optimizes visual residuals and IMU preintegration in a sliding window [77,78,79,80,81,82]. OpenVINS and related platforms made that estimator reproducible [81,82]. Adding metric depth yields visual-inertial-depth odometry: depth removes the monocular scale-gauge ambiguity and supplies geometric constraints in low-texture rooms where VIO would otherwise drift or fail [1,17,79].</w:t>
+        <w:t>Loose coupling treats each sensor as a black-box pose or twist and fuses them in an extended or unscented Kalman filter. The implementation is modular and cheap; the estimate is statistically suboptimal and cannot correct inner calibration errors [31,84]. Lynen et al. showed that a modular multi-sensor filter is enough to fly a MAV if each sensor is treated as a delayed pose update [84]. Tight coupling, as in keyframe visual-inertial odometry (VIO), jointly optimizes visual residuals and IMU preintegration in a sliding window [85,86,87,88,89,90]. The same idea has a longer visual-odometry lineage: MonoSLAM and PTAM showed that a single camera can track a sparse map in real time; SVO and DSO later made semi-direct and direct monocular odometry fast enough for small platforms [91,92,93,94]. OpenVINS and related platforms made the inertial version reproducible [89,90]. Adding metric depth yields visual-inertial-depth odometry: depth removes the monocular scale-gauge ambiguity and supplies geometric constraints in low-texture rooms where VIO would otherwise drift or fail [1,17,87].</w:t>
       </w:r>
     </w:p>
     <w:p>
@@ -3993,7 +3993,7 @@
           <w:i w:val="0"/>
           <w:sz w:val="22"/>
         </w:rPr>
-        <w:t>Dense RGB-D fusion, from KinectFusion through ElasticFusion and BundleFusion, maintains a truncated signed distance function (TSDF) or surfel map for close-range interaction [17,83,84]. The KinectFusion loop is still the mental model: track the live depth against the model, integrate the new frame into a volume, and raycast a synthetic depth for the next track [17,18]. ElasticFusion dropped the explicit pose graph in favour of dense deformation; BundleFusion restored global consistency with on-the-fly reintegration [83,84]. Those maps are excellent for a tabletop and expensive for a warehouse. Graph-based SLAM adds loop closures so that local odometry does not accumulate without bound [1,31]. RGB-D SLAM systems and the TUM RGB-D benchmark made this stack reproducible [19,85,86,87]. Kerl et al. showed that a dense photometric+depth residual already works on a CPU-era RGB-D camera if exposure is modelled [87]. Later systems (ORB-SLAM, ORB-SLAM2/3, Kimera) combine sparse or semi-dense tracking with optional metric-semantic mapping and multi-robot extensions [62,88,89,90,91]. ORB-SLAM3 in particular folded visual-inertial and multi-map operation into a library that many robot teams actually run [62]. Direct methods such as LSD-SLAM showed that dense photometric residuals can replace sparse features when exposure is well modelled [92]. Learned dense trackers such as DROID-SLAM, and neural implicit maps (iMAP, NICE-SLAM, Point-SLAM), raise map fidelity again, at a compute cost that still sits above most embedded robot computers [93,94,95,96].</w:t>
+        <w:t>Dense RGB-D fusion, from KinectFusion through ElasticFusion and BundleFusion, maintains a truncated signed distance function (TSDF) or surfel map for close-range interaction [17,95,96]. The volumetric idea is older than Kinect: Curless and Levoy already fused range images into a signed-distance volume [97]. The KinectFusion loop is still the mental model: track the live depth against the model, integrate the new frame into a volume, and raycast a synthetic depth for the next track [17,18]. DTAM showed that a similar dense track can be run from a single moving RGB camera if a photometric cost is optimized on a GPU [98]. ElasticFusion dropped the explicit pose graph in favour of dense deformation; BundleFusion restored global consistency with on-the-fly reintegration [95,96]. Those maps are excellent for a tabletop and expensive for a warehouse. Graph-based SLAM adds loop closures so that local odometry does not accumulate without bound [1,31]. RGB-D SLAM systems and the TUM RGB-D benchmark made this stack reproducible [19,99,100,101]. Kerl et al. showed that a dense photometric+depth residual already works on a CPU-era RGB-D camera if exposure is modelled [101]. Later systems (ORB-SLAM, ORB-SLAM2/3, Kimera) combine sparse or semi-dense tracking with optional metric-semantic mapping and multi-robot extensions [66,102,103,104,105]. ORB-SLAM3 in particular folded visual-inertial and multi-map operation into a library that many robot teams actually run [66]. Direct methods such as LSD-SLAM and DSO showed that photometric residuals can replace or complement sparse features when exposure is well modelled [94,106]. Learned dense trackers such as DROID-SLAM, and neural implicit maps (iMAP, NICE-SLAM, Point-SLAM), raise map fidelity again, at a compute cost that still sits above most embedded robot computers [107,108,109,110].</w:t>
       </w:r>
     </w:p>
     <w:p>
@@ -4009,7 +4009,7 @@
           <w:i w:val="0"/>
           <w:sz w:val="22"/>
         </w:rPr>
-        <w:t>Outdoors, the front-end is usually LiDAR, not RGB-D. LOAM and LeGO-LOAM established feature-based lidar odometry [38,97]. Tight lidar-inertial systems (LIO-SAM, FAST-LIO2) then made solid-state and spinning clouds usable on UAVs and handheld platforms without a separate visual pipeline [39,40]. FAST-LIO2 in particular registers raw points into an incremental k-d tree and has been demonstrated on solid-state LiDARs with a small field of view [40]. Visual-lidar odometry (V-LOAM) and later fusion surveys document the complementary pair: cameras for semantics and texture, LiDAR for metric structure and lighting invariance [57,58,98].</w:t>
+        <w:t>Outdoors, the front-end is usually LiDAR, not RGB-D. LOAM and LeGO-LOAM established feature-based lidar odometry [38,111]. Tight lidar-inertial systems (FAST-LIO, LIO-SAM, FAST-LIO2) then made solid-state and spinning clouds usable on UAVs and handheld platforms without a separate visual pipeline [39,40,112]. FAST-LIO2 in particular registers raw points into an incremental k-d tree and has been demonstrated on solid-state LiDARs with a small field of view [40]. When texture and structure are both available, lidar-visual-inertial estimators (V-LOAM, LVI-SAM, R3LIVE) colour the same map and survive brief LiDAR or camera dropouts better than a single-modality filter [41,61,113,114]. Fusion surveys document the complementary pair: cameras for semantics and texture, LiDAR for metric structure and lighting invariance [61,62].</w:t>
       </w:r>
     </w:p>
     <w:p>
@@ -4025,7 +4025,7 @@
           <w:i w:val="0"/>
           <w:sz w:val="22"/>
         </w:rPr>
-        <w:t>Point-cloud infrastructure (PCL, iterative closest point, OctoMap, Voxblox) determines whether these estimators can run online on a real chassis [99,100,101,102]. For control engineers the interface that matters is usually a pose with covariance plus a costmap, not a research SLAM paper. Table 5 compares the fusion patterns that those libraries usually sit under.</w:t>
+        <w:t>Point-cloud infrastructure (PCL, iterative closest point, OctoMap, Voxblox) determines whether these estimators can run online on a real chassis [115,116,117,118]. ICP itself has a large variant tree: point-to-plane and generalized-ICP improve robustness on structured rooms, and comparative tests show that the variant, the sampling, and the outlier rule matter as much as the textbook algorithm name [119,120,121]. For control engineers the interface that matters is usually a pose with covariance plus a costmap, not a research SLAM paper. Table 5 compares the fusion patterns that those libraries usually sit under.</w:t>
       </w:r>
     </w:p>
     <w:p>
@@ -4678,7 +4678,7 @@
                 <w:i w:val="0"/>
                 <w:sz w:val="16"/>
               </w:rPr>
-              <w:t>Sync and extrinsics [57,98]</w:t>
+              <w:t>Sync and extrinsics [61,113]</w:t>
             </w:r>
           </w:p>
         </w:tc>
@@ -4782,7 +4782,111 @@
                 <w:i w:val="0"/>
                 <w:sz w:val="16"/>
               </w:rPr>
-              <w:t>Needs a structured cloud [39,40]</w:t>
+              <w:t>Needs a structured cloud [39,40,112]</w:t>
+            </w:r>
+          </w:p>
+        </w:tc>
+      </w:tr>
+      <w:tr>
+        <w:tc>
+          <w:tcPr>
+            <w:tcW w:type="dxa" w:w="1560"/>
+          </w:tcPr>
+          <w:p>
+            <w:r/>
+            <w:r>
+              <w:rPr>
+                <w:rFonts w:ascii="Times New Roman" w:hAnsi="Times New Roman" w:eastAsia="Times New Roman"/>
+                <w:b w:val="0"/>
+                <w:i w:val="0"/>
+                <w:sz w:val="16"/>
+              </w:rPr>
+              <w:t>Lidar-visual-inertial</w:t>
+            </w:r>
+          </w:p>
+        </w:tc>
+        <w:tc>
+          <w:tcPr>
+            <w:tcW w:type="dxa" w:w="1560"/>
+          </w:tcPr>
+          <w:p>
+            <w:r/>
+            <w:r>
+              <w:rPr>
+                <w:rFonts w:ascii="Times New Roman" w:hAnsi="Times New Roman" w:eastAsia="Times New Roman"/>
+                <w:b w:val="0"/>
+                <w:i w:val="0"/>
+                <w:sz w:val="16"/>
+              </w:rPr>
+              <w:t>LiDAR + camera + IMU</w:t>
+            </w:r>
+          </w:p>
+        </w:tc>
+        <w:tc>
+          <w:tcPr>
+            <w:tcW w:type="dxa" w:w="1560"/>
+          </w:tcPr>
+          <w:p>
+            <w:r/>
+            <w:r>
+              <w:rPr>
+                <w:rFonts w:ascii="Times New Roman" w:hAnsi="Times New Roman" w:eastAsia="Times New Roman"/>
+                <w:b w:val="0"/>
+                <w:i w:val="0"/>
+                <w:sz w:val="16"/>
+              </w:rPr>
+              <w:t>Tight factor graph</w:t>
+            </w:r>
+          </w:p>
+        </w:tc>
+        <w:tc>
+          <w:tcPr>
+            <w:tcW w:type="dxa" w:w="1560"/>
+          </w:tcPr>
+          <w:p>
+            <w:r/>
+            <w:r>
+              <w:rPr>
+                <w:rFonts w:ascii="Times New Roman" w:hAnsi="Times New Roman" w:eastAsia="Times New Roman"/>
+                <w:b w:val="0"/>
+                <w:i w:val="0"/>
+                <w:sz w:val="16"/>
+              </w:rPr>
+              <w:t>Coloured metric map</w:t>
+            </w:r>
+          </w:p>
+        </w:tc>
+        <w:tc>
+          <w:tcPr>
+            <w:tcW w:type="dxa" w:w="1560"/>
+          </w:tcPr>
+          <w:p>
+            <w:r/>
+            <w:r>
+              <w:rPr>
+                <w:rFonts w:ascii="Times New Roman" w:hAnsi="Times New Roman" w:eastAsia="Times New Roman"/>
+                <w:b w:val="0"/>
+                <w:i w:val="0"/>
+                <w:sz w:val="16"/>
+              </w:rPr>
+              <w:t>Outdoor inspection</w:t>
+            </w:r>
+          </w:p>
+        </w:tc>
+        <w:tc>
+          <w:tcPr>
+            <w:tcW w:type="dxa" w:w="1560"/>
+          </w:tcPr>
+          <w:p>
+            <w:r/>
+            <w:r>
+              <w:rPr>
+                <w:rFonts w:ascii="Times New Roman" w:hAnsi="Times New Roman" w:eastAsia="Times New Roman"/>
+                <w:b w:val="0"/>
+                <w:i w:val="0"/>
+                <w:sz w:val="16"/>
+              </w:rPr>
+              <w:t>Sync and exposure [41,114]</w:t>
             </w:r>
           </w:p>
         </w:tc>
@@ -4814,7 +4918,7 @@
           <w:i w:val="0"/>
           <w:sz w:val="22"/>
         </w:rPr>
-        <w:t>Once a metric cloud exists, the next questions are what the object is and where the robot may go. Classical 3D detectors used hand-crafted histograms. Current networks consume raw points, voxels, or range images [75,103,104]. Semantic segmentation labels every point; instance segmentation separates two chairs of the same class. RGB remains useful for texture and class priors; depth remains useful for scale and occlusion. Pose-estimation benchmarks such as BOP and methods such as PoseCNN made 6-DoF object pose a measurable industrial problem rather than a one-off demonstration [105,106].</w:t>
+        <w:t>Once a metric cloud exists, the next questions are what the object is and where the robot may go. Classical 3D detectors used hand-crafted histograms. Current networks consume raw points, voxels, or range images [83,122,123]. Semantic segmentation labels every point; instance segmentation separates two chairs of the same class. RGB remains useful for texture and class priors; depth remains useful for scale and occlusion. Pose-estimation benchmarks such as BOP and methods such as PoseCNN made 6-DoF object pose a measurable industrial problem rather than a one-off demonstration [124,125].</w:t>
       </w:r>
     </w:p>
     <w:p>
@@ -4830,7 +4934,7 @@
           <w:i w:val="0"/>
           <w:sz w:val="22"/>
         </w:rPr>
-        <w:t>Beyond labels, mechatronic systems care about affordances: surface normals and curvature for grasp stability, traversable floor versus negative obstacles, and dynamic scene graphs that persist over time [60,90,91]. These layers are not unique to depth sensors, but they become cheaper when scale is observed rather than inferred. In dynamic scenes, geometric SLAM without semantics remains brittle; recent surveys document the shift toward semantic and robust dynamic SLAM [27,107].</w:t>
+        <w:t>Beyond labels, mechatronic systems care about affordances: surface normals and curvature for grasp stability, traversable floor versus negative obstacles, and dynamic scene graphs that persist over time [64,104,105]. These layers are not unique to depth sensors, but they become cheaper when scale is observed rather than inferred. In dynamic scenes, geometric SLAM without semantics remains brittle; recent surveys document the shift toward semantic and robust dynamic SLAM [27,126].</w:t>
       </w:r>
     </w:p>
     <w:p>
@@ -4858,9 +4962,574 @@
           <w:i w:val="0"/>
           <w:sz w:val="22"/>
         </w:rPr>
-        <w:t>Every number in Tables 2 and 3 assumes that the depth camera, the colour camera, and any IMU or LiDAR share a known frame. Zhang's planar calibrator is still the colour-camera starting point [108]. RGB-D devices need a joint model of colour intrinsics, depth distortion, and the depth-to-colour extrinsics; Herrera, Kannala, and Heikkila gave the recipe that most robotics stacks still follow [42]. Kinect-era papers already showed that an uncalibrated factory model leaves a systematic bowl in the point cloud [14,41]. On a mobile robot the same error looks like a sloping floor and a biased obstacle range [61]. Visual-inertial and lidar-inertial estimators can absorb a slowly varying extrinsic, but they cannot invent a time stamp that the hardware never sent [40,79,82]. A design review that skips the calibration and synchronization budget is not finished.</w:t>
+        <w:t>Every number in Tables 2 and 3 assumes that the depth camera, the colour camera, and any IMU or LiDAR share a known frame. Zhang's planar calibrator is still the colour-camera starting point [127]. RGB-D devices need a joint model of colour intrinsics, depth distortion, and the depth-to-colour extrinsics; Herrera, Kannala, and Heikkila gave the recipe that most robotics stacks still follow [46]. Kinect-era papers already showed that an uncalibrated factory model leaves a systematic bowl in the point cloud [14,45]. On a mobile robot the same error looks like a sloping floor and a biased obstacle range [65]. Visual-inertial and lidar-inertial estimators can absorb a slowly varying extrinsic, but they cannot invent a time stamp that the hardware never sent [40,87,90]. A design review that skips the calibration and synchronization budget is not finished.</w:t>
       </w:r>
     </w:p>
+    <w:p>
+      <w:pPr>
+        <w:pStyle w:val="Heading2"/>
+      </w:pPr>
+      <w:r>
+        <w:rPr>
+          <w:rFonts w:ascii="Times New Roman" w:hAnsi="Times New Roman"/>
+          <w:color w:val="1F2937"/>
+        </w:rPr>
+        <w:t>3.5 Benchmarks and what they do not measure</w:t>
+      </w:r>
+    </w:p>
+    <w:p>
+      <w:pPr>
+        <w:spacing w:after="160" w:line="360" w:lineRule="auto"/>
+        <w:ind w:firstLine="432"/>
+        <w:jc w:val="both"/>
+      </w:pPr>
+      <w:r>
+        <w:rPr>
+          <w:rFonts w:ascii="Times New Roman" w:hAnsi="Times New Roman" w:eastAsia="Times New Roman"/>
+          <w:b w:val="0"/>
+          <w:i w:val="0"/>
+          <w:sz w:val="22"/>
+        </w:rPr>
+        <w:t>A Sensors review that only names algorithms without naming the datasets they were scored on is hard to use. Table 8 lists the public suites that most of the papers in Sections 3.1-3.3 actually report. TUM RGB-D and ICL-NUIM made indoor RGB-D odometry comparable [100,128]. EuRoC and TUM VI did the same for visual-inertial estimators on MAVs and handheld sensors [129,130]. KITTI and later driving sets (including nuScenes) dominate outdoor completion and lidar-camera fusion [73,81,82,131]. NYU-Depth, ScanNet, and Matterport3D supply indoor labels for completion and semantics [70,79,80]. YCB and BOP supply objects and 6-DoF pose protocols for grasping cells [124,132].</w:t>
+      </w:r>
+    </w:p>
+    <w:p>
+      <w:pPr>
+        <w:spacing w:after="160" w:line="360" w:lineRule="auto"/>
+        <w:ind w:firstLine="432"/>
+        <w:jc w:val="both"/>
+      </w:pPr>
+      <w:r>
+        <w:rPr>
+          <w:rFonts w:ascii="Times New Roman" w:hAnsi="Times New Roman" w:eastAsia="Times New Roman"/>
+          <w:b w:val="0"/>
+          <w:i w:val="0"/>
+          <w:sz w:val="22"/>
+        </w:rPr>
+        <w:t>Two caveats matter more than the leaderboard. First, a good absolute trajectory error on TUM RGB-D or EuRoC does not certify a warehouse aisle or a sunny yard: those sequences are short, mostly well lit, and free of the safety integrity requirement [4,100,129]. Second, completion RMSE on KITTI is a score on projected LiDAR, not a guarantee that thin, transparent, or never-seen objects are recovered [73,82]. A design review should therefore treat Table 8 as a map of where a method was tested, not as a substitute for a factory or flight trial.</w:t>
+      </w:r>
+    </w:p>
+    <w:p>
+      <w:pPr>
+        <w:spacing w:before="80" w:after="240"/>
+        <w:ind w:firstLine="0"/>
+        <w:jc w:val="both"/>
+      </w:pPr>
+      <w:r>
+        <w:rPr>
+          <w:rFonts w:ascii="Times New Roman" w:hAnsi="Times New Roman" w:eastAsia="Times New Roman"/>
+          <w:b w:val="0"/>
+          <w:i/>
+          <w:sz w:val="20"/>
+        </w:rPr>
+        <w:t>Table 8. Public benchmarks used by the algorithms reviewed here, and the mechatronic question each suite cannot answer.</w:t>
+      </w:r>
+    </w:p>
+    <w:tbl>
+      <w:tblPr>
+        <w:tblStyle w:val="TableGrid"/>
+        <w:tblW w:type="auto" w:w="0"/>
+        <w:tblLayout w:type="autofit"/>
+        <w:tblLook w:firstColumn="1" w:firstRow="1" w:lastColumn="0" w:lastRow="0" w:noHBand="0" w:noVBand="1" w:val="04A0"/>
+      </w:tblPr>
+      <w:tblGrid>
+        <w:gridCol w:w="2340"/>
+        <w:gridCol w:w="2340"/>
+        <w:gridCol w:w="2340"/>
+        <w:gridCol w:w="2340"/>
+      </w:tblGrid>
+      <w:tr>
+        <w:tc>
+          <w:tcPr>
+            <w:tcW w:type="dxa" w:w="2340"/>
+          </w:tcPr>
+          <w:p>
+            <w:r/>
+            <w:r>
+              <w:rPr>
+                <w:rFonts w:ascii="Times New Roman" w:hAnsi="Times New Roman" w:eastAsia="Times New Roman"/>
+                <w:b/>
+                <w:i w:val="0"/>
+                <w:sz w:val="16"/>
+              </w:rPr>
+              <w:t>Suite</w:t>
+            </w:r>
+          </w:p>
+        </w:tc>
+        <w:tc>
+          <w:tcPr>
+            <w:tcW w:type="dxa" w:w="2340"/>
+          </w:tcPr>
+          <w:p>
+            <w:r/>
+            <w:r>
+              <w:rPr>
+                <w:rFonts w:ascii="Times New Roman" w:hAnsi="Times New Roman" w:eastAsia="Times New Roman"/>
+                <w:b/>
+                <w:i w:val="0"/>
+                <w:sz w:val="16"/>
+              </w:rPr>
+              <w:t>Typical front-end</w:t>
+            </w:r>
+          </w:p>
+        </w:tc>
+        <w:tc>
+          <w:tcPr>
+            <w:tcW w:type="dxa" w:w="2340"/>
+          </w:tcPr>
+          <w:p>
+            <w:r/>
+            <w:r>
+              <w:rPr>
+                <w:rFonts w:ascii="Times New Roman" w:hAnsi="Times New Roman" w:eastAsia="Times New Roman"/>
+                <w:b/>
+                <w:i w:val="0"/>
+                <w:sz w:val="16"/>
+              </w:rPr>
+              <w:t>What it scores</w:t>
+            </w:r>
+          </w:p>
+        </w:tc>
+        <w:tc>
+          <w:tcPr>
+            <w:tcW w:type="dxa" w:w="2340"/>
+          </w:tcPr>
+          <w:p>
+            <w:r/>
+            <w:r>
+              <w:rPr>
+                <w:rFonts w:ascii="Times New Roman" w:hAnsi="Times New Roman" w:eastAsia="Times New Roman"/>
+                <w:b/>
+                <w:i w:val="0"/>
+                <w:sz w:val="16"/>
+              </w:rPr>
+              <w:t>What it does not score</w:t>
+            </w:r>
+          </w:p>
+        </w:tc>
+      </w:tr>
+      <w:tr>
+        <w:tc>
+          <w:tcPr>
+            <w:tcW w:type="dxa" w:w="2340"/>
+          </w:tcPr>
+          <w:p>
+            <w:r/>
+            <w:r>
+              <w:rPr>
+                <w:rFonts w:ascii="Times New Roman" w:hAnsi="Times New Roman" w:eastAsia="Times New Roman"/>
+                <w:b w:val="0"/>
+                <w:i w:val="0"/>
+                <w:sz w:val="16"/>
+              </w:rPr>
+              <w:t>TUM RGB-D; ICL-NUIM [100,128]</w:t>
+            </w:r>
+          </w:p>
+        </w:tc>
+        <w:tc>
+          <w:tcPr>
+            <w:tcW w:type="dxa" w:w="2340"/>
+          </w:tcPr>
+          <w:p>
+            <w:r/>
+            <w:r>
+              <w:rPr>
+                <w:rFonts w:ascii="Times New Roman" w:hAnsi="Times New Roman" w:eastAsia="Times New Roman"/>
+                <w:b w:val="0"/>
+                <w:i w:val="0"/>
+                <w:sz w:val="16"/>
+              </w:rPr>
+              <w:t>RGB-D</w:t>
+            </w:r>
+          </w:p>
+        </w:tc>
+        <w:tc>
+          <w:tcPr>
+            <w:tcW w:type="dxa" w:w="2340"/>
+          </w:tcPr>
+          <w:p>
+            <w:r/>
+            <w:r>
+              <w:rPr>
+                <w:rFonts w:ascii="Times New Roman" w:hAnsi="Times New Roman" w:eastAsia="Times New Roman"/>
+                <w:b w:val="0"/>
+                <w:i w:val="0"/>
+                <w:sz w:val="16"/>
+              </w:rPr>
+              <w:t>Indoor ATE / reconstruction</w:t>
+            </w:r>
+          </w:p>
+        </w:tc>
+        <w:tc>
+          <w:tcPr>
+            <w:tcW w:type="dxa" w:w="2340"/>
+          </w:tcPr>
+          <w:p>
+            <w:r/>
+            <w:r>
+              <w:rPr>
+                <w:rFonts w:ascii="Times New Roman" w:hAnsi="Times New Roman" w:eastAsia="Times New Roman"/>
+                <w:b w:val="0"/>
+                <w:i w:val="0"/>
+                <w:sz w:val="16"/>
+              </w:rPr>
+              <w:t>Sunlight, rain, safety integrity</w:t>
+            </w:r>
+          </w:p>
+        </w:tc>
+      </w:tr>
+      <w:tr>
+        <w:tc>
+          <w:tcPr>
+            <w:tcW w:type="dxa" w:w="2340"/>
+          </w:tcPr>
+          <w:p>
+            <w:r/>
+            <w:r>
+              <w:rPr>
+                <w:rFonts w:ascii="Times New Roman" w:hAnsi="Times New Roman" w:eastAsia="Times New Roman"/>
+                <w:b w:val="0"/>
+                <w:i w:val="0"/>
+                <w:sz w:val="16"/>
+              </w:rPr>
+              <w:t>EuRoC; TUM VI [129,130]</w:t>
+            </w:r>
+          </w:p>
+        </w:tc>
+        <w:tc>
+          <w:tcPr>
+            <w:tcW w:type="dxa" w:w="2340"/>
+          </w:tcPr>
+          <w:p>
+            <w:r/>
+            <w:r>
+              <w:rPr>
+                <w:rFonts w:ascii="Times New Roman" w:hAnsi="Times New Roman" w:eastAsia="Times New Roman"/>
+                <w:b w:val="0"/>
+                <w:i w:val="0"/>
+                <w:sz w:val="16"/>
+              </w:rPr>
+              <w:t>Mono/stereo + IMU</w:t>
+            </w:r>
+          </w:p>
+        </w:tc>
+        <w:tc>
+          <w:tcPr>
+            <w:tcW w:type="dxa" w:w="2340"/>
+          </w:tcPr>
+          <w:p>
+            <w:r/>
+            <w:r>
+              <w:rPr>
+                <w:rFonts w:ascii="Times New Roman" w:hAnsi="Times New Roman" w:eastAsia="Times New Roman"/>
+                <w:b w:val="0"/>
+                <w:i w:val="0"/>
+                <w:sz w:val="16"/>
+              </w:rPr>
+              <w:t>MAV / handheld VIO drift</w:t>
+            </w:r>
+          </w:p>
+        </w:tc>
+        <w:tc>
+          <w:tcPr>
+            <w:tcW w:type="dxa" w:w="2340"/>
+          </w:tcPr>
+          <w:p>
+            <w:r/>
+            <w:r>
+              <w:rPr>
+                <w:rFonts w:ascii="Times New Roman" w:hAnsi="Times New Roman" w:eastAsia="Times New Roman"/>
+                <w:b w:val="0"/>
+                <w:i w:val="0"/>
+                <w:sz w:val="16"/>
+              </w:rPr>
+              <w:t>Warehouse aisles; ToF multipath</w:t>
+            </w:r>
+          </w:p>
+        </w:tc>
+      </w:tr>
+      <w:tr>
+        <w:tc>
+          <w:tcPr>
+            <w:tcW w:type="dxa" w:w="2340"/>
+          </w:tcPr>
+          <w:p>
+            <w:r/>
+            <w:r>
+              <w:rPr>
+                <w:rFonts w:ascii="Times New Roman" w:hAnsi="Times New Roman" w:eastAsia="Times New Roman"/>
+                <w:b w:val="0"/>
+                <w:i w:val="0"/>
+                <w:sz w:val="16"/>
+              </w:rPr>
+              <w:t>KITTI; KITTI depth [73,81,82]</w:t>
+            </w:r>
+          </w:p>
+        </w:tc>
+        <w:tc>
+          <w:tcPr>
+            <w:tcW w:type="dxa" w:w="2340"/>
+          </w:tcPr>
+          <w:p>
+            <w:r/>
+            <w:r>
+              <w:rPr>
+                <w:rFonts w:ascii="Times New Roman" w:hAnsi="Times New Roman" w:eastAsia="Times New Roman"/>
+                <w:b w:val="0"/>
+                <w:i w:val="0"/>
+                <w:sz w:val="16"/>
+              </w:rPr>
+              <w:t>Camera + spinning LiDAR</w:t>
+            </w:r>
+          </w:p>
+        </w:tc>
+        <w:tc>
+          <w:tcPr>
+            <w:tcW w:type="dxa" w:w="2340"/>
+          </w:tcPr>
+          <w:p>
+            <w:r/>
+            <w:r>
+              <w:rPr>
+                <w:rFonts w:ascii="Times New Roman" w:hAnsi="Times New Roman" w:eastAsia="Times New Roman"/>
+                <w:b w:val="0"/>
+                <w:i w:val="0"/>
+                <w:sz w:val="16"/>
+              </w:rPr>
+              <w:t>Driving odometry and completion</w:t>
+            </w:r>
+          </w:p>
+        </w:tc>
+        <w:tc>
+          <w:tcPr>
+            <w:tcW w:type="dxa" w:w="2340"/>
+          </w:tcPr>
+          <w:p>
+            <w:r/>
+            <w:r>
+              <w:rPr>
+                <w:rFonts w:ascii="Times New Roman" w:hAnsi="Times New Roman" w:eastAsia="Times New Roman"/>
+                <w:b w:val="0"/>
+                <w:i w:val="0"/>
+                <w:sz w:val="16"/>
+              </w:rPr>
+              <w:t>Indoor cells; glass and thin poles as safety objects</w:t>
+            </w:r>
+          </w:p>
+        </w:tc>
+      </w:tr>
+      <w:tr>
+        <w:tc>
+          <w:tcPr>
+            <w:tcW w:type="dxa" w:w="2340"/>
+          </w:tcPr>
+          <w:p>
+            <w:r/>
+            <w:r>
+              <w:rPr>
+                <w:rFonts w:ascii="Times New Roman" w:hAnsi="Times New Roman" w:eastAsia="Times New Roman"/>
+                <w:b w:val="0"/>
+                <w:i w:val="0"/>
+                <w:sz w:val="16"/>
+              </w:rPr>
+              <w:t>nuScenes [131]</w:t>
+            </w:r>
+          </w:p>
+        </w:tc>
+        <w:tc>
+          <w:tcPr>
+            <w:tcW w:type="dxa" w:w="2340"/>
+          </w:tcPr>
+          <w:p>
+            <w:r/>
+            <w:r>
+              <w:rPr>
+                <w:rFonts w:ascii="Times New Roman" w:hAnsi="Times New Roman" w:eastAsia="Times New Roman"/>
+                <w:b w:val="0"/>
+                <w:i w:val="0"/>
+                <w:sz w:val="16"/>
+              </w:rPr>
+              <w:t>Camera + LiDAR + radar</w:t>
+            </w:r>
+          </w:p>
+        </w:tc>
+        <w:tc>
+          <w:tcPr>
+            <w:tcW w:type="dxa" w:w="2340"/>
+          </w:tcPr>
+          <w:p>
+            <w:r/>
+            <w:r>
+              <w:rPr>
+                <w:rFonts w:ascii="Times New Roman" w:hAnsi="Times New Roman" w:eastAsia="Times New Roman"/>
+                <w:b w:val="0"/>
+                <w:i w:val="0"/>
+                <w:sz w:val="16"/>
+              </w:rPr>
+              <w:t>Multimodal driving perception</w:t>
+            </w:r>
+          </w:p>
+        </w:tc>
+        <w:tc>
+          <w:tcPr>
+            <w:tcW w:type="dxa" w:w="2340"/>
+          </w:tcPr>
+          <w:p>
+            <w:r/>
+            <w:r>
+              <w:rPr>
+                <w:rFonts w:ascii="Times New Roman" w:hAnsi="Times New Roman" w:eastAsia="Times New Roman"/>
+                <w:b w:val="0"/>
+                <w:i w:val="0"/>
+                <w:sz w:val="16"/>
+              </w:rPr>
+              <w:t>Factory lighting; cobot cells</w:t>
+            </w:r>
+          </w:p>
+        </w:tc>
+      </w:tr>
+      <w:tr>
+        <w:tc>
+          <w:tcPr>
+            <w:tcW w:type="dxa" w:w="2340"/>
+          </w:tcPr>
+          <w:p>
+            <w:r/>
+            <w:r>
+              <w:rPr>
+                <w:rFonts w:ascii="Times New Roman" w:hAnsi="Times New Roman" w:eastAsia="Times New Roman"/>
+                <w:b w:val="0"/>
+                <w:i w:val="0"/>
+                <w:sz w:val="16"/>
+              </w:rPr>
+              <w:t>NYU; ScanNet; Matterport3D [70,79,80]</w:t>
+            </w:r>
+          </w:p>
+        </w:tc>
+        <w:tc>
+          <w:tcPr>
+            <w:tcW w:type="dxa" w:w="2340"/>
+          </w:tcPr>
+          <w:p>
+            <w:r/>
+            <w:r>
+              <w:rPr>
+                <w:rFonts w:ascii="Times New Roman" w:hAnsi="Times New Roman" w:eastAsia="Times New Roman"/>
+                <w:b w:val="0"/>
+                <w:i w:val="0"/>
+                <w:sz w:val="16"/>
+              </w:rPr>
+              <w:t>RGB-D</w:t>
+            </w:r>
+          </w:p>
+        </w:tc>
+        <w:tc>
+          <w:tcPr>
+            <w:tcW w:type="dxa" w:w="2340"/>
+          </w:tcPr>
+          <w:p>
+            <w:r/>
+            <w:r>
+              <w:rPr>
+                <w:rFonts w:ascii="Times New Roman" w:hAnsi="Times New Roman" w:eastAsia="Times New Roman"/>
+                <w:b w:val="0"/>
+                <w:i w:val="0"/>
+                <w:sz w:val="16"/>
+              </w:rPr>
+              <w:t>Indoor depth and semantics</w:t>
+            </w:r>
+          </w:p>
+        </w:tc>
+        <w:tc>
+          <w:tcPr>
+            <w:tcW w:type="dxa" w:w="2340"/>
+          </w:tcPr>
+          <w:p>
+            <w:r/>
+            <w:r>
+              <w:rPr>
+                <w:rFonts w:ascii="Times New Roman" w:hAnsi="Times New Roman" w:eastAsia="Times New Roman"/>
+                <w:b w:val="0"/>
+                <w:i w:val="0"/>
+                <w:sz w:val="16"/>
+              </w:rPr>
+              <w:t>Metric safety; outdoor range</w:t>
+            </w:r>
+          </w:p>
+        </w:tc>
+      </w:tr>
+      <w:tr>
+        <w:tc>
+          <w:tcPr>
+            <w:tcW w:type="dxa" w:w="2340"/>
+          </w:tcPr>
+          <w:p>
+            <w:r/>
+            <w:r>
+              <w:rPr>
+                <w:rFonts w:ascii="Times New Roman" w:hAnsi="Times New Roman" w:eastAsia="Times New Roman"/>
+                <w:b w:val="0"/>
+                <w:i w:val="0"/>
+                <w:sz w:val="16"/>
+              </w:rPr>
+              <w:t>YCB; BOP [124,132]</w:t>
+            </w:r>
+          </w:p>
+        </w:tc>
+        <w:tc>
+          <w:tcPr>
+            <w:tcW w:type="dxa" w:w="2340"/>
+          </w:tcPr>
+          <w:p>
+            <w:r/>
+            <w:r>
+              <w:rPr>
+                <w:rFonts w:ascii="Times New Roman" w:hAnsi="Times New Roman" w:eastAsia="Times New Roman"/>
+                <w:b w:val="0"/>
+                <w:i w:val="0"/>
+                <w:sz w:val="16"/>
+              </w:rPr>
+              <w:t>RGB-D on tabletop objects</w:t>
+            </w:r>
+          </w:p>
+        </w:tc>
+        <w:tc>
+          <w:tcPr>
+            <w:tcW w:type="dxa" w:w="2340"/>
+          </w:tcPr>
+          <w:p>
+            <w:r/>
+            <w:r>
+              <w:rPr>
+                <w:rFonts w:ascii="Times New Roman" w:hAnsi="Times New Roman" w:eastAsia="Times New Roman"/>
+                <w:b w:val="0"/>
+                <w:i w:val="0"/>
+                <w:sz w:val="16"/>
+              </w:rPr>
+              <w:t>6-DoF pose and grasp datasets</w:t>
+            </w:r>
+          </w:p>
+        </w:tc>
+        <w:tc>
+          <w:tcPr>
+            <w:tcW w:type="dxa" w:w="2340"/>
+          </w:tcPr>
+          <w:p>
+            <w:r/>
+            <w:r>
+              <w:rPr>
+                <w:rFonts w:ascii="Times New Roman" w:hAnsi="Times New Roman" w:eastAsia="Times New Roman"/>
+                <w:b w:val="0"/>
+                <w:i w:val="0"/>
+                <w:sz w:val="16"/>
+              </w:rPr>
+              <w:t>Oily steel bins; line vibration</w:t>
+            </w:r>
+          </w:p>
+        </w:tc>
+      </w:tr>
+    </w:tbl>
+    <w:p/>
     <w:p>
       <w:pPr>
         <w:pStyle w:val="Heading1"/>
@@ -4914,7 +5583,7 @@
           <w:i w:val="0"/>
           <w:sz w:val="22"/>
         </w:rPr>
-        <w:t>Bin picking and unstructured part handling spend spatial resolution and short-range accuracy. A sensor above the bin produces a point cloud; a pose estimator returns a 6-DoF grasp; a compliant gripper absorbs the residual error [59,60,105,106,109,110,111,112,113]. Grasp-from-point-cloud methods (GPD, Dex-Net, GG-CNN, GraspNet) showed that a depth image plus analytic or learned grasp scores can propose suction or parallel-jaw contacts without a full CAD model of every SKU [60,109,111,112]. When the part identity is known, multi-view pose networks of the Amazon Picking Challenge generation, PoseCNN, DenseFusion, and later estimators scored on BOP turn the same cloud into a 6-DoF object pose [105,106,110,113]. The first Amazon Picking Challenge made the systems nature of this problem obvious: teams that treated perception, planning, and gripping as separately optimized modules underperformed relative to tightly integrated stacks, and suction often beat anthropomorphic hands [59]. Structured light and laser triangulation still dominate when parts are metallic, overlapping, and closer than about two metres [5,59]. RGB is typically fused for class identity; force and torque close the last millimetres.</w:t>
+        <w:t>Bin picking and unstructured part handling spend spatial resolution and short-range accuracy. A sensor above the bin produces a point cloud; a pose estimator returns a 6-DoF grasp; a compliant gripper absorbs the residual error [63,64,124,125,133,134,135,136,137]. Grasp-from-point-cloud methods (GPD, Dex-Net, GG-CNN, GraspNet) showed that a depth image plus analytic or learned grasp scores can propose suction or parallel-jaw contacts without a full CAD model of every SKU [64,133,135,136]. When the part identity is known, multi-view pose networks of the Amazon Picking Challenge generation, PoseCNN, DenseFusion, and later estimators scored on BOP turn the same cloud into a 6-DoF object pose [124,125,134,137]. The YCB object set made those scores comparable across laboratories [132]. The first Amazon Picking Challenge made the systems nature of this problem obvious: teams that treated perception, planning, and gripping as separately optimized modules underperformed relative to tightly integrated stacks, and suction often beat anthropomorphic hands [63]. Structured light and laser triangulation still dominate when parts are metallic, overlapping, and closer than about two metres [5,63]. RGB is typically fused for class identity; force and torque close the last millimetres. A designer should therefore budget the sensor for the worst SKU in the bin, not the average YCB object: black rubber and oily steel still empty a consumer RGB-D cloud [4,132].</w:t>
       </w:r>
     </w:p>
     <w:p>
@@ -4946,7 +5615,7 @@
           <w:i w:val="0"/>
           <w:sz w:val="22"/>
         </w:rPr>
-        <w:t>Automated guided vehicles (AGVs) and autonomous mobile robots (AMRs) spend field of view and vertical coverage. A two-dimensional safety LiDAR sees a plane; a wide RGB-D camera or solid-state LiDAR sees pallets, overhangs, and people who lean into the aisle [4,58,61]. Table 6 summarizes the pairing.</w:t>
+        <w:t>Automated guided vehicles (AGVs) and autonomous mobile robots (AMRs) spend field of view and vertical coverage. A two-dimensional safety LiDAR sees a plane; a wide RGB-D camera or solid-state LiDAR sees pallets, overhangs, and people who lean into the aisle [4,62,65]. Table 6 summarizes the pairing.</w:t>
       </w:r>
     </w:p>
     <w:p>
@@ -5355,7 +6024,7 @@
           <w:i w:val="0"/>
           <w:sz w:val="22"/>
         </w:rPr>
-        <w:t>Indoor service robots made RGB-D SLAM a product feature. Devices such as RealSense D400-class cameras are chosen because they balance size, power, software support, and indoor range [4,20]. Keselman et al. documented the optical and matching behaviour of the R200 and D400 families, including the fact that projector texture is an aid rather than a requirement [20]. The algorithmic backbone is well documented: RGB-D odometry, loop closure, and a metric map [19,85,86,89]. Fankhauser et al. modelled Kinect v2 specifically as a navigation sensor and showed where its systematic bias matters for terrain [61]. The remaining failures are physical. Stairs and negative obstacles (curbs, open shafts) are invisible to a waist-height two-dimensional LiDAR. A forward depth camera can reconstruct them if the near field is valid and the robot is slow enough for the integration time [61]. Outdoor last-metre robots meet sunlight and long range, which is why the same software stack often grows a LiDAR or radar [57,58].</w:t>
+        <w:t>Indoor service robots made RGB-D SLAM a product feature. Devices such as RealSense D400-class cameras are chosen because they balance size, power, software support, and indoor range [4,20]. Keselman et al. documented the optical and matching behaviour of the R200 and D400 families, including the fact that projector texture is an aid rather than a requirement [20]. The algorithmic backbone is well documented: RGB-D odometry, loop closure, and a metric map [19,99,100,103]. Fankhauser et al. modelled Kinect v2 specifically as a navigation sensor and showed where its systematic bias matters for terrain [65]. Occupancy and signed-distance maps (OctoMap, Voxblox) then turn that cloud into a costmap a local planner can query [117,118]. The remaining failures are physical. Stairs and negative obstacles (curbs, open shafts) are invisible to a waist-height two-dimensional LiDAR. A forward depth camera can reconstruct them if the near field is valid and the robot is slow enough for the integration time [65]. Outdoor last-metre robots meet sunlight and long range, which is why the same software stack often grows a LiDAR or radar [61,62]. Teams that evaluate only on TUM RGB-D or EuRoC should therefore add a sunlight-and-glass trial before they call the stack warehouse-ready [4,100,129].</w:t>
       </w:r>
     </w:p>
     <w:p>
@@ -5371,7 +6040,7 @@
           <w:i w:val="0"/>
           <w:sz w:val="22"/>
         </w:rPr>
-        <w:t>Human-aware navigation is a semantic layer on the same geometry. Depth supplies a metric body hull; RGB pose estimators supply intent cues [15,16]. Socially acceptable clearance is then a planner parameter, not a new sensor. Active SLAM surveys discuss how a robot should move to keep that map healthy, which is a planning problem built on the same depth front-end [107].</w:t>
+        <w:t>Human-aware navigation is a semantic layer on the same geometry. Depth supplies a metric body hull; RGB pose estimators supply intent cues [15,16]. Socially acceptable clearance is then a planner parameter, not a new sensor. Active SLAM surveys discuss how a robot should move to keep that map healthy, which is a planning problem built on the same depth front-end [126].</w:t>
       </w:r>
     </w:p>
     <w:p>
@@ -5399,7 +6068,7 @@
           <w:i w:val="0"/>
           <w:sz w:val="22"/>
         </w:rPr>
-        <w:t>On a small UAV the payload budget is measured in tens of grams and a few watts [2]. That constraint, more than any algorithm, explains why lightweight depth cameras and solid-state LiDARs appear on inspection drones while automotive-grade spinning units do not.</w:t>
+        <w:t>On a small UAV the payload budget is measured in tens of grams and a few watts [2,138]. That constraint, more than any algorithm, explains why lightweight depth cameras and solid-state LiDARs appear on inspection drones while automotive-grade spinning units do not. System papers on vision-controlled micro aerial vehicles already treated cameras, IMUs, and a metric map as one stack rather than as an optional perception add-on [84,138,139].</w:t>
       </w:r>
     </w:p>
     <w:p>
@@ -5415,7 +6084,7 @@
           <w:i w:val="0"/>
           <w:sz w:val="22"/>
         </w:rPr>
-        <w:t>Obstacle avoidance is the first use. Depth gives a metric stop distance in GPS-denied corridors, forests, or plant rooms [2,114,115]. Barry, Florence, and Tedrake demonstrated tree avoidance at up to 14 m/s with a pushbroom stereo front-end running at 120 Hz on a small airframe [115]. That result is a reminder that geometric ranging, not a particular branded depth camera, is the requirement; stereo, RGB-D, and LiDAR are interchangeable only after latency, weight, and lighting are checked. Event-camera and event-stereo systems push latency into the microsecond regime for fast approach speeds [28,116,117,118]. Falanga et al. used event cameras to dodge dynamic obstacles that a frame-based pipeline would blur [116]. Miniature platforms have demonstrated onboard depth-based avoidance with tight compute envelopes [114].</w:t>
+        <w:t>Obstacle avoidance is the first use. Depth gives a metric stop distance in GPS-denied corridors, forests, or plant rooms [2,140,141]. Barry, Florence, and Tedrake demonstrated tree avoidance at up to 14 m/s with a pushbroom stereo front-end running at 120 Hz on a small airframe [141]. That result is a reminder that geometric ranging, not a particular branded depth camera, is the requirement; stereo, RGB-D, and LiDAR are interchangeable only after latency, weight, and lighting are checked. Event-camera and event-stereo systems push latency into the microsecond regime for fast approach speeds [28,142,143,144]. Falanga et al. used event cameras to dodge dynamic obstacles that a frame-based pipeline would blur [142]. Miniature platforms have demonstrated onboard depth-based avoidance with tight compute envelopes [140].</w:t>
       </w:r>
     </w:p>
     <w:p>
@@ -5431,7 +6100,7 @@
           <w:i w:val="0"/>
           <w:sz w:val="22"/>
         </w:rPr>
-        <w:t>Mapping and inspection is the second use. Photogrammetry from RGB already builds impressive models [119,120]. Depth or LiDAR is added when the operator needs metric scale, vegetation penetration, or a flight path that stays a fixed standoff from a girder [63,119,120,121,122]. Bridge work is the most documented civil case: drone-enabled visual inspection procedures exist, and unmanned systems have been used to cue fatigue-crack examination on steel members [121,122]. Next-best-view planners show how a ranging front-end can choose the next pose instead of flying a fixed lawnmower [123]. Civil-infrastructure reviews show that the bottleneck is rarely whether a point cloud can be built. It is converting that cloud into defect locations that an engineer will trust [63].</w:t>
+        <w:t>Mapping and inspection is the second use. Photogrammetry from RGB already builds impressive models [145,146]. Depth or LiDAR is added when the operator needs metric scale, vegetation penetration, or a flight path that stays a fixed standoff from a girder [67,145,146,147,148]. Bridge work is the most documented civil case: drone-enabled visual inspection procedures exist, and unmanned systems have been used to cue fatigue-crack examination on steel members [147,148]. Quality-assessment studies warn that a pretty mesh is not an inspection: motion blur, standoff, and lighting can hide the crack the flight was commissioned to find [149]. Next-best-view planners show how a ranging front-end can choose the next pose instead of flying a fixed lawnmower [150]. Civil-infrastructure reviews show that the bottleneck is rarely whether a point cloud can be built. It is converting that cloud into defect locations that an engineer will trust [67]. Aerial manipulation is a third, still-research use: a ranging front-end can keep a tool at a commanded standoff, but contact dynamics then dominate the stack [151].</w:t>
       </w:r>
     </w:p>
     <w:p>
@@ -5503,7 +6172,7 @@
           <w:i w:val="0"/>
           <w:sz w:val="22"/>
         </w:rPr>
-        <w:t>Figure 5 describes a representative architecture assembled from published inspection practice, not a system designed in this paper. A bridge-inspection UAV typically carries a long-range ranging sensor (solid-state LiDAR or equivalent), a high-resolution RGB camera, and an IMU [63,119,120]. Onboard software fuses range and inertia into a local metric volume and runs a lightweight network on RGB for component and surface-defect cues [63]. The aircraft uplinks an annotated model and geotagged defect hypotheses rather than raw multi-sensor video. The design is a bandwidth and trust design: inspectors re-photograph the flagged regions instead of watching hours of flight video. Multi-UAV structure-from-motion benefits from the same metric scale cue. Depth does not replace inter-vehicle communication, but it reduces the need for dense ground control [119,120].</w:t>
+        <w:t>Figure 5 describes a representative architecture assembled from published inspection practice, not a system designed in this paper. A bridge-inspection UAV typically carries a long-range ranging sensor (solid-state LiDAR or equivalent), a high-resolution RGB camera, and an IMU [67,145,146]. Onboard software fuses range and inertia into a local metric volume and runs a lightweight network on RGB for component and surface-defect cues [67]. The aircraft uplinks an annotated model and geotagged defect hypotheses rather than raw multi-sensor video. The design is a bandwidth and trust design: inspectors re-photograph the flagged regions instead of watching hours of flight video. Multi-UAV structure-from-motion benefits from the same metric scale cue. Depth does not replace inter-vehicle communication, but it reduces the need for dense ground control [145,146].</w:t>
       </w:r>
     </w:p>
     <w:p>
@@ -5531,7 +6200,7 @@
           <w:i w:val="0"/>
           <w:sz w:val="22"/>
         </w:rPr>
-        <w:t>Collaborative cells fail first on safety, then on programming time [3,124,125,126,127]. Depth cameras address both, with limits that must be stated. Broader HRI surveys make the same split: methods that keep a human safe, and methods that make the robot usable [126,127].</w:t>
+        <w:t>Collaborative cells fail first on safety, then on programming time [3,152,153,154,155]. Depth cameras address both, with limits that must be stated. Broader HRI surveys make the same split: methods that keep a human safe, and methods that make the robot usable [154,155].</w:t>
       </w:r>
     </w:p>
     <w:p>
@@ -5547,7 +6216,7 @@
           <w:i w:val="0"/>
           <w:sz w:val="22"/>
         </w:rPr>
-        <w:t>Workspace monitoring. A ceiling or cell-side depth sensor builds a three-dimensional occupancy of the shared volume. Speed-and-separation monitoring, as framed by ISO/TS 15066, can then slow or stop the arm when a person enters a warning or protective zone [3,33]. The industrial-robot safety standard ISO 10218 still sits underneath that technical specification [34]. Three-dimensional monitoring is more complete than a light curtain because it can shrink the protective volume as the arm slows and can see a person who leans over a fence. A consumer RGB-D camera is not automatically a safety-rated device. Certified implementations still need a safety controller, defined failure modes, and usually a redundant sensing channel [3,33,125,127]. Surveys of industrial human-robot collaboration treat safety and the user interface as the two bottlenecks that decide whether a cobot is actually used, not whether a depth demo exists [3,124,126]. Collision detection on the arm itself remains necessary because vision cannot see inside the contact [125].</w:t>
+        <w:t>Workspace monitoring. A ceiling or cell-side depth sensor builds a three-dimensional occupancy of the shared volume. Speed-and-separation monitoring, as framed by ISO/TS 15066, can then slow or stop the arm when a person enters a warning or protective zone [3,33]. The industrial-robot safety standard ISO 10218 still sits underneath that technical specification [34]. Three-dimensional monitoring is more complete than a light curtain because it can shrink the protective volume as the arm slows and can see a person who leans over a fence. Control papers that quantify collaborative safety treat separation, speed, and a defined protective stop as metrics, not as a camera specification [156]. A consumer RGB-D camera is not automatically a safety-rated device. Certified implementations still need a safety controller, defined failure modes, and usually a redundant sensing channel [3,33,153,155]. Surveys of industrial human-robot collaboration treat safety and the user interface as the two bottlenecks that decide whether a cobot is actually used, not whether a depth demo exists [3,152,154]. Collision detection on the arm itself remains necessary because vision cannot see inside the contact [153].</w:t>
       </w:r>
     </w:p>
     <w:p>
@@ -5563,7 +6232,7 @@
           <w:i w:val="0"/>
           <w:sz w:val="22"/>
         </w:rPr>
-        <w:t>Programming by demonstration. Tracking a tool or a marked workpiece in 3D lets a non-expert move the robot through a path [3,124]. Structured light at short range is usually sufficient. The hard parts are correspondence, occlusion by the operator, and converting a human demonstration into a collision-free, force-feasible program. Gesture and activity cues can distinguish a small set of commands or detect that a station is ready for the next part [3,16]. This is useful. It is not a substitute for a well-designed hardware enable switch.</w:t>
+        <w:t>Programming by demonstration. Tracking a tool or a marked workpiece in 3D lets a non-expert move the robot through a path [3,152]. Structured light at short range is usually sufficient. The hard parts are correspondence, occlusion by the operator, and converting a human demonstration into a collision-free, force-feasible program. Gesture and activity cues can distinguish a small set of commands or detect that a station is ready for the next part [3,16]. This is useful. It is not a substitute for a well-designed hardware enable switch.</w:t>
       </w:r>
     </w:p>
     <w:p>
@@ -5696,7 +6365,7 @@
           <w:i w:val="0"/>
           <w:sz w:val="22"/>
         </w:rPr>
-        <w:t>7. Budget calibration, time synchronization, and a warm-up interval as line items [35,42].</w:t>
+        <w:t>7. Budget calibration, time synchronization, and a warm-up interval as line items [35,46].</w:t>
       </w:r>
     </w:p>
     <w:p>
@@ -5711,7 +6380,7 @@
           <w:i w:val="0"/>
           <w:sz w:val="22"/>
         </w:rPr>
-        <w:t>8. Match the estimator to the cloud: TSDF for a table, VIO/VIDO for a room, LIO for a sparse outdoor scan [17,40,62].</w:t>
+        <w:t>8. Match the estimator to the cloud: TSDF for a table, VIO/VIDO for a room, LIO for a sparse outdoor scan [17,40,66].</w:t>
       </w:r>
     </w:p>
     <w:p>
@@ -5798,7 +6467,7 @@
           <w:i w:val="0"/>
           <w:sz w:val="22"/>
         </w:rPr>
-        <w:t>Environment and materials. NIR-based cameras saturate in sunlight [4,15]. Specular and transparent objects violate the single-bounce assumption and produce holes or biased ranges [7,48]. Coded and multi-frequency ToF can unmix some multipath, but they add capture time or hardware that a cheap module does not have [7,48]. Low-reflectance foam and black rubber starve the illuminator. Polarization, multi-frequency ToF, and radar fill-in help; none is universal. Comparative tests of ten indoor depth cameras remain the most useful reminder that material and lighting can reorder the ranking of otherwise similar devices [4].</w:t>
+        <w:t>Environment and materials. NIR-based cameras saturate in sunlight [4,15]. Specular and transparent objects violate the single-bounce assumption and produce holes or biased ranges [7,52]. Coded and multi-frequency ToF can unmix some multipath, but they add capture time or hardware that a cheap module does not have [7,52]. Low-reflectance foam and black rubber starve the illuminator. Polarization, multi-frequency ToF, and radar fill-in help; none is universal. Comparative tests of ten indoor depth cameras remain the most useful reminder that material and lighting can reorder the ranking of otherwise similar devices [4].</w:t>
       </w:r>
     </w:p>
     <w:p>
@@ -5814,7 +6483,7 @@
           <w:i w:val="0"/>
           <w:sz w:val="22"/>
         </w:rPr>
-        <w:t>Compute and power. Dense SLAM, TSDF fusion, and point-cloud networks are still expensive on a battery [1,21,75]. The illuminator, not only the GPU, shortens UAV endurance [2,21]. Event-based and neuromorphic pipelines are promising where the scene is sparse in time [28,116,128], but they require a different software stack.</w:t>
+        <w:t>Compute and power. Dense SLAM, TSDF fusion, and point-cloud networks are still expensive on a battery [1,21,83]. The illuminator, not only the GPU, shortens UAV endurance [2,21]. Event-based and neuromorphic pipelines are promising where the scene is sparse in time [28,142,157], but they require a different software stack.</w:t>
       </w:r>
     </w:p>
     <w:p>
@@ -5830,7 +6499,7 @@
           <w:i w:val="0"/>
           <w:sz w:val="22"/>
         </w:rPr>
-        <w:t>Calibration and time. Multi-sensor extrinsics drift with temperature and shock. A one-degree boresight error is negligible for a room-scale display and unacceptable for a 50 m LiDAR-camera fusion [10,57]. Online self-calibration exists in research estimators [62,79]; it is not yet a maintenance-free commodity. Asynchronous streams and sensor dropouts can make a naively fused estimate worse than the best single sensor [31,58].</w:t>
+        <w:t>Calibration and time. Multi-sensor extrinsics drift with temperature and shock. A one-degree boresight error is negligible for a room-scale display and unacceptable for a 50 m LiDAR-camera fusion [10,61]. Online self-calibration exists in research estimators [66,87]; it is not yet a maintenance-free commodity. Asynchronous streams and sensor dropouts can make a naively fused estimate worse than the best single sensor [31,62].</w:t>
       </w:r>
     </w:p>
     <w:p>
@@ -6083,7 +6752,7 @@
                 <w:i w:val="0"/>
                 <w:sz w:val="16"/>
               </w:rPr>
-              <w:t>Event + spiking co-design [28,129,130]</w:t>
+              <w:t>Event + spiking co-design [28,158,159]</w:t>
             </w:r>
           </w:p>
         </w:tc>
@@ -6325,7 +6994,7 @@
           <w:i w:val="0"/>
           <w:sz w:val="22"/>
         </w:rPr>
-        <w:t>Event-based and neuromorphic sensing. Asynchronous pixels report contrast changes at microsecond latency and high dynamic range [28,128,131]. Combined with pulsed illumination they can support low-power depth for high-speed robots [116,117,118,132,133]. Automotive work has already shown that event cameras can close a low-latency perception loop that frame cameras miss [134]. Co-design with spiking processors aims to cut the energy of spatial reasoning [129,130]. These systems will complement, not replace, frame-based RGB-D in the next product cycle.</w:t>
+        <w:t>Event-based and neuromorphic sensing. Asynchronous pixels report contrast changes at microsecond latency and high dynamic range [28,157,160]. Combined with pulsed illumination they can support low-power depth for high-speed robots [142,143,144,161,162]. Automotive work has already shown that event cameras can close a low-latency perception loop that frame cameras miss [163]. Co-design with spiking processors aims to cut the energy of spatial reasoning [158,159]. These systems will complement, not replace, frame-based RGB-D in the next product cycle.</w:t>
       </w:r>
     </w:p>
     <w:p>
@@ -6341,7 +7010,7 @@
           <w:i w:val="0"/>
           <w:sz w:val="22"/>
         </w:rPr>
-        <w:t>AI near the sensor. Depth completion and a first detection head are moving into image-signal processors and sensor stacks [12,21,70]. The engineering gain is bandwidth: a robot can ship a confidence-weighted cloud or a set of objects instead of a raw 30 Hz volume. The engineering risk is silent metric failure. Safety-related channels should keep a raw or lightly filtered range path.</w:t>
+        <w:t>AI near the sensor. Depth completion and a first detection head are moving into image-signal processors and sensor stacks [12,21,74]. The engineering gain is bandwidth: a robot can ship a confidence-weighted cloud or a set of objects instead of a raw 30 Hz volume. The engineering risk is silent metric failure. Safety-related channels should keep a raw or lightly filtered range path.</w:t>
       </w:r>
     </w:p>
     <w:p>
@@ -6357,7 +7026,7 @@
           <w:i w:val="0"/>
           <w:sz w:val="22"/>
         </w:rPr>
-        <w:t>Richer fusion. Depth-RGB-IMU is already standard. Adding millimetre-wave radar (fog, rain, radial velocity) and thermal cameras is the practical next step, already visible in automotive datasets [58,135]. The unsolved part is a fusion integrity layer: knowing when to stop trusting a modality.</w:t>
+        <w:t>Richer fusion. Depth-RGB-IMU is already standard. Adding millimetre-wave radar (fog, rain, radial velocity) and thermal cameras is the practical next step, already visible in automotive datasets [62,131]. The unsolved part is a fusion integrity layer: knowing when to stop trusting a modality.</w:t>
       </w:r>
     </w:p>
     <w:p>
@@ -6373,7 +7042,7 @@
           <w:i w:val="0"/>
           <w:sz w:val="22"/>
         </w:rPr>
-        <w:t>Photonics and materials. Metalenses and other flat optics can shrink camera modules [136]. Chip-scale optical phased arrays and MEMS-on-photonics LiDAR attack the scanner itself [53,54,55,56]. First-photon imaging and non-line-of-sight reconstructions show what is physically possible at extreme photon counts [137,138]. They are not yet bill-of-materials options for a warehouse AMR.</w:t>
+        <w:t>Photonics and materials. Metalenses and other flat optics can shrink camera modules [164]. Chip-scale optical phased arrays and MEMS-on-photonics LiDAR attack the scanner itself [57,58,59,60]. First-photon imaging and non-line-of-sight reconstructions show what is physically possible at extreme photon counts [165,166]. They are not yet bill-of-materials options for a warehouse AMR. Neural radiance fields and 3D Gaussian splatting are changing how a reconstructed scene is stored and rendered [167,168]. For a mechatronic stack they are still map representations, not replacements for a metric range channel that can stop a motor [108,109].</w:t>
       </w:r>
     </w:p>
     <w:p>
@@ -6449,7 +7118,7 @@
           <w:i w:val="0"/>
           <w:sz w:val="22"/>
         </w:rPr>
-        <w:t>For practitioners, the operational conclusion is conservative. Choose the sensor by operating envelope, not by marketing generation. Budget calibration and lighting as first-class design items. Keep a metric, low-level range channel whenever the output can stop a motor.</w:t>
+        <w:t>For practitioners, the operational conclusion is conservative. Choose the sensor by operating envelope, not by marketing generation. Budget calibration and lighting as first-class design items. Keep a metric, low-level range channel whenever the output can stop a motor. Treat public benchmarks as a map of where a method was tested, then re-test on the real surfaces, lighting, and safety integrity of the cell or airframe.</w:t>
       </w:r>
     </w:p>
     <w:p>
@@ -7216,7 +7885,7 @@
           <w:i w:val="0"/>
           <w:sz w:val="20"/>
         </w:rPr>
-        <w:t>[41] Smisek J, Jancosek M, Pajdla T. 3D with Kinect. In: IEEE International Conference on Computer Vision Workshops (ICCVW); 2011. p. 1154-1160. doi:10.1109/ICCVW.2011.6130380</w:t>
+        <w:t>[41] Shan T, Englot B, Ratti C, Rus D. LVI-SAM: Tightly-coupled lidar-visual-inertial odometry via smoothing and mapping. In: IEEE International Conference on Robotics and Automation (ICRA); 2021. p. 5692-5698. doi:10.1109/ICRA48506.2021.9561996</w:t>
       </w:r>
     </w:p>
     <w:p>
@@ -7231,7 +7900,7 @@
           <w:i w:val="0"/>
           <w:sz w:val="20"/>
         </w:rPr>
-        <w:t>[42] Herrera C D, Kannala J, Heikkila J. Joint depth and color camera calibration with distortion correction. IEEE Transactions on Pattern Analysis and Machine Intelligence. 2012;34(10):2058-2064. doi:10.1109/TPAMI.2012.125</w:t>
+        <w:t>[42] Salvi J, Fernandez S, Pribanic T, Llado X. A state of the art in structured light patterns for surface profilometry. Pattern Recognition. 2010;43(8):2666-2680. doi:10.1016/j.patcog.2010.01.003</w:t>
       </w:r>
     </w:p>
     <w:p>
@@ -7246,7 +7915,7 @@
           <w:i w:val="0"/>
           <w:sz w:val="20"/>
         </w:rPr>
-        <w:t>[43] Lange R, Seitz P. Solid-state time-of-flight range camera. IEEE Journal of Quantum Electronics. 2001;37(3):390-397. doi:10.1109/3.910448</w:t>
+        <w:t>[43] Zhang S. Absolute phase retrieval methods for digital fringe projection profilometry: A review. Optics and Lasers in Engineering. 2018;107:28-37. doi:10.1016/j.optlaseng.2018.03.003</w:t>
       </w:r>
     </w:p>
     <w:p>
@@ -7261,7 +7930,7 @@
           <w:i w:val="0"/>
           <w:sz w:val="20"/>
         </w:rPr>
-        <w:t>[44] Niclass C, Soga M, Kato S, Matsubara H, Kagami M. A 0.18-um CMOS SoC for a 100-m-range 10-frame/s 200 x 96-pixel time-of-flight depth sensor. IEEE Journal of Solid-State Circuits. 2013;48(2):559-572. doi:10.1109/JSSC.2012.2227607</w:t>
+        <w:t>[44] Su X, Chen W. Fourier transform profilometry: a review. Optics and Lasers in Engineering. 2001;35(5):263-284. doi:10.1016/S0143-8166(01)00023-9</w:t>
       </w:r>
     </w:p>
     <w:p>
@@ -7276,7 +7945,7 @@
           <w:i w:val="0"/>
           <w:sz w:val="20"/>
         </w:rPr>
-        <w:t>[45] Lachat E, Macher H, Landes T, Grussenmeyer P. Assessment and calibration of a RGB-D camera (Kinect v2 sensor) towards a potential use for close-range 3D modeling. Remote Sensing. 2015;7(10):13070-13097. doi:10.3390/rs71013070</w:t>
+        <w:t>[45] Smisek J, Jancosek M, Pajdla T. 3D with Kinect. In: IEEE International Conference on Computer Vision Workshops (ICCVW); 2011. p. 1154-1160. doi:10.1109/ICCVW.2011.6130380</w:t>
       </w:r>
     </w:p>
     <w:p>
@@ -7291,7 +7960,7 @@
           <w:i w:val="0"/>
           <w:sz w:val="20"/>
         </w:rPr>
-        <w:t>[46] Pagliari D, Pinto L. Calibration of Kinect for Xbox One and comparison between the two generations of Microsoft sensors. Sensors. 2015;15(11):27569-27589. doi:10.3390/s151127569</w:t>
+        <w:t>[46] Herrera C D, Kannala J, Heikkila J. Joint depth and color camera calibration with distortion correction. IEEE Transactions on Pattern Analysis and Machine Intelligence. 2012;34(10):2058-2064. doi:10.1109/TPAMI.2012.125</w:t>
       </w:r>
     </w:p>
     <w:p>
@@ -7306,7 +7975,7 @@
           <w:i w:val="0"/>
           <w:sz w:val="20"/>
         </w:rPr>
-        <w:t>[47] Wasenmuller O, Stricker D. Comparison of Kinect v1 and v2 depth images in terms of accuracy and precision. In: Computer Vision - ACCV 2016 Workshops. Springer; 2017. p. 34-45. doi:10.1007/978-3-319-54427-4_3</w:t>
+        <w:t>[47] Lange R, Seitz P. Solid-state time-of-flight range camera. IEEE Journal of Quantum Electronics. 2001;37(3):390-397. doi:10.1109/3.910448</w:t>
       </w:r>
     </w:p>
     <w:p>
@@ -7321,7 +7990,7 @@
           <w:i w:val="0"/>
           <w:sz w:val="20"/>
         </w:rPr>
-        <w:t>[48] Kadambi A, Whyte R, Bhandari A, Streeter L, Barsi C, Dorrington A, Raskar R. Coded time of flight cameras: sparse deconvolution to address multipath interference and recover time profiles. ACM Transactions on Graphics. 2013;32(6):167. doi:10.1145/2508363.2508428</w:t>
+        <w:t>[48] Niclass C, Soga M, Kato S, Matsubara H, Kagami M. A 0.18-um CMOS SoC for a 100-m-range 10-frame/s 200 x 96-pixel time-of-flight depth sensor. IEEE Journal of Solid-State Circuits. 2013;48(2):559-572. doi:10.1109/JSSC.2012.2227607</w:t>
       </w:r>
     </w:p>
     <w:p>
@@ -7336,7 +8005,7 @@
           <w:i w:val="0"/>
           <w:sz w:val="20"/>
         </w:rPr>
-        <w:t>[49] Royo S, Ballesta-Garcia M. An overview of lidar imaging systems for autonomous vehicles. Applied Sciences. 2019;9(19):4093. doi:10.3390/app9194093</w:t>
+        <w:t>[49] Lachat E, Macher H, Landes T, Grussenmeyer P. Assessment and calibration of a RGB-D camera (Kinect v2 sensor) towards a potential use for close-range 3D modeling. Remote Sensing. 2015;7(10):13070-13097. doi:10.3390/rs71013070</w:t>
       </w:r>
     </w:p>
     <w:p>
@@ -7351,7 +8020,7 @@
           <w:i w:val="0"/>
           <w:sz w:val="20"/>
         </w:rPr>
-        <w:t>[50] Behroozpour B, Sandborn PAM, Wu MC, Boser BE. Lidar system architectures and circuits. IEEE Communications Magazine. 2017;55(10):135-142. doi:10.1109/MCOM.2017.1700030</w:t>
+        <w:t>[50] Pagliari D, Pinto L. Calibration of Kinect for Xbox One and comparison between the two generations of Microsoft sensors. Sensors. 2015;15(11):27569-27589. doi:10.3390/s151127569</w:t>
       </w:r>
     </w:p>
     <w:p>
@@ -7366,7 +8035,7 @@
           <w:i w:val="0"/>
           <w:sz w:val="20"/>
         </w:rPr>
-        <w:t>[51] Kim I, Martins RJ, Jang J, Badloe T, Khadir S, Jung HY, Kim H, Kim J, Genevet P, Rho J. Nanophotonics for light detection and ranging technology. Nature Nanotechnology. 2021;16:508-524. doi:10.1038/s41565-021-00895-3</w:t>
+        <w:t>[51] Wasenmuller O, Stricker D. Comparison of Kinect v1 and v2 depth images in terms of accuracy and precision. In: Computer Vision - ACCV 2016 Workshops. Springer; 2017. p. 34-45. doi:10.1007/978-3-319-54427-4_3</w:t>
       </w:r>
     </w:p>
     <w:p>
@@ -7381,7 +8050,7 @@
           <w:i w:val="0"/>
           <w:sz w:val="20"/>
         </w:rPr>
-        <w:t>[52] Park J, Jeong BG, Kim SI, Lee D, Kim J, Shin C, Lee CB, Otsuka T, Kyoung J, Kim S, Yang KY, Park YY, Lee J, Hwang I, Jang J, Song SH, Brongersma ML, Ha K, Hwang SW, Choo H, Choi BL. All-solid-state spatial light modulator with independent phase and amplitude control for three-dimensional LiDAR applications. Nature Nanotechnology. 2021;16:69-76. doi:10.1038/s41565-020-00787-y</w:t>
+        <w:t>[52] Kadambi A, Whyte R, Bhandari A, Streeter L, Barsi C, Dorrington A, Raskar R. Coded time of flight cameras: sparse deconvolution to address multipath interference and recover time profiles. ACM Transactions on Graphics. 2013;32(6):167. doi:10.1145/2508363.2508428</w:t>
       </w:r>
     </w:p>
     <w:p>
@@ -7396,7 +8065,7 @@
           <w:i w:val="0"/>
           <w:sz w:val="20"/>
         </w:rPr>
-        <w:t>[53] Sun J, Timurdogan E, Yaacobi A, Hosseini ES, Watts MR. Large-scale nanophotonic phased array. Nature. 2013;493:195-199. doi:10.1038/nature11727</w:t>
+        <w:t>[53] Royo S, Ballesta-Garcia M. An overview of lidar imaging systems for autonomous vehicles. Applied Sciences. 2019;9(19):4093. doi:10.3390/app9194093</w:t>
       </w:r>
     </w:p>
     <w:p>
@@ -7411,7 +8080,7 @@
           <w:i w:val="0"/>
           <w:sz w:val="20"/>
         </w:rPr>
-        <w:t>[54] Poulton CV, Yaacobi A, Cole DB, Byrd MJ, Raval M, Vermeulen D, Watts MR. Coherent solid-state LIDAR with silicon photonic optical phased arrays. Optics Letters. 2017;42(20):4091-4094. doi:10.1364/OL.42.004091</w:t>
+        <w:t>[54] Behroozpour B, Sandborn PAM, Wu MC, Boser BE. Lidar system architectures and circuits. IEEE Communications Magazine. 2017;55(10):135-142. doi:10.1109/MCOM.2017.1700030</w:t>
       </w:r>
     </w:p>
     <w:p>
@@ -7426,7 +8095,7 @@
           <w:i w:val="0"/>
           <w:sz w:val="20"/>
         </w:rPr>
-        <w:t>[55] Zhang X, Kwon K, Henriksson J, Luo J, Wu MC. A large-scale microelectromechanical-systems-based silicon photonic LiDAR. Nature. 2022;603:253-258. doi:10.1038/s41586-022-04415-8</w:t>
+        <w:t>[55] Kim I, Martins RJ, Jang J, Badloe T, Khadir S, Jung HY, Kim H, Kim J, Genevet P, Rho J. Nanophotonics for light detection and ranging technology. Nature Nanotechnology. 2021;16:508-524. doi:10.1038/s41565-021-00895-3</w:t>
       </w:r>
     </w:p>
     <w:p>
@@ -7441,7 +8110,7 @@
           <w:i w:val="0"/>
           <w:sz w:val="20"/>
         </w:rPr>
-        <w:t>[56] Hsu CP, Li B, Solano-Rivas B, Gohil AR, Chan PH, Moore AD, Donzella V. A review and perspective on optical phased array for automotive LiDAR. IEEE Journal of Selected Topics in Quantum Electronics. 2021;27(1):8300416. doi:10.1109/JSTQE.2020.3022948</w:t>
+        <w:t>[56] Park J, Jeong BG, Kim SI, Lee D, Kim J, Shin C, Lee CB, Otsuka T, Kyoung J, Kim S, Yang KY, Park YY, Lee J, Hwang I, Jang J, Song SH, Brongersma ML, Ha K, Hwang SW, Choo H, Choi BL. All-solid-state spatial light modulator with independent phase and amplitude control for three-dimensional LiDAR applications. Nature Nanotechnology. 2021;16:69-76. doi:10.1038/s41565-020-00787-y</w:t>
       </w:r>
     </w:p>
     <w:p>
@@ -7456,7 +8125,7 @@
           <w:i w:val="0"/>
           <w:sz w:val="20"/>
         </w:rPr>
-        <w:t>[57] Debeunne C, Vivet D. A review of visual-LiDAR fusion based simultaneous localization and mapping. Sensors. 2020;20(7):2068. doi:10.3390/s20072068</w:t>
+        <w:t>[57] Sun J, Timurdogan E, Yaacobi A, Hosseini ES, Watts MR. Large-scale nanophotonic phased array. Nature. 2013;493:195-199. doi:10.1038/nature11727</w:t>
       </w:r>
     </w:p>
     <w:p>
@@ -7471,7 +8140,7 @@
           <w:i w:val="0"/>
           <w:sz w:val="20"/>
         </w:rPr>
-        <w:t>[58] Yeong DJ, Velasco-Hernandez G, Barry J, Walsh J. Sensor and sensor fusion technology in autonomous vehicles: A review. Sensors. 2021;21(6):2140. doi:10.3390/s21062140</w:t>
+        <w:t>[58] Poulton CV, Yaacobi A, Cole DB, Byrd MJ, Raval M, Vermeulen D, Watts MR. Coherent solid-state LIDAR with silicon photonic optical phased arrays. Optics Letters. 2017;42(20):4091-4094. doi:10.1364/OL.42.004091</w:t>
       </w:r>
     </w:p>
     <w:p>
@@ -7486,7 +8155,7 @@
           <w:i w:val="0"/>
           <w:sz w:val="20"/>
         </w:rPr>
-        <w:t>[59] Correll N, Bekris KE, Berenson D, Brock O, Causo A, Hauser K, Okada K, Rodriguez A, Romano JM, Wurman PR. Analysis and observations from the first Amazon Picking Challenge. IEEE Transactions on Automation Science and Engineering. 2018;15(1):172-188. doi:10.1109/TASE.2016.2600527</w:t>
+        <w:t>[59] Zhang X, Kwon K, Henriksson J, Luo J, Wu MC. A large-scale microelectromechanical-systems-based silicon photonic LiDAR. Nature. 2022;603:253-258. doi:10.1038/s41586-022-04415-8</w:t>
       </w:r>
     </w:p>
     <w:p>
@@ -7501,7 +8170,7 @@
           <w:i w:val="0"/>
           <w:sz w:val="20"/>
         </w:rPr>
-        <w:t>[60] ten Pas A, Gualtieri M, Saenko K, Platt R. Grasp pose detection in point clouds. The International Journal of Robotics Research. 2017;36(13-14):1455-1473. doi:10.1177/0278364917735594</w:t>
+        <w:t>[60] Hsu CP, Li B, Solano-Rivas B, Gohil AR, Chan PH, Moore AD, Donzella V. A review and perspective on optical phased array for automotive LiDAR. IEEE Journal of Selected Topics in Quantum Electronics. 2021;27(1):8300416. doi:10.1109/JSTQE.2020.3022948</w:t>
       </w:r>
     </w:p>
     <w:p>
@@ -7516,7 +8185,7 @@
           <w:i w:val="0"/>
           <w:sz w:val="20"/>
         </w:rPr>
-        <w:t>[61] Fankhauser P, Bloesch M, Rodriguez D, Kaestner R, Hutter M, Siegwart R. Kinect v2 for mobile robot navigation: Evaluation and modeling. In: International Conference on Advanced Robotics (ICAR); 2015. p. 388-394. doi:10.1109/ICAR.2015.7251485</w:t>
+        <w:t>[61] Debeunne C, Vivet D. A review of visual-LiDAR fusion based simultaneous localization and mapping. Sensors. 2020;20(7):2068. doi:10.3390/s20072068</w:t>
       </w:r>
     </w:p>
     <w:p>
@@ -7531,7 +8200,7 @@
           <w:i w:val="0"/>
           <w:sz w:val="20"/>
         </w:rPr>
-        <w:t>[62] Campos C, Elvira R, Rodriguez JJG, Montiel JMM, Tardos JD. ORB-SLAM3: An accurate open-source library for visual, visual-inertial, and multimap SLAM. IEEE Transactions on Robotics. 2021;37(6):1874-1890. doi:10.1109/TRO.2021.3075644</w:t>
+        <w:t>[62] Yeong DJ, Velasco-Hernandez G, Barry J, Walsh J. Sensor and sensor fusion technology in autonomous vehicles: A review. Sensors. 2021;21(6):2140. doi:10.3390/s21062140</w:t>
       </w:r>
     </w:p>
     <w:p>
@@ -7546,7 +8215,7 @@
           <w:i w:val="0"/>
           <w:sz w:val="20"/>
         </w:rPr>
-        <w:t>[63] Spencer BF Jr, Hoskere V, Narazaki Y. Advances in computer vision-based civil infrastructure inspection and monitoring. Engineering. 2019;5(2):199-222. doi:10.1016/j.eng.2018.11.030</w:t>
+        <w:t>[63] Correll N, Bekris KE, Berenson D, Brock O, Causo A, Hauser K, Okada K, Rodriguez A, Romano JM, Wurman PR. Analysis and observations from the first Amazon Picking Challenge. IEEE Transactions on Automation Science and Engineering. 2018;15(1):172-188. doi:10.1109/TASE.2016.2600527</w:t>
       </w:r>
     </w:p>
     <w:p>
@@ -7561,7 +8230,7 @@
           <w:i w:val="0"/>
           <w:sz w:val="20"/>
         </w:rPr>
-        <w:t>[64] Carfagni M, Furferi R, Governi L, Servi M, Uccheddu F, Volpe Y. On the performance of the Intel SR300 depth camera: metrological and critical characterization. IEEE Sensors Journal. 2017;17(14):4508-4519. doi:10.1109/JSEN.2017.2703829</w:t>
+        <w:t>[64] ten Pas A, Gualtieri M, Saenko K, Platt R. Grasp pose detection in point clouds. The International Journal of Robotics Research. 2017;36(13-14):1455-1473. doi:10.1177/0278364917735594</w:t>
       </w:r>
     </w:p>
     <w:p>
@@ -7576,7 +8245,7 @@
           <w:i w:val="0"/>
           <w:sz w:val="20"/>
         </w:rPr>
-        <w:t>[65] Kopf J, Cohen MF, Lischinski D, Uyttendaele M. Joint bilateral upsampling. ACM Transactions on Graphics. 2007;26(3):96. doi:10.1145/1276377.1276497</w:t>
+        <w:t>[65] Fankhauser P, Bloesch M, Rodriguez D, Kaestner R, Hutter M, Siegwart R. Kinect v2 for mobile robot navigation: Evaluation and modeling. In: International Conference on Advanced Robotics (ICAR); 2015. p. 388-394. doi:10.1109/ICAR.2015.7251485</w:t>
       </w:r>
     </w:p>
     <w:p>
@@ -7591,7 +8260,7 @@
           <w:i w:val="0"/>
           <w:sz w:val="20"/>
         </w:rPr>
-        <w:t>[66] Silberman N, Hoiem D, Kohli P, Fergus R. Indoor segmentation and support inference from RGBD images. In: Computer Vision - ECCV 2012. Springer; 2012. p. 746-760. doi:10.1007/978-3-642-33715-4_54</w:t>
+        <w:t>[66] Campos C, Elvira R, Rodriguez JJG, Montiel JMM, Tardos JD. ORB-SLAM3: An accurate open-source library for visual, visual-inertial, and multimap SLAM. IEEE Transactions on Robotics. 2021;37(6):1874-1890. doi:10.1109/TRO.2021.3075644</w:t>
       </w:r>
     </w:p>
     <w:p>
@@ -7606,7 +8275,7 @@
           <w:i w:val="0"/>
           <w:sz w:val="20"/>
         </w:rPr>
-        <w:t>[67] Laina I, Rupprecht C, Belagiannis V, Tombari F, Navab N. Deeper depth prediction with fully convolutional residual networks. In: International Conference on 3D Vision (3DV); 2016. p. 239-248. doi:10.1109/3DV.2016.32</w:t>
+        <w:t>[67] Spencer BF Jr, Hoskere V, Narazaki Y. Advances in computer vision-based civil infrastructure inspection and monitoring. Engineering. 2019;5(2):199-222. doi:10.1016/j.eng.2018.11.030</w:t>
       </w:r>
     </w:p>
     <w:p>
@@ -7621,7 +8290,7 @@
           <w:i w:val="0"/>
           <w:sz w:val="20"/>
         </w:rPr>
-        <w:t>[68] Godard C, Mac Aodha O, Firman M, Brostow GJ. Digging into self-supervised monocular depth estimation. In: Proceedings of the IEEE/CVF International Conference on Computer Vision (ICCV); 2019. p. 3828-3838. doi:10.1109/ICCV.2019.00393</w:t>
+        <w:t>[68] Carfagni M, Furferi R, Governi L, Servi M, Uccheddu F, Volpe Y. On the performance of the Intel SR300 depth camera: metrological and critical characterization. IEEE Sensors Journal. 2017;17(14):4508-4519. doi:10.1109/JSEN.2017.2703829</w:t>
       </w:r>
     </w:p>
     <w:p>
@@ -7636,7 +8305,7 @@
           <w:i w:val="0"/>
           <w:sz w:val="20"/>
         </w:rPr>
-        <w:t>[69] Uhrig J, Schneider N, Schneider L, Franke U, Brox T, Geiger A. Sparsity invariant CNNs. In: International Conference on 3D Vision (3DV); 2017. p. 11-20. doi:10.1109/3DV.2017.00012</w:t>
+        <w:t>[69] Kopf J, Cohen MF, Lischinski D, Uyttendaele M. Joint bilateral upsampling. ACM Transactions on Graphics. 2007;26(3):96. doi:10.1145/1276377.1276497</w:t>
       </w:r>
     </w:p>
     <w:p>
@@ -7651,7 +8320,7 @@
           <w:i w:val="0"/>
           <w:sz w:val="20"/>
         </w:rPr>
-        <w:t>[70] Ma F, Karaman S. Sparse-to-dense: Depth prediction from sparse depth samples and a single image. In: IEEE International Conference on Robotics and Automation (ICRA); 2018. p. 4796-4803. doi:10.1109/ICRA.2018.8460184</w:t>
+        <w:t>[70] Silberman N, Hoiem D, Kohli P, Fergus R. Indoor segmentation and support inference from RGBD images. In: Computer Vision - ECCV 2012. Springer; 2012. p. 746-760. doi:10.1007/978-3-642-33715-4_54</w:t>
       </w:r>
     </w:p>
     <w:p>
@@ -7666,7 +8335,7 @@
           <w:i w:val="0"/>
           <w:sz w:val="20"/>
         </w:rPr>
-        <w:t>[71] Zhang Y, Funkhouser T. Deep depth completion of a single RGB-D image. In: Proceedings of the IEEE Conference on Computer Vision and Pattern Recognition (CVPR); 2018. p. 175-185.</w:t>
+        <w:t>[71] Laina I, Rupprecht C, Belagiannis V, Tombari F, Navab N. Deeper depth prediction with fully convolutional residual networks. In: International Conference on 3D Vision (3DV); 2016. p. 239-248. doi:10.1109/3DV.2016.32</w:t>
       </w:r>
     </w:p>
     <w:p>
@@ -7681,7 +8350,7 @@
           <w:i w:val="0"/>
           <w:sz w:val="20"/>
         </w:rPr>
-        <w:t>[72] Cheng X, Wang P, Yang R. Depth estimation via affinity learned with convolutional spatial propagation network. In: Proceedings of the IEEE Conference on Computer Vision and Pattern Recognition (CVPR); 2018. p. 5736-5744.</w:t>
+        <w:t>[72] Godard C, Mac Aodha O, Firman M, Brostow GJ. Digging into self-supervised monocular depth estimation. In: Proceedings of the IEEE/CVF International Conference on Computer Vision (ICCV); 2019. p. 3828-3838. doi:10.1109/ICCV.2019.00393</w:t>
       </w:r>
     </w:p>
     <w:p>
@@ -7696,7 +8365,7 @@
           <w:i w:val="0"/>
           <w:sz w:val="20"/>
         </w:rPr>
-        <w:t>[73] Park J, Joo K, Hu Z, Liu CK, Kweon IS. Non-local spatial propagation network for depth completion. In: Computer Vision - ECCV 2020. Springer; 2020. p. 120-136. doi:10.1007/978-3-030-58601-0_8</w:t>
+        <w:t>[73] Uhrig J, Schneider N, Schneider L, Franke U, Brox T, Geiger A. Sparsity invariant CNNs. In: International Conference on 3D Vision (3DV); 2017. p. 11-20. doi:10.1109/3DV.2017.00012</w:t>
       </w:r>
     </w:p>
     <w:p>
@@ -7711,7 +8380,7 @@
           <w:i w:val="0"/>
           <w:sz w:val="20"/>
         </w:rPr>
-        <w:t>[74] Qiu J, Cui Z, Zhang Y, Zhang X, Liu S, Zeng B, Pollefeys M. DeepLiDAR: Deep surface normal guided depth prediction for outdoor scene from sparse LiDAR data and single color image. In: Proceedings of the IEEE/CVF Conference on Computer Vision and Pattern Recognition (CVPR); 2019. p. 3313-3322.</w:t>
+        <w:t>[74] Ma F, Karaman S. Sparse-to-dense: Depth prediction from sparse depth samples and a single image. In: IEEE International Conference on Robotics and Automation (ICRA); 2018. p. 4796-4803. doi:10.1109/ICRA.2018.8460184</w:t>
       </w:r>
     </w:p>
     <w:p>
@@ -7726,7 +8395,7 @@
           <w:i w:val="0"/>
           <w:sz w:val="20"/>
         </w:rPr>
-        <w:t>[75] Guo Y, Wang H, Hu Q, Liu H, Liu L, Bennamoun M. Deep learning for 3D point clouds: A survey. IEEE Transactions on Pattern Analysis and Machine Intelligence. 2021;43(12):4338-4364. doi:10.1109/TPAMI.2020.3005434</w:t>
+        <w:t>[75] Zhang Y, Funkhouser T. Deep depth completion of a single RGB-D image. In: Proceedings of the IEEE Conference on Computer Vision and Pattern Recognition (CVPR); 2018. p. 175-185.</w:t>
       </w:r>
     </w:p>
     <w:p>
@@ -7741,7 +8410,7 @@
           <w:i w:val="0"/>
           <w:sz w:val="20"/>
         </w:rPr>
-        <w:t>[76] Lynen S, Achtelik MW, Weiss S, Chli M, Siegwart R. A robust and modular multi-sensor fusion approach applied to MAV navigation. In: IEEE/RSJ International Conference on Intelligent Robots and Systems (IROS); 2013. p. 3923-3929. doi:10.1109/IROS.2013.6696917</w:t>
+        <w:t>[76] Cheng X, Wang P, Yang R. Depth estimation via affinity learned with convolutional spatial propagation network. In: Proceedings of the IEEE Conference on Computer Vision and Pattern Recognition (CVPR); 2018. p. 5736-5744.</w:t>
       </w:r>
     </w:p>
     <w:p>
@@ -7756,7 +8425,7 @@
           <w:i w:val="0"/>
           <w:sz w:val="20"/>
         </w:rPr>
-        <w:t>[77] Leutenegger S, Lynen S, Bosse M, Siegwart R, Furgale P. Keyframe-based visual-inertial odometry using nonlinear optimization. The International Journal of Robotics Research. 2015;34(3):314-334. doi:10.1177/0278364914554813</w:t>
+        <w:t>[77] Park J, Joo K, Hu Z, Liu CK, Kweon IS. Non-local spatial propagation network for depth completion. In: Computer Vision - ECCV 2020. Springer; 2020. p. 120-136. doi:10.1007/978-3-030-58601-0_8</w:t>
       </w:r>
     </w:p>
     <w:p>
@@ -7771,7 +8440,7 @@
           <w:i w:val="0"/>
           <w:sz w:val="20"/>
         </w:rPr>
-        <w:t>[78] Forster C, Carlone L, Dellaert F, Scaramuzza D. On-manifold preintegration for real-time visual-inertial odometry. IEEE Transactions on Robotics. 2017;33(1):1-21. doi:10.1109/TRO.2016.2597321</w:t>
+        <w:t>[78] Qiu J, Cui Z, Zhang Y, Zhang X, Liu S, Zeng B, Pollefeys M. DeepLiDAR: Deep surface normal guided depth prediction for outdoor scene from sparse LiDAR data and single color image. In: Proceedings of the IEEE/CVF Conference on Computer Vision and Pattern Recognition (CVPR); 2019. p. 3313-3322.</w:t>
       </w:r>
     </w:p>
     <w:p>
@@ -7786,7 +8455,7 @@
           <w:i w:val="0"/>
           <w:sz w:val="20"/>
         </w:rPr>
-        <w:t>[79] Qin T, Li P, Shen S. VINS-Mono: A robust and versatile monocular visual-inertial state estimator. IEEE Transactions on Robotics. 2018;34(4):1004-1020. doi:10.1109/TRO.2018.2853729</w:t>
+        <w:t>[79] Dai A, Chang AX, Savva M, Halber M, Funkhouser T, Niessner M. ScanNet: Richly-annotated 3D reconstructions of indoor scenes. In: Proceedings of the IEEE Conference on Computer Vision and Pattern Recognition (CVPR); 2017. p. 2432-2443. doi:10.1109/CVPR.2017.261</w:t>
       </w:r>
     </w:p>
     <w:p>
@@ -7801,7 +8470,7 @@
           <w:i w:val="0"/>
           <w:sz w:val="20"/>
         </w:rPr>
-        <w:t>[80] Bloesch M, Omari S, Hutter M, Siegwart R. Robust visual inertial odometry using a direct EKF-based approach. In: IEEE/RSJ International Conference on Intelligent Robots and Systems (IROS); 2015. p. 298-304. doi:10.1109/IROS.2015.7353389</w:t>
+        <w:t>[80] Chang A, Dai A, Funkhouser T, Halber M, Niessner M, Savva M, Song S, Zeng A, Zhang Y. Matterport3D: Learning from RGB-D data in indoor environments. In: International Conference on 3D Vision (3DV); 2017. p. 667-676. doi:10.1109/3DV.2017.00081</w:t>
       </w:r>
     </w:p>
     <w:p>
@@ -7816,7 +8485,7 @@
           <w:i w:val="0"/>
           <w:sz w:val="20"/>
         </w:rPr>
-        <w:t>[81] Huang G. Visual-inertial navigation: A concise review. In: IEEE International Conference on Robotics and Automation (ICRA); 2019. p. 9572-9582. doi:10.1109/ICRA.2019.8793604</w:t>
+        <w:t>[81] Geiger A, Lenz P, Urtasun R. Are we ready for autonomous driving? The KITTI vision benchmark suite. In: Proceedings of the IEEE Conference on Computer Vision and Pattern Recognition (CVPR); 2012. p. 3354-3361. doi:10.1109/CVPR.2012.6248074</w:t>
       </w:r>
     </w:p>
     <w:p>
@@ -7831,7 +8500,7 @@
           <w:i w:val="0"/>
           <w:sz w:val="20"/>
         </w:rPr>
-        <w:t>[82] Geneva P, Eckenhoff K, Lee W, Yang Y, Huang G. OpenVINS: A research platform for visual-inertial estimation. In: IEEE/RSJ International Conference on Intelligent Robots and Systems (IROS); 2020. p. 4666-4673.</w:t>
+        <w:t>[82] Geiger A, Lenz P, Stiller C, Urtasun R. Vision meets robotics: The KITTI dataset. The International Journal of Robotics Research. 2013;32(11):1231-1237. doi:10.1177/0278364913491297</w:t>
       </w:r>
     </w:p>
     <w:p>
@@ -7846,7 +8515,7 @@
           <w:i w:val="0"/>
           <w:sz w:val="20"/>
         </w:rPr>
-        <w:t>[83] Whelan T, Leutenegger S, Salas-Moreno RF, Glocker B, Davison AJ. ElasticFusion: Dense SLAM without a pose graph. In: Robotics: Science and Systems; 2015. doi:10.15607/RSS.2015.XI.001</w:t>
+        <w:t>[83] Guo Y, Wang H, Hu Q, Liu H, Liu L, Bennamoun M. Deep learning for 3D point clouds: A survey. IEEE Transactions on Pattern Analysis and Machine Intelligence. 2021;43(12):4338-4364. doi:10.1109/TPAMI.2020.3005434</w:t>
       </w:r>
     </w:p>
     <w:p>
@@ -7861,7 +8530,7 @@
           <w:i w:val="0"/>
           <w:sz w:val="20"/>
         </w:rPr>
-        <w:t>[84] Dai A, Niessner M, Zollhofer M, Izadi S, Theobalt C. BundleFusion: Real-time globally consistent 3D reconstruction using on-the-fly surface reintegration. ACM Transactions on Graphics. 2017;36(4):76a. doi:10.1145/3072959.3073615</w:t>
+        <w:t>[84] Lynen S, Achtelik MW, Weiss S, Chli M, Siegwart R. A robust and modular multi-sensor fusion approach applied to MAV navigation. In: IEEE/RSJ International Conference on Intelligent Robots and Systems (IROS); 2013. p. 3923-3929. doi:10.1109/IROS.2013.6696917</w:t>
       </w:r>
     </w:p>
     <w:p>
@@ -7876,7 +8545,7 @@
           <w:i w:val="0"/>
           <w:sz w:val="20"/>
         </w:rPr>
-        <w:t>[85] Endres F, Hess J, Sturm J, Cremers D, Burgard W. 3-D mapping with an RGB-D camera. IEEE Transactions on Robotics. 2014;30(1):177-187. doi:10.1109/TRO.2013.2279412</w:t>
+        <w:t>[85] Leutenegger S, Lynen S, Bosse M, Siegwart R, Furgale P. Keyframe-based visual-inertial odometry using nonlinear optimization. The International Journal of Robotics Research. 2015;34(3):314-334. doi:10.1177/0278364914554813</w:t>
       </w:r>
     </w:p>
     <w:p>
@@ -7891,7 +8560,7 @@
           <w:i w:val="0"/>
           <w:sz w:val="20"/>
         </w:rPr>
-        <w:t>[86] Sturm J, Engelhard N, Endres F, Burgard W, Cremers D. A benchmark for the evaluation of RGB-D SLAM systems. In: IEEE/RSJ International Conference on Intelligent Robots and Systems (IROS); 2012. p. 573-580. doi:10.1109/IROS.2012.6385773</w:t>
+        <w:t>[86] Forster C, Carlone L, Dellaert F, Scaramuzza D. On-manifold preintegration for real-time visual-inertial odometry. IEEE Transactions on Robotics. 2017;33(1):1-21. doi:10.1109/TRO.2016.2597321</w:t>
       </w:r>
     </w:p>
     <w:p>
@@ -7906,7 +8575,7 @@
           <w:i w:val="0"/>
           <w:sz w:val="20"/>
         </w:rPr>
-        <w:t>[87] Kerl C, Sturm J, Cremers D. Dense visual SLAM for RGB-D cameras. In: IEEE/RSJ International Conference on Intelligent Robots and Systems (IROS); 2013. p. 2100-2106. doi:10.1109/IROS.2013.6696650</w:t>
+        <w:t>[87] Qin T, Li P, Shen S. VINS-Mono: A robust and versatile monocular visual-inertial state estimator. IEEE Transactions on Robotics. 2018;34(4):1004-1020. doi:10.1109/TRO.2018.2853729</w:t>
       </w:r>
     </w:p>
     <w:p>
@@ -7921,7 +8590,7 @@
           <w:i w:val="0"/>
           <w:sz w:val="20"/>
         </w:rPr>
-        <w:t>[88] Mur-Artal R, Montiel JMM, Tardos JD. ORB-SLAM: A versatile and accurate monocular SLAM system. IEEE Transactions on Robotics. 2015;31(5):1147-1163. doi:10.1109/TRO.2015.2463671</w:t>
+        <w:t>[88] Bloesch M, Omari S, Hutter M, Siegwart R. Robust visual inertial odometry using a direct EKF-based approach. In: IEEE/RSJ International Conference on Intelligent Robots and Systems (IROS); 2015. p. 298-304. doi:10.1109/IROS.2015.7353389</w:t>
       </w:r>
     </w:p>
     <w:p>
@@ -7936,7 +8605,7 @@
           <w:i w:val="0"/>
           <w:sz w:val="20"/>
         </w:rPr>
-        <w:t>[89] Mur-Artal R, Tardos JD. ORB-SLAM2: An open-source SLAM system for monocular, stereo, and RGB-D cameras. IEEE Transactions on Robotics. 2017;33(5):1255-1262. doi:10.1109/TRO.2017.2705103</w:t>
+        <w:t>[89] Huang G. Visual-inertial navigation: A concise review. In: IEEE International Conference on Robotics and Automation (ICRA); 2019. p. 9572-9582. doi:10.1109/ICRA.2019.8793604</w:t>
       </w:r>
     </w:p>
     <w:p>
@@ -7951,7 +8620,7 @@
           <w:i w:val="0"/>
           <w:sz w:val="20"/>
         </w:rPr>
-        <w:t>[90] Rosinol A, Abate M, Chang Y, Carlone L. Kimera: an open-source library for real-time metric-semantic localization and mapping. In: IEEE International Conference on Robotics and Automation (ICRA); 2020. p. 1689-1696. doi:10.1109/ICRA40945.2020.9196885</w:t>
+        <w:t>[90] Geneva P, Eckenhoff K, Lee W, Yang Y, Huang G. OpenVINS: A research platform for visual-inertial estimation. In: IEEE/RSJ International Conference on Intelligent Robots and Systems (IROS); 2020. p. 4666-4673.</w:t>
       </w:r>
     </w:p>
     <w:p>
@@ -7966,7 +8635,7 @@
           <w:i w:val="0"/>
           <w:sz w:val="20"/>
         </w:rPr>
-        <w:t>[91] Tian Y, Chang Y, Herrera Arias F, Nieto-Granda C, How JP, Carlone L. Kimera-Multi: Robust, distributed, dense metric-semantic SLAM for multi-robot systems. IEEE Transactions on Robotics. 2022;38(4):2022-2038. doi:10.1109/TRO.2021.3137751</w:t>
+        <w:t>[91] Davison AJ, Reid ID, Molton ND, Stasse O. MonoSLAM: Real-time single camera SLAM. IEEE Transactions on Pattern Analysis and Machine Intelligence. 2007;29(6):1052-1067. doi:10.1109/TPAMI.2007.1049</w:t>
       </w:r>
     </w:p>
     <w:p>
@@ -7981,7 +8650,7 @@
           <w:i w:val="0"/>
           <w:sz w:val="20"/>
         </w:rPr>
-        <w:t>[92] Engel J, Schops T, Cremers D. LSD-SLAM: Large-scale direct monocular SLAM. In: Computer Vision - ECCV 2014. Springer; 2014. p. 834-849. doi:10.1007/978-3-319-10605-2_54</w:t>
+        <w:t>[92] Klein G, Murray D. Parallel tracking and mapping for small AR workspaces. In: Proceedings of the 6th IEEE and ACM International Symposium on Mixed and Augmented Reality (ISMAR); 2007. p. 225-234. doi:10.1109/ISMAR.2007.4538852</w:t>
       </w:r>
     </w:p>
     <w:p>
@@ -7996,7 +8665,7 @@
           <w:i w:val="0"/>
           <w:sz w:val="20"/>
         </w:rPr>
-        <w:t>[93] Teed Z, Deng J. DROID-SLAM: Tracking any pixel in any scene. In: Advances in Neural Information Processing Systems 34; 2021.</w:t>
+        <w:t>[93] Forster C, Pizzoli M, Scaramuzza D. SVO: Fast semi-direct monocular visual odometry. In: IEEE International Conference on Robotics and Automation (ICRA); 2014. p. 15-22. doi:10.1109/ICRA.2014.6906584</w:t>
       </w:r>
     </w:p>
     <w:p>
@@ -8011,7 +8680,7 @@
           <w:i w:val="0"/>
           <w:sz w:val="20"/>
         </w:rPr>
-        <w:t>[94] Sucar E, Liu S, Ortiz J, Davison AJ. iMAP: Implicit mapping and positioning in real-time. In: Proceedings of the IEEE/CVF International Conference on Computer Vision (ICCV); 2021. p. 6229-6238.</w:t>
+        <w:t>[94] Engel J, Koltun V, Cremers D. Direct Sparse Odometry. IEEE Transactions on Pattern Analysis and Machine Intelligence. 2018;40(3):611-625. doi:10.1109/TPAMI.2017.2658577</w:t>
       </w:r>
     </w:p>
     <w:p>
@@ -8026,7 +8695,7 @@
           <w:i w:val="0"/>
           <w:sz w:val="20"/>
         </w:rPr>
-        <w:t>[95] Zhu Z, Peng S, Larsson V, Xu W, Bao H, Cui Z, Oswald MR, Pollefeys M. NICE-SLAM: Neural implicit scalable encoding for SLAM. In: Proceedings of the IEEE/CVF Conference on Computer Vision and Pattern Recognition (CVPR); 2022. p. 12786-12796.</w:t>
+        <w:t>[95] Whelan T, Leutenegger S, Salas-Moreno RF, Glocker B, Davison AJ. ElasticFusion: Dense SLAM without a pose graph. In: Robotics: Science and Systems; 2015. doi:10.15607/RSS.2015.XI.001</w:t>
       </w:r>
     </w:p>
     <w:p>
@@ -8041,7 +8710,7 @@
           <w:i w:val="0"/>
           <w:sz w:val="20"/>
         </w:rPr>
-        <w:t>[96] Sandstrom E, Li Y, Van Gool L, Oswald MR. Point-SLAM: Dense neural point cloud-based SLAM. In: Proceedings of the IEEE/CVF International Conference on Computer Vision (ICCV); 2023. p. 18433-18444.</w:t>
+        <w:t>[96] Dai A, Niessner M, Zollhofer M, Izadi S, Theobalt C. BundleFusion: Real-time globally consistent 3D reconstruction using on-the-fly surface reintegration. ACM Transactions on Graphics. 2017;36(4):76a. doi:10.1145/3072959.3073615</w:t>
       </w:r>
     </w:p>
     <w:p>
@@ -8056,7 +8725,7 @@
           <w:i w:val="0"/>
           <w:sz w:val="20"/>
         </w:rPr>
-        <w:t>[97] Shan T, Englot B. LeGO-LOAM: Lightweight and ground-optimized lidar odometry and mapping on variable terrain. In: IEEE/RSJ International Conference on Intelligent Robots and Systems (IROS); 2018. p. 4758-4765. doi:10.1109/IROS.2018.8594299</w:t>
+        <w:t>[97] Curless B, Levoy M. A volumetric method for building complex models from range images. In: Proceedings of the 23rd Annual Conference on Computer Graphics and Interactive Techniques (SIGGRAPH); 1996. p. 303-312. doi:10.1145/237170.237269</w:t>
       </w:r>
     </w:p>
     <w:p>
@@ -8071,7 +8740,7 @@
           <w:i w:val="0"/>
           <w:sz w:val="20"/>
         </w:rPr>
-        <w:t>[98] Zhang J, Singh S. Visual-lidar odometry and mapping: Low-drift, robust, and fast. In: IEEE International Conference on Robotics and Automation (ICRA); 2015. p. 2174-2181. doi:10.1109/ICRA.2015.7139486</w:t>
+        <w:t>[98] Newcombe RA, Lovegrove SJ, Davison AJ. DTAM: Dense tracking and mapping in real-time. In: Proceedings of the IEEE International Conference on Computer Vision (ICCV); 2011. p. 2320-2327. doi:10.1109/ICCV.2011.6126513</w:t>
       </w:r>
     </w:p>
     <w:p>
@@ -8086,7 +8755,7 @@
           <w:i w:val="0"/>
           <w:sz w:val="20"/>
         </w:rPr>
-        <w:t>[99] Rusu RB, Cousins S. 3D is here: Point Cloud Library (PCL). In: IEEE International Conference on Robotics and Automation (ICRA); 2011. p. 1-4. doi:10.1109/ICRA.2011.5980567</w:t>
+        <w:t>[99] Endres F, Hess J, Sturm J, Cremers D, Burgard W. 3-D mapping with an RGB-D camera. IEEE Transactions on Robotics. 2014;30(1):177-187. doi:10.1109/TRO.2013.2279412</w:t>
       </w:r>
     </w:p>
     <w:p>
@@ -8101,7 +8770,7 @@
           <w:i w:val="0"/>
           <w:sz w:val="20"/>
         </w:rPr>
-        <w:t>[100] Besl PJ, McKay ND. A method for registration of 3-D shapes. IEEE Transactions on Pattern Analysis and Machine Intelligence. 1992;14(2):239-256. doi:10.1109/34.121791</w:t>
+        <w:t>[100] Sturm J, Engelhard N, Endres F, Burgard W, Cremers D. A benchmark for the evaluation of RGB-D SLAM systems. In: IEEE/RSJ International Conference on Intelligent Robots and Systems (IROS); 2012. p. 573-580. doi:10.1109/IROS.2012.6385773</w:t>
       </w:r>
     </w:p>
     <w:p>
@@ -8116,7 +8785,7 @@
           <w:i w:val="0"/>
           <w:sz w:val="20"/>
         </w:rPr>
-        <w:t>[101] Hornung A, Wurm KM, Bennewitz M, Stachniss C, Burgard W. OctoMap: An efficient probabilistic 3D mapping framework based on octrees. Autonomous Robots. 2013;34:189-206. doi:10.1007/s10514-012-9321-0</w:t>
+        <w:t>[101] Kerl C, Sturm J, Cremers D. Dense visual SLAM for RGB-D cameras. In: IEEE/RSJ International Conference on Intelligent Robots and Systems (IROS); 2013. p. 2100-2106. doi:10.1109/IROS.2013.6696650</w:t>
       </w:r>
     </w:p>
     <w:p>
@@ -8131,7 +8800,7 @@
           <w:i w:val="0"/>
           <w:sz w:val="20"/>
         </w:rPr>
-        <w:t>[102] Oleynikova H, Taylor Z, Fehr M, Siegwart R, Nieto J. Voxblox: Incremental 3D Euclidean signed distance fields for on-board MAV planning. In: IEEE/RSJ International Conference on Intelligent Robots and Systems (IROS); 2017. p. 1366-1373. doi:10.1109/IROS.2017.8202315</w:t>
+        <w:t>[102] Mur-Artal R, Montiel JMM, Tardos JD. ORB-SLAM: A versatile and accurate monocular SLAM system. IEEE Transactions on Robotics. 2015;31(5):1147-1163. doi:10.1109/TRO.2015.2463671</w:t>
       </w:r>
     </w:p>
     <w:p>
@@ -8146,7 +8815,7 @@
           <w:i w:val="0"/>
           <w:sz w:val="20"/>
         </w:rPr>
-        <w:t>[103] Qi CR, Su H, Mo K, Guibas LJ. PointNet: Deep learning on point sets for 3D classification and segmentation. In: Proceedings of the IEEE Conference on Computer Vision and Pattern Recognition (CVPR); 2017. p. 652-660. doi:10.1109/CVPR.2017.16</w:t>
+        <w:t>[103] Mur-Artal R, Tardos JD. ORB-SLAM2: An open-source SLAM system for monocular, stereo, and RGB-D cameras. IEEE Transactions on Robotics. 2017;33(5):1255-1262. doi:10.1109/TRO.2017.2705103</w:t>
       </w:r>
     </w:p>
     <w:p>
@@ -8161,7 +8830,7 @@
           <w:i w:val="0"/>
           <w:sz w:val="20"/>
         </w:rPr>
-        <w:t>[104] Qi CR, Yi L, Su H, Guibas LJ. PointNet++: Deep hierarchical feature learning on point sets in a metric space. In: Advances in Neural Information Processing Systems 30; 2017.</w:t>
+        <w:t>[104] Rosinol A, Abate M, Chang Y, Carlone L. Kimera: an open-source library for real-time metric-semantic localization and mapping. In: IEEE International Conference on Robotics and Automation (ICRA); 2020. p. 1689-1696. doi:10.1109/ICRA40945.2020.9196885</w:t>
       </w:r>
     </w:p>
     <w:p>
@@ -8176,7 +8845,7 @@
           <w:i w:val="0"/>
           <w:sz w:val="20"/>
         </w:rPr>
-        <w:t>[105] Hodan T, Michel F, Brachmann E, Kehl W, Glent Buch A, Kraft D, Drost B, Vidal J, Ihrke S, Zabulis X, Sahin C, Manhardt F, Tombari F, Kim TK, Matas J, Rother C. BOP: Benchmark for 6D object pose estimation. In: Computer Vision - ECCV 2018. Springer; 2018. p. 19-34. doi:10.1007/978-3-030-01249-6_2</w:t>
+        <w:t>[105] Tian Y, Chang Y, Herrera Arias F, Nieto-Granda C, How JP, Carlone L. Kimera-Multi: Robust, distributed, dense metric-semantic SLAM for multi-robot systems. IEEE Transactions on Robotics. 2022;38(4):2022-2038. doi:10.1109/TRO.2021.3137751</w:t>
       </w:r>
     </w:p>
     <w:p>
@@ -8191,7 +8860,7 @@
           <w:i w:val="0"/>
           <w:sz w:val="20"/>
         </w:rPr>
-        <w:t>[106] Xiang Y, Schmidt T, Narayanan V, Fox D. PoseCNN: A convolutional neural network for 6D object pose estimation in cluttered scenes. In: Robotics: Science and Systems; 2018. doi:10.15607/RSS.2018.XIV.019</w:t>
+        <w:t>[106] Engel J, Schops T, Cremers D. LSD-SLAM: Large-scale direct monocular SLAM. In: Computer Vision - ECCV 2014. Springer; 2014. p. 834-849. doi:10.1007/978-3-319-10605-2_54</w:t>
       </w:r>
     </w:p>
     <w:p>
@@ -8206,7 +8875,7 @@
           <w:i w:val="0"/>
           <w:sz w:val="20"/>
         </w:rPr>
-        <w:t>[107] Placed JA, Strader J, Carrillo H, Atanasov N, Indelman V, Carlone L, Castellanos JA. A survey on active simultaneous localization and mapping: State of the art and new frontiers. IEEE Transactions on Robotics. 2023;39(3):1686-1705. doi:10.1109/TRO.2023.3248510</w:t>
+        <w:t>[107] Teed Z, Deng J. DROID-SLAM: Tracking any pixel in any scene. In: Advances in Neural Information Processing Systems 34; 2021.</w:t>
       </w:r>
     </w:p>
     <w:p>
@@ -8221,7 +8890,7 @@
           <w:i w:val="0"/>
           <w:sz w:val="20"/>
         </w:rPr>
-        <w:t>[108] Zhang Z. A flexible new technique for camera calibration. IEEE Transactions on Pattern Analysis and Machine Intelligence. 2000;22(11):1330-1334. doi:10.1109/34.888718</w:t>
+        <w:t>[108] Sucar E, Liu S, Ortiz J, Davison AJ. iMAP: Implicit mapping and positioning in real-time. In: Proceedings of the IEEE/CVF International Conference on Computer Vision (ICCV); 2021. p. 6229-6238.</w:t>
       </w:r>
     </w:p>
     <w:p>
@@ -8236,7 +8905,7 @@
           <w:i w:val="0"/>
           <w:sz w:val="20"/>
         </w:rPr>
-        <w:t>[109] Mahler J, Liang J, Niyaz S, Laskey M, Doan R, Liu X, Ojea JA, Goldberg K. Dex-Net 2.0: Deep learning to plan robust grasps with synthetic point clouds and analytic grasp metrics. In: Robotics: Science and Systems; 2017. doi:10.15607/RSS.2017.XIII.058</w:t>
+        <w:t>[109] Zhu Z, Peng S, Larsson V, Xu W, Bao H, Cui Z, Oswald MR, Pollefeys M. NICE-SLAM: Neural implicit scalable encoding for SLAM. In: Proceedings of the IEEE/CVF Conference on Computer Vision and Pattern Recognition (CVPR); 2022. p. 12786-12796.</w:t>
       </w:r>
     </w:p>
     <w:p>
@@ -8251,7 +8920,7 @@
           <w:i w:val="0"/>
           <w:sz w:val="20"/>
         </w:rPr>
-        <w:t>[110] Zeng A, Yu KT, Song S, Suo D, Walker E, Rodriguez A, Xiao J. Multi-view self-supervised deep learning for 6D pose estimation in the Amazon Picking Challenge. In: IEEE International Conference on Robotics and Automation (ICRA); 2017. p. 1386-1393. doi:10.1109/ICRA.2017.7989165</w:t>
+        <w:t>[110] Sandstrom E, Li Y, Van Gool L, Oswald MR. Point-SLAM: Dense neural point cloud-based SLAM. In: Proceedings of the IEEE/CVF International Conference on Computer Vision (ICCV); 2023. p. 18433-18444.</w:t>
       </w:r>
     </w:p>
     <w:p>
@@ -8266,7 +8935,7 @@
           <w:i w:val="0"/>
           <w:sz w:val="20"/>
         </w:rPr>
-        <w:t>[111] Morrison D, Corke P, Leitner J. Closing the loop for robotic grasping: A real-time, generative grasp synthesis approach. In: Robotics: Science and Systems; 2018. doi:10.15607/RSS.2018.XIV.021</w:t>
+        <w:t>[111] Shan T, Englot B. LeGO-LOAM: Lightweight and ground-optimized lidar odometry and mapping on variable terrain. In: IEEE/RSJ International Conference on Intelligent Robots and Systems (IROS); 2018. p. 4758-4765. doi:10.1109/IROS.2018.8594299</w:t>
       </w:r>
     </w:p>
     <w:p>
@@ -8281,7 +8950,7 @@
           <w:i w:val="0"/>
           <w:sz w:val="20"/>
         </w:rPr>
-        <w:t>[112] Fang HS, Wang C, Gou M, Lu C. GraspNet-1Billion: A large-scale benchmark for general object grasping. In: Proceedings of the IEEE/CVF Conference on Computer Vision and Pattern Recognition (CVPR); 2020. p. 11444-11453.</w:t>
+        <w:t>[112] Xu W, Zhang F. FAST-LIO: A fast, robust LiDAR-inertial odometry package by tightly-coupled iterated Kalman filter. IEEE Robotics and Automation Letters. 2021;6(2):3317-3324. doi:10.1109/LRA.2021.3064227</w:t>
       </w:r>
     </w:p>
     <w:p>
@@ -8296,7 +8965,7 @@
           <w:i w:val="0"/>
           <w:sz w:val="20"/>
         </w:rPr>
-        <w:t>[113] Wang C, Xu D, Zhu Y, Martin-Martin R, Lu C, Fei-Fei L, Savarese S. DenseFusion: 6D object pose estimation by iterative dense fusion. In: Proceedings of the IEEE/CVF Conference on Computer Vision and Pattern Recognition (CVPR); 2019. p. 3343-3352.</w:t>
+        <w:t>[113] Zhang J, Singh S. Visual-lidar odometry and mapping: Low-drift, robust, and fast. In: IEEE International Conference on Robotics and Automation (ICRA); 2015. p. 2174-2181. doi:10.1109/ICRA.2015.7139486</w:t>
       </w:r>
     </w:p>
     <w:p>
@@ -8311,7 +8980,7 @@
           <w:i w:val="0"/>
           <w:sz w:val="20"/>
         </w:rPr>
-        <w:t>[114] Muller H, Niculescu V, Polonelli T, Magno M, Benini L. Robust and efficient depth-based obstacle avoidance for autonomous miniaturized UAVs. IEEE Transactions on Robotics. 2023;39(6):4935-4951. doi:10.1109/TRO.2023.3325812</w:t>
+        <w:t>[114] Lin J, Zhang F. R3LIVE: A Robust, Real-time, RGB-colored, LiDAR-Inertial-Visual tightly-coupled state Estimation and mapping package. In: IEEE International Conference on Robotics and Automation (ICRA); 2022. p. 10672-10678. doi:10.1109/ICRA46639.2022.9811935</w:t>
       </w:r>
     </w:p>
     <w:p>
@@ -8326,7 +8995,7 @@
           <w:i w:val="0"/>
           <w:sz w:val="20"/>
         </w:rPr>
-        <w:t>[115] Barry AJ, Florence PR, Tedrake R. High-speed autonomous obstacle avoidance with pushbroom stereo. Journal of Field Robotics. 2018;35(1):52-68. doi:10.1002/rob.21741</w:t>
+        <w:t>[115] Rusu RB, Cousins S. 3D is here: Point Cloud Library (PCL). In: IEEE International Conference on Robotics and Automation (ICRA); 2011. p. 1-4. doi:10.1109/ICRA.2011.5980567</w:t>
       </w:r>
     </w:p>
     <w:p>
@@ -8341,7 +9010,7 @@
           <w:i w:val="0"/>
           <w:sz w:val="20"/>
         </w:rPr>
-        <w:t>[116] Falanga D, Kleber K, Scaramuzza D. Dynamic obstacle avoidance for quadrotors with event cameras. Science Robotics. 2020;5(40):eaaz9712. doi:10.1126/scirobotics.aaz9712</w:t>
+        <w:t>[116] Besl PJ, McKay ND. A method for registration of 3-D shapes. IEEE Transactions on Pattern Analysis and Machine Intelligence. 1992;14(2):239-256. doi:10.1109/34.121791</w:t>
       </w:r>
     </w:p>
     <w:p>
@@ -8356,7 +9025,7 @@
           <w:i w:val="0"/>
           <w:sz w:val="20"/>
         </w:rPr>
-        <w:t>[117] Zhou Y, Gallego G, Shen S. Event-based stereo visual odometry. IEEE Transactions on Robotics. 2021;37(5):1433-1450. doi:10.1109/TRO.2021.3062252</w:t>
+        <w:t>[117] Hornung A, Wurm KM, Bennewitz M, Stachniss C, Burgard W. OctoMap: An efficient probabilistic 3D mapping framework based on octrees. Autonomous Robots. 2013;34:189-206. doi:10.1007/s10514-012-9321-0</w:t>
       </w:r>
     </w:p>
     <w:p>
@@ -8371,7 +9040,7 @@
           <w:i w:val="0"/>
           <w:sz w:val="20"/>
         </w:rPr>
-        <w:t>[118] He B, Wang Z, Zhou Y, Chen J, Singh CD, Li H, Gao Y, Shen S, Wang K, Cao Y, Xu C, Aloimonos Y, Gao F, Fermuller C. Microsaccade-inspired event camera for robotics. Science Robotics. 2024;9(90):eadj8124. doi:10.1126/scirobotics.adj8124</w:t>
+        <w:t>[118] Oleynikova H, Taylor Z, Fehr M, Siegwart R, Nieto J. Voxblox: Incremental 3D Euclidean signed distance fields for on-board MAV planning. In: IEEE/RSJ International Conference on Intelligent Robots and Systems (IROS); 2017. p. 1366-1373. doi:10.1109/IROS.2017.8202315</w:t>
       </w:r>
     </w:p>
     <w:p>
@@ -8386,7 +9055,7 @@
           <w:i w:val="0"/>
           <w:sz w:val="20"/>
         </w:rPr>
-        <w:t>[119] Nex F, Remondino F. UAV for 3D mapping applications: a review. Applied Geomatics. 2014;6:1-15. doi:10.1007/s12518-013-0120-x</w:t>
+        <w:t>[119] Rusinkiewicz S, Levoy M. Efficient variants of the ICP algorithm. In: Proceedings Third International Conference on 3-D Digital Imaging and Modeling; 2001. p. 145-152. doi:10.1109/IM.2001.924423</w:t>
       </w:r>
     </w:p>
     <w:p>
@@ -8401,7 +9070,7 @@
           <w:i w:val="0"/>
           <w:sz w:val="20"/>
         </w:rPr>
-        <w:t>[120] Colomina I, Molina P. Unmanned aerial systems for photogrammetry and remote sensing: A review. ISPRS Journal of Photogrammetry and Remote Sensing. 2014;92:79-97. doi:10.1016/j.isprsjprs.2014.02.013</w:t>
+        <w:t>[120] Segal A, Haehnel D, Thrun S. Generalized-ICP. In: Robotics: Science and Systems; 2009. doi:10.15607/RSS.2009.V.021</w:t>
       </w:r>
     </w:p>
     <w:p>
@@ -8416,7 +9085,7 @@
           <w:i w:val="0"/>
           <w:sz w:val="20"/>
         </w:rPr>
-        <w:t>[121] Seo J, Duque L, Wacker J. Drone-enabled bridge inspection methodology and application. Automation in Construction. 2018;94:112-126. doi:10.1016/j.autcon.2018.06.006</w:t>
+        <w:t>[121] Pomerleau F, Colas F, Siegwart R, Magnenat S. Comparing ICP variants on real-world data sets. Autonomous Robots. 2013;34:133-148. doi:10.1007/s10514-013-9327-2</w:t>
       </w:r>
     </w:p>
     <w:p>
@@ -8431,7 +9100,7 @@
           <w:i w:val="0"/>
           <w:sz w:val="20"/>
         </w:rPr>
-        <w:t>[122] Dorafshan S, Thomas RJ, Maguire M. Fatigue crack detection using unmanned aerial systems in fracture critical inspection of steel bridges. Journal of Bridge Engineering. 2018;23(10):04018078. doi:10.1061/(ASCE)BE.1943-5592.0001291</w:t>
+        <w:t>[122] Qi CR, Su H, Mo K, Guibas LJ. PointNet: Deep learning on point sets for 3D classification and segmentation. In: Proceedings of the IEEE Conference on Computer Vision and Pattern Recognition (CVPR); 2017. p. 652-660. doi:10.1109/CVPR.2017.16</w:t>
       </w:r>
     </w:p>
     <w:p>
@@ -8446,7 +9115,7 @@
           <w:i w:val="0"/>
           <w:sz w:val="20"/>
         </w:rPr>
-        <w:t>[123] Bircher A, Kamel M, Alexis K, Oleynikova H, Siegwart R. Receding horizon path planning for 3D exploration and surface inspection. Autonomous Robots. 2018;42:291-306. doi:10.1007/s10514-016-9610-2</w:t>
+        <w:t>[123] Qi CR, Yi L, Su H, Guibas LJ. PointNet++: Deep hierarchical feature learning on point sets in a metric space. In: Advances in Neural Information Processing Systems 30; 2017.</w:t>
       </w:r>
     </w:p>
     <w:p>
@@ -8461,7 +9130,7 @@
           <w:i w:val="0"/>
           <w:sz w:val="20"/>
         </w:rPr>
-        <w:t>[124] Ajoudani A, Zanchettin AM, Ivaldi S, Albu-Schaffer A, Kosuge K, Khatib O. Progress and prospects of the human-robot collaboration. Autonomous Robots. 2018;42:957-975. doi:10.1007/s10514-017-9677-2</w:t>
+        <w:t>[124] Hodan T, Michel F, Brachmann E, Kehl W, Glent Buch A, Kraft D, Drost B, Vidal J, Ihrke S, Zabulis X, Sahin C, Manhardt F, Tombari F, Kim TK, Matas J, Rother C. BOP: Benchmark for 6D object pose estimation. In: Computer Vision - ECCV 2018. Springer; 2018. p. 19-34. doi:10.1007/978-3-030-01249-6_2</w:t>
       </w:r>
     </w:p>
     <w:p>
@@ -8476,7 +9145,7 @@
           <w:i w:val="0"/>
           <w:sz w:val="20"/>
         </w:rPr>
-        <w:t>[125] Haddadin S, De Luca A, Albu-Schaffer A. Robot collisions: A survey on detection, isolation, and identification. IEEE Transactions on Robotics. 2017;33(6):1292-1312. doi:10.1109/TRO.2017.2725543</w:t>
+        <w:t>[125] Xiang Y, Schmidt T, Narayanan V, Fox D. PoseCNN: A convolutional neural network for 6D object pose estimation in cluttered scenes. In: Robotics: Science and Systems; 2018. doi:10.15607/RSS.2018.XIV.019</w:t>
       </w:r>
     </w:p>
     <w:p>
@@ -8491,7 +9160,7 @@
           <w:i w:val="0"/>
           <w:sz w:val="20"/>
         </w:rPr>
-        <w:t>[126] Lasota PA, Fong T, Shah JA. A survey of methods for safe human-robot interaction. Foundations and Trends in Robotics. 2017;5(4):261-349. doi:10.1561/2300000052</w:t>
+        <w:t>[126] Placed JA, Strader J, Carrillo H, Atanasov N, Indelman V, Carlone L, Castellanos JA. A survey on active simultaneous localization and mapping: State of the art and new frontiers. IEEE Transactions on Robotics. 2023;39(3):1686-1705. doi:10.1109/TRO.2023.3248510</w:t>
       </w:r>
     </w:p>
     <w:p>
@@ -8506,7 +9175,7 @@
           <w:i w:val="0"/>
           <w:sz w:val="20"/>
         </w:rPr>
-        <w:t>[127] Robla-Gomez S, Becerra VM, Llata JR, Gonzalez-Sarabia E, Torre-Ferrero C, Perez-Oria J. Working together: A review on safe human-robot collaboration in industrial environments. IEEE Access. 2017;5:26754-26773. doi:10.1109/ACCESS.2017.2773127</w:t>
+        <w:t>[127] Zhang Z. A flexible new technique for camera calibration. IEEE Transactions on Pattern Analysis and Machine Intelligence. 2000;22(11):1330-1334. doi:10.1109/34.888718</w:t>
       </w:r>
     </w:p>
     <w:p>
@@ -8521,7 +9190,7 @@
           <w:i w:val="0"/>
           <w:sz w:val="20"/>
         </w:rPr>
-        <w:t>[128] Lichtsteiner P, Posch C, Delbruck T. A 128 x 128 120 dB 15 us latency asynchronous temporal contrast vision sensor. IEEE Journal of Solid-State Circuits. 2008;43(2):566-576. doi:10.1109/JSSC.2007.914337</w:t>
+        <w:t>[128] Handa A, Whelan T, McDonald J, Davison AJ. A benchmark for RGB-D visual odometry, 3D reconstruction and SLAM. In: IEEE International Conference on Robotics and Automation (ICRA); 2014. p. 1524-1531. doi:10.1109/ICRA.2014.6907054</w:t>
       </w:r>
     </w:p>
     <w:p>
@@ -8536,7 +9205,7 @@
           <w:i w:val="0"/>
           <w:sz w:val="20"/>
         </w:rPr>
-        <w:t>[129] Roy K, Jaiswal A, Panda P. Towards spike-based machine intelligence with neuromorphic computing. Nature. 2019;575:607-617. doi:10.1038/s41586-019-1677-2</w:t>
+        <w:t>[129] Burri M, Nikolic J, Gohl P, Schneider T, Rehder J, Omari S, Achtelik MW, Siegwart R. The EuRoC micro aerial vehicle datasets. The International Journal of Robotics Research. 2016;35(10):1157-1163. doi:10.1177/0278364915620033</w:t>
       </w:r>
     </w:p>
     <w:p>
@@ -8551,7 +9220,7 @@
           <w:i w:val="0"/>
           <w:sz w:val="20"/>
         </w:rPr>
-        <w:t>[130] Davies M, Srinivasa N, Lin TH, Chinya G, Cao Y, Choday SH, Dimou G, Joshi P, Imam N, Jain S, Liao Y, Lin CK, Lines A, Liu R, Mathaikutty D, McCoy S, Paul A, Tse J, Venkataramanan G, Weng YH, Wild A, Yang Y, Wang H. Loihi: A neuromorphic manycore processor with on-chip learning. IEEE Micro. 2018;38(1):82-99. doi:10.1109/MM.2018.112130359</w:t>
+        <w:t>[130] Schubert D, Goll T, Demmel N, Usenko V, Stuckler J, Cremers D. The TUM VI benchmark for evaluating visual-inertial odometry. In: IEEE/RSJ International Conference on Intelligent Robots and Systems (IROS); 2018. p. 1680-1687. doi:10.1109/IROS.2018.8593413</w:t>
       </w:r>
     </w:p>
     <w:p>
@@ -8566,7 +9235,7 @@
           <w:i w:val="0"/>
           <w:sz w:val="20"/>
         </w:rPr>
-        <w:t>[131] Brandli C, Berner R, Yang M, Liu SC, Delbruck T. A 240 x 180 130 dB 3 us latency global shutter spatiotemporal vision sensor. IEEE Journal of Solid-State Circuits. 2014;49(10):2333-2341. doi:10.1109/JSSC.2014.2342715</w:t>
+        <w:t>[131] Caesar H, Bankiti V, Lang AH, Vora S, Liong VE, Xu Q, Krishnan A, Pan Y, Baldan G, Beijbom O. nuScenes: A multimodal dataset for autonomous driving. In: Proceedings of the IEEE/CVF Conference on Computer Vision and Pattern Recognition (CVPR); 2020. p. 11621-11631. doi:10.1109/CVPR42600.2020.01164</w:t>
       </w:r>
     </w:p>
     <w:p>
@@ -8581,7 +9250,7 @@
           <w:i w:val="0"/>
           <w:sz w:val="20"/>
         </w:rPr>
-        <w:t>[132] Rebecq H, Horstschaefer T, Gallego G, Scaramuzza D. EVO: A geometric approach to event-based 6-DOF parallel tracking and mapping in real time. IEEE Robotics and Automation Letters. 2017;2(2):593-600. doi:10.1109/LRA.2016.2645143</w:t>
+        <w:t>[132] Calli B, Walsman A, Singh A, Srinivasa S, Abbeel P, Dollar AM. Benchmarking in manipulation research: Using the Yale-CMU-Berkeley object and model set. IEEE Robotics and Automation Magazine. 2015;22(3):36-52. doi:10.1109/MRA.2015.2448951</w:t>
       </w:r>
     </w:p>
     <w:p>
@@ -8596,7 +9265,7 @@
           <w:i w:val="0"/>
           <w:sz w:val="20"/>
         </w:rPr>
-        <w:t>[133] Guo S, Gallego G. CMax-SLAM: Event-based rotational-motion bundle adjustment and SLAM system using contrast maximization. IEEE Transactions on Robotics. 2024;40:2442-2461. doi:10.1109/TRO.2024.3378443</w:t>
+        <w:t>[133] Mahler J, Liang J, Niyaz S, Laskey M, Doan R, Liu X, Ojea JA, Goldberg K. Dex-Net 2.0: Deep learning to plan robust grasps with synthetic point clouds and analytic grasp metrics. In: Robotics: Science and Systems; 2017. doi:10.15607/RSS.2017.XIII.058</w:t>
       </w:r>
     </w:p>
     <w:p>
@@ -8611,7 +9280,7 @@
           <w:i w:val="0"/>
           <w:sz w:val="20"/>
         </w:rPr>
-        <w:t>[134] Gehrig D, Scaramuzza D. Low-latency automotive vision with event cameras. Nature. 2024;629:1034-1040.</w:t>
+        <w:t>[134] Zeng A, Yu KT, Song S, Suo D, Walker E, Rodriguez A, Xiao J. Multi-view self-supervised deep learning for 6D pose estimation in the Amazon Picking Challenge. In: IEEE International Conference on Robotics and Automation (ICRA); 2017. p. 1386-1393. doi:10.1109/ICRA.2017.7989165</w:t>
       </w:r>
     </w:p>
     <w:p>
@@ -8626,7 +9295,7 @@
           <w:i w:val="0"/>
           <w:sz w:val="20"/>
         </w:rPr>
-        <w:t>[135] Caesar H, Bankiti V, Lang AH, Vora S, Liong VE, Xu Q, Krishnan A, Pan Y, Baldan G, Beijbom O. nuScenes: A multimodal dataset for autonomous driving. In: Proceedings of the IEEE/CVF Conference on Computer Vision and Pattern Recognition (CVPR); 2020. p. 11621-11631. doi:10.1109/CVPR42600.2020.01164</w:t>
+        <w:t>[135] Morrison D, Corke P, Leitner J. Closing the loop for robotic grasping: A real-time, generative grasp synthesis approach. In: Robotics: Science and Systems; 2018. doi:10.15607/RSS.2018.XIV.021</w:t>
       </w:r>
     </w:p>
     <w:p>
@@ -8641,7 +9310,7 @@
           <w:i w:val="0"/>
           <w:sz w:val="20"/>
         </w:rPr>
-        <w:t>[136] Khorasaninejad M, Capasso F. Metalenses: Versatile multifunctional photonic components. Science. 2017;358(6367):eaam8100. doi:10.1126/science.aam8100</w:t>
+        <w:t>[136] Fang HS, Wang C, Gou M, Lu C. GraspNet-1Billion: A large-scale benchmark for general object grasping. In: Proceedings of the IEEE/CVF Conference on Computer Vision and Pattern Recognition (CVPR); 2020. p. 11444-11453.</w:t>
       </w:r>
     </w:p>
     <w:p>
@@ -8656,7 +9325,7 @@
           <w:i w:val="0"/>
           <w:sz w:val="20"/>
         </w:rPr>
-        <w:t>[137] Kirmani A, Venkatraman D, Shin D, Colaco A, Wong FNC, Shapiro JH, Goyal VK. First-photon imaging. Science. 2014;343(6166):58-61. doi:10.1126/science.1246775</w:t>
+        <w:t>[137] Wang C, Xu D, Zhu Y, Martin-Martin R, Lu C, Fei-Fei L, Savarese S. DenseFusion: 6D object pose estimation by iterative dense fusion. In: Proceedings of the IEEE/CVF Conference on Computer Vision and Pattern Recognition (CVPR); 2019. p. 3343-3352.</w:t>
       </w:r>
     </w:p>
     <w:p>
@@ -8671,7 +9340,457 @@
           <w:i w:val="0"/>
           <w:sz w:val="20"/>
         </w:rPr>
-        <w:t>[138] O'Toole M, Lindell DB, Wetzstein G. Confocal non-line-of-sight imaging based on the light-cone transform. Nature. 2018;555:338-341. doi:10.1038/nature25489</w:t>
+        <w:t>[138] Kumar V, Michael N. Opportunities and challenges with autonomous micro aerial vehicles. The International Journal of Robotics Research. 2012;31(11):1279-1291. doi:10.1177/0278364912455954</w:t>
+      </w:r>
+    </w:p>
+    <w:p>
+      <w:pPr>
+        <w:spacing w:after="120" w:line="276" w:lineRule="auto"/>
+        <w:ind w:left="504" w:hanging="504"/>
+      </w:pPr>
+      <w:r>
+        <w:rPr>
+          <w:rFonts w:ascii="Times New Roman" w:hAnsi="Times New Roman" w:eastAsia="Times New Roman"/>
+          <w:b w:val="0"/>
+          <w:i w:val="0"/>
+          <w:sz w:val="20"/>
+        </w:rPr>
+        <w:t>[139] Scaramuzza D, Achtelik MC, Doitsidis L, Fraundorfer F, Kosmatopoulos E, Martinelli A, Achtelik MW, Chli M, Chatzichristofis S, Kneip L, Gurdan D, Heng L, Lee GH, Lynen S, Pollefeys M, Renzaglia A, Siegwart R, Stumpf JC, Tanskanen P, Troiani C, Weiss S, Meier L. Vision-controlled micro flying robots: From system design to autonomous navigation and mapping in GPS-denied environments. IEEE Robotics and Automation Magazine. 2014;21(3):26-40. doi:10.1109/MRA.2014.2322295</w:t>
+      </w:r>
+    </w:p>
+    <w:p>
+      <w:pPr>
+        <w:spacing w:after="120" w:line="276" w:lineRule="auto"/>
+        <w:ind w:left="504" w:hanging="504"/>
+      </w:pPr>
+      <w:r>
+        <w:rPr>
+          <w:rFonts w:ascii="Times New Roman" w:hAnsi="Times New Roman" w:eastAsia="Times New Roman"/>
+          <w:b w:val="0"/>
+          <w:i w:val="0"/>
+          <w:sz w:val="20"/>
+        </w:rPr>
+        <w:t>[140] Muller H, Niculescu V, Polonelli T, Magno M, Benini L. Robust and efficient depth-based obstacle avoidance for autonomous miniaturized UAVs. IEEE Transactions on Robotics. 2023;39(6):4935-4951. doi:10.1109/TRO.2023.3325812</w:t>
+      </w:r>
+    </w:p>
+    <w:p>
+      <w:pPr>
+        <w:spacing w:after="120" w:line="276" w:lineRule="auto"/>
+        <w:ind w:left="504" w:hanging="504"/>
+      </w:pPr>
+      <w:r>
+        <w:rPr>
+          <w:rFonts w:ascii="Times New Roman" w:hAnsi="Times New Roman" w:eastAsia="Times New Roman"/>
+          <w:b w:val="0"/>
+          <w:i w:val="0"/>
+          <w:sz w:val="20"/>
+        </w:rPr>
+        <w:t>[141] Barry AJ, Florence PR, Tedrake R. High-speed autonomous obstacle avoidance with pushbroom stereo. Journal of Field Robotics. 2018;35(1):52-68. doi:10.1002/rob.21741</w:t>
+      </w:r>
+    </w:p>
+    <w:p>
+      <w:pPr>
+        <w:spacing w:after="120" w:line="276" w:lineRule="auto"/>
+        <w:ind w:left="504" w:hanging="504"/>
+      </w:pPr>
+      <w:r>
+        <w:rPr>
+          <w:rFonts w:ascii="Times New Roman" w:hAnsi="Times New Roman" w:eastAsia="Times New Roman"/>
+          <w:b w:val="0"/>
+          <w:i w:val="0"/>
+          <w:sz w:val="20"/>
+        </w:rPr>
+        <w:t>[142] Falanga D, Kleber K, Scaramuzza D. Dynamic obstacle avoidance for quadrotors with event cameras. Science Robotics. 2020;5(40):eaaz9712. doi:10.1126/scirobotics.aaz9712</w:t>
+      </w:r>
+    </w:p>
+    <w:p>
+      <w:pPr>
+        <w:spacing w:after="120" w:line="276" w:lineRule="auto"/>
+        <w:ind w:left="504" w:hanging="504"/>
+      </w:pPr>
+      <w:r>
+        <w:rPr>
+          <w:rFonts w:ascii="Times New Roman" w:hAnsi="Times New Roman" w:eastAsia="Times New Roman"/>
+          <w:b w:val="0"/>
+          <w:i w:val="0"/>
+          <w:sz w:val="20"/>
+        </w:rPr>
+        <w:t>[143] Zhou Y, Gallego G, Shen S. Event-based stereo visual odometry. IEEE Transactions on Robotics. 2021;37(5):1433-1450. doi:10.1109/TRO.2021.3062252</w:t>
+      </w:r>
+    </w:p>
+    <w:p>
+      <w:pPr>
+        <w:spacing w:after="120" w:line="276" w:lineRule="auto"/>
+        <w:ind w:left="504" w:hanging="504"/>
+      </w:pPr>
+      <w:r>
+        <w:rPr>
+          <w:rFonts w:ascii="Times New Roman" w:hAnsi="Times New Roman" w:eastAsia="Times New Roman"/>
+          <w:b w:val="0"/>
+          <w:i w:val="0"/>
+          <w:sz w:val="20"/>
+        </w:rPr>
+        <w:t>[144] He B, Wang Z, Zhou Y, Chen J, Singh CD, Li H, Gao Y, Shen S, Wang K, Cao Y, Xu C, Aloimonos Y, Gao F, Fermuller C. Microsaccade-inspired event camera for robotics. Science Robotics. 2024;9(90):eadj8124. doi:10.1126/scirobotics.adj8124</w:t>
+      </w:r>
+    </w:p>
+    <w:p>
+      <w:pPr>
+        <w:spacing w:after="120" w:line="276" w:lineRule="auto"/>
+        <w:ind w:left="504" w:hanging="504"/>
+      </w:pPr>
+      <w:r>
+        <w:rPr>
+          <w:rFonts w:ascii="Times New Roman" w:hAnsi="Times New Roman" w:eastAsia="Times New Roman"/>
+          <w:b w:val="0"/>
+          <w:i w:val="0"/>
+          <w:sz w:val="20"/>
+        </w:rPr>
+        <w:t>[145] Nex F, Remondino F. UAV for 3D mapping applications: a review. Applied Geomatics. 2014;6:1-15. doi:10.1007/s12518-013-0120-x</w:t>
+      </w:r>
+    </w:p>
+    <w:p>
+      <w:pPr>
+        <w:spacing w:after="120" w:line="276" w:lineRule="auto"/>
+        <w:ind w:left="504" w:hanging="504"/>
+      </w:pPr>
+      <w:r>
+        <w:rPr>
+          <w:rFonts w:ascii="Times New Roman" w:hAnsi="Times New Roman" w:eastAsia="Times New Roman"/>
+          <w:b w:val="0"/>
+          <w:i w:val="0"/>
+          <w:sz w:val="20"/>
+        </w:rPr>
+        <w:t>[146] Colomina I, Molina P. Unmanned aerial systems for photogrammetry and remote sensing: A review. ISPRS Journal of Photogrammetry and Remote Sensing. 2014;92:79-97. doi:10.1016/j.isprsjprs.2014.02.013</w:t>
+      </w:r>
+    </w:p>
+    <w:p>
+      <w:pPr>
+        <w:spacing w:after="120" w:line="276" w:lineRule="auto"/>
+        <w:ind w:left="504" w:hanging="504"/>
+      </w:pPr>
+      <w:r>
+        <w:rPr>
+          <w:rFonts w:ascii="Times New Roman" w:hAnsi="Times New Roman" w:eastAsia="Times New Roman"/>
+          <w:b w:val="0"/>
+          <w:i w:val="0"/>
+          <w:sz w:val="20"/>
+        </w:rPr>
+        <w:t>[147] Seo J, Duque L, Wacker J. Drone-enabled bridge inspection methodology and application. Automation in Construction. 2018;94:112-126. doi:10.1016/j.autcon.2018.06.006</w:t>
+      </w:r>
+    </w:p>
+    <w:p>
+      <w:pPr>
+        <w:spacing w:after="120" w:line="276" w:lineRule="auto"/>
+        <w:ind w:left="504" w:hanging="504"/>
+      </w:pPr>
+      <w:r>
+        <w:rPr>
+          <w:rFonts w:ascii="Times New Roman" w:hAnsi="Times New Roman" w:eastAsia="Times New Roman"/>
+          <w:b w:val="0"/>
+          <w:i w:val="0"/>
+          <w:sz w:val="20"/>
+        </w:rPr>
+        <w:t>[148] Dorafshan S, Thomas RJ, Maguire M. Fatigue crack detection using unmanned aerial systems in fracture critical inspection of steel bridges. Journal of Bridge Engineering. 2018;23(10):04018078. doi:10.1061/(ASCE)BE.1943-5592.0001291</w:t>
+      </w:r>
+    </w:p>
+    <w:p>
+      <w:pPr>
+        <w:spacing w:after="120" w:line="276" w:lineRule="auto"/>
+        <w:ind w:left="504" w:hanging="504"/>
+      </w:pPr>
+      <w:r>
+        <w:rPr>
+          <w:rFonts w:ascii="Times New Roman" w:hAnsi="Times New Roman" w:eastAsia="Times New Roman"/>
+          <w:b w:val="0"/>
+          <w:i w:val="0"/>
+          <w:sz w:val="20"/>
+        </w:rPr>
+        <w:t>[149] Morgenthal G, Hallermann N. Quality assessment of unmanned aerial vehicle (UAV) based visual inspection of structures. Advances in Structural Engineering. 2014;17(3):289-302. doi:10.1260/1369-4332.17.3.289</w:t>
+      </w:r>
+    </w:p>
+    <w:p>
+      <w:pPr>
+        <w:spacing w:after="120" w:line="276" w:lineRule="auto"/>
+        <w:ind w:left="504" w:hanging="504"/>
+      </w:pPr>
+      <w:r>
+        <w:rPr>
+          <w:rFonts w:ascii="Times New Roman" w:hAnsi="Times New Roman" w:eastAsia="Times New Roman"/>
+          <w:b w:val="0"/>
+          <w:i w:val="0"/>
+          <w:sz w:val="20"/>
+        </w:rPr>
+        <w:t>[150] Bircher A, Kamel M, Alexis K, Oleynikova H, Siegwart R. Receding horizon path planning for 3D exploration and surface inspection. Autonomous Robots. 2018;42:291-306. doi:10.1007/s10514-016-9610-2</w:t>
+      </w:r>
+    </w:p>
+    <w:p>
+      <w:pPr>
+        <w:spacing w:after="120" w:line="276" w:lineRule="auto"/>
+        <w:ind w:left="504" w:hanging="504"/>
+      </w:pPr>
+      <w:r>
+        <w:rPr>
+          <w:rFonts w:ascii="Times New Roman" w:hAnsi="Times New Roman" w:eastAsia="Times New Roman"/>
+          <w:b w:val="0"/>
+          <w:i w:val="0"/>
+          <w:sz w:val="20"/>
+        </w:rPr>
+        <w:t>[151] Ruggiero F, Lippiello V, Ollero A. Aerial manipulation: A literature review. IEEE Robotics and Automation Letters. 2018;3(3):1957-1964. doi:10.1109/LRA.2018.2808541</w:t>
+      </w:r>
+    </w:p>
+    <w:p>
+      <w:pPr>
+        <w:spacing w:after="120" w:line="276" w:lineRule="auto"/>
+        <w:ind w:left="504" w:hanging="504"/>
+      </w:pPr>
+      <w:r>
+        <w:rPr>
+          <w:rFonts w:ascii="Times New Roman" w:hAnsi="Times New Roman" w:eastAsia="Times New Roman"/>
+          <w:b w:val="0"/>
+          <w:i w:val="0"/>
+          <w:sz w:val="20"/>
+        </w:rPr>
+        <w:t>[152] Ajoudani A, Zanchettin AM, Ivaldi S, Albu-Schaffer A, Kosuge K, Khatib O. Progress and prospects of the human-robot collaboration. Autonomous Robots. 2018;42:957-975. doi:10.1007/s10514-017-9677-2</w:t>
+      </w:r>
+    </w:p>
+    <w:p>
+      <w:pPr>
+        <w:spacing w:after="120" w:line="276" w:lineRule="auto"/>
+        <w:ind w:left="504" w:hanging="504"/>
+      </w:pPr>
+      <w:r>
+        <w:rPr>
+          <w:rFonts w:ascii="Times New Roman" w:hAnsi="Times New Roman" w:eastAsia="Times New Roman"/>
+          <w:b w:val="0"/>
+          <w:i w:val="0"/>
+          <w:sz w:val="20"/>
+        </w:rPr>
+        <w:t>[153] Haddadin S, De Luca A, Albu-Schaffer A. Robot collisions: A survey on detection, isolation, and identification. IEEE Transactions on Robotics. 2017;33(6):1292-1312. doi:10.1109/TRO.2017.2725543</w:t>
+      </w:r>
+    </w:p>
+    <w:p>
+      <w:pPr>
+        <w:spacing w:after="120" w:line="276" w:lineRule="auto"/>
+        <w:ind w:left="504" w:hanging="504"/>
+      </w:pPr>
+      <w:r>
+        <w:rPr>
+          <w:rFonts w:ascii="Times New Roman" w:hAnsi="Times New Roman" w:eastAsia="Times New Roman"/>
+          <w:b w:val="0"/>
+          <w:i w:val="0"/>
+          <w:sz w:val="20"/>
+        </w:rPr>
+        <w:t>[154] Lasota PA, Fong T, Shah JA. A survey of methods for safe human-robot interaction. Foundations and Trends in Robotics. 2017;5(4):261-349. doi:10.1561/2300000052</w:t>
+      </w:r>
+    </w:p>
+    <w:p>
+      <w:pPr>
+        <w:spacing w:after="120" w:line="276" w:lineRule="auto"/>
+        <w:ind w:left="504" w:hanging="504"/>
+      </w:pPr>
+      <w:r>
+        <w:rPr>
+          <w:rFonts w:ascii="Times New Roman" w:hAnsi="Times New Roman" w:eastAsia="Times New Roman"/>
+          <w:b w:val="0"/>
+          <w:i w:val="0"/>
+          <w:sz w:val="20"/>
+        </w:rPr>
+        <w:t>[155] Robla-Gomez S, Becerra VM, Llata JR, Gonzalez-Sarabia E, Torre-Ferrero C, Perez-Oria J. Working together: A review on safe human-robot collaboration in industrial environments. IEEE Access. 2017;5:26754-26773. doi:10.1109/ACCESS.2017.2773127</w:t>
+      </w:r>
+    </w:p>
+    <w:p>
+      <w:pPr>
+        <w:spacing w:after="120" w:line="276" w:lineRule="auto"/>
+        <w:ind w:left="504" w:hanging="504"/>
+      </w:pPr>
+      <w:r>
+        <w:rPr>
+          <w:rFonts w:ascii="Times New Roman" w:hAnsi="Times New Roman" w:eastAsia="Times New Roman"/>
+          <w:b w:val="0"/>
+          <w:i w:val="0"/>
+          <w:sz w:val="20"/>
+        </w:rPr>
+        <w:t>[156] Zanchettin AM, Ceriani NM, Rocco P, Ding H, Matthias B. Safety in human-robot collaborative manufacturing environments: Metrics and control. IEEE Transactions on Automation Science and Engineering. 2016;13(2):882-893. doi:10.1109/TASE.2015.2412256</w:t>
+      </w:r>
+    </w:p>
+    <w:p>
+      <w:pPr>
+        <w:spacing w:after="120" w:line="276" w:lineRule="auto"/>
+        <w:ind w:left="504" w:hanging="504"/>
+      </w:pPr>
+      <w:r>
+        <w:rPr>
+          <w:rFonts w:ascii="Times New Roman" w:hAnsi="Times New Roman" w:eastAsia="Times New Roman"/>
+          <w:b w:val="0"/>
+          <w:i w:val="0"/>
+          <w:sz w:val="20"/>
+        </w:rPr>
+        <w:t>[157] Lichtsteiner P, Posch C, Delbruck T. A 128 x 128 120 dB 15 us latency asynchronous temporal contrast vision sensor. IEEE Journal of Solid-State Circuits. 2008;43(2):566-576. doi:10.1109/JSSC.2007.914337</w:t>
+      </w:r>
+    </w:p>
+    <w:p>
+      <w:pPr>
+        <w:spacing w:after="120" w:line="276" w:lineRule="auto"/>
+        <w:ind w:left="504" w:hanging="504"/>
+      </w:pPr>
+      <w:r>
+        <w:rPr>
+          <w:rFonts w:ascii="Times New Roman" w:hAnsi="Times New Roman" w:eastAsia="Times New Roman"/>
+          <w:b w:val="0"/>
+          <w:i w:val="0"/>
+          <w:sz w:val="20"/>
+        </w:rPr>
+        <w:t>[158] Roy K, Jaiswal A, Panda P. Towards spike-based machine intelligence with neuromorphic computing. Nature. 2019;575:607-617. doi:10.1038/s41586-019-1677-2</w:t>
+      </w:r>
+    </w:p>
+    <w:p>
+      <w:pPr>
+        <w:spacing w:after="120" w:line="276" w:lineRule="auto"/>
+        <w:ind w:left="504" w:hanging="504"/>
+      </w:pPr>
+      <w:r>
+        <w:rPr>
+          <w:rFonts w:ascii="Times New Roman" w:hAnsi="Times New Roman" w:eastAsia="Times New Roman"/>
+          <w:b w:val="0"/>
+          <w:i w:val="0"/>
+          <w:sz w:val="20"/>
+        </w:rPr>
+        <w:t>[159] Davies M, Srinivasa N, Lin TH, Chinya G, Cao Y, Choday SH, Dimou G, Joshi P, Imam N, Jain S, Liao Y, Lin CK, Lines A, Liu R, Mathaikutty D, McCoy S, Paul A, Tse J, Venkataramanan G, Weng YH, Wild A, Yang Y, Wang H. Loihi: A neuromorphic manycore processor with on-chip learning. IEEE Micro. 2018;38(1):82-99. doi:10.1109/MM.2018.112130359</w:t>
+      </w:r>
+    </w:p>
+    <w:p>
+      <w:pPr>
+        <w:spacing w:after="120" w:line="276" w:lineRule="auto"/>
+        <w:ind w:left="504" w:hanging="504"/>
+      </w:pPr>
+      <w:r>
+        <w:rPr>
+          <w:rFonts w:ascii="Times New Roman" w:hAnsi="Times New Roman" w:eastAsia="Times New Roman"/>
+          <w:b w:val="0"/>
+          <w:i w:val="0"/>
+          <w:sz w:val="20"/>
+        </w:rPr>
+        <w:t>[160] Brandli C, Berner R, Yang M, Liu SC, Delbruck T. A 240 x 180 130 dB 3 us latency global shutter spatiotemporal vision sensor. IEEE Journal of Solid-State Circuits. 2014;49(10):2333-2341. doi:10.1109/JSSC.2014.2342715</w:t>
+      </w:r>
+    </w:p>
+    <w:p>
+      <w:pPr>
+        <w:spacing w:after="120" w:line="276" w:lineRule="auto"/>
+        <w:ind w:left="504" w:hanging="504"/>
+      </w:pPr>
+      <w:r>
+        <w:rPr>
+          <w:rFonts w:ascii="Times New Roman" w:hAnsi="Times New Roman" w:eastAsia="Times New Roman"/>
+          <w:b w:val="0"/>
+          <w:i w:val="0"/>
+          <w:sz w:val="20"/>
+        </w:rPr>
+        <w:t>[161] Rebecq H, Horstschaefer T, Gallego G, Scaramuzza D. EVO: A geometric approach to event-based 6-DOF parallel tracking and mapping in real time. IEEE Robotics and Automation Letters. 2017;2(2):593-600. doi:10.1109/LRA.2016.2645143</w:t>
+      </w:r>
+    </w:p>
+    <w:p>
+      <w:pPr>
+        <w:spacing w:after="120" w:line="276" w:lineRule="auto"/>
+        <w:ind w:left="504" w:hanging="504"/>
+      </w:pPr>
+      <w:r>
+        <w:rPr>
+          <w:rFonts w:ascii="Times New Roman" w:hAnsi="Times New Roman" w:eastAsia="Times New Roman"/>
+          <w:b w:val="0"/>
+          <w:i w:val="0"/>
+          <w:sz w:val="20"/>
+        </w:rPr>
+        <w:t>[162] Guo S, Gallego G. CMax-SLAM: Event-based rotational-motion bundle adjustment and SLAM system using contrast maximization. IEEE Transactions on Robotics. 2024;40:2442-2461. doi:10.1109/TRO.2024.3378443</w:t>
+      </w:r>
+    </w:p>
+    <w:p>
+      <w:pPr>
+        <w:spacing w:after="120" w:line="276" w:lineRule="auto"/>
+        <w:ind w:left="504" w:hanging="504"/>
+      </w:pPr>
+      <w:r>
+        <w:rPr>
+          <w:rFonts w:ascii="Times New Roman" w:hAnsi="Times New Roman" w:eastAsia="Times New Roman"/>
+          <w:b w:val="0"/>
+          <w:i w:val="0"/>
+          <w:sz w:val="20"/>
+        </w:rPr>
+        <w:t>[163] Gehrig D, Scaramuzza D. Low-latency automotive vision with event cameras. Nature. 2024;629:1034-1040.</w:t>
+      </w:r>
+    </w:p>
+    <w:p>
+      <w:pPr>
+        <w:spacing w:after="120" w:line="276" w:lineRule="auto"/>
+        <w:ind w:left="504" w:hanging="504"/>
+      </w:pPr>
+      <w:r>
+        <w:rPr>
+          <w:rFonts w:ascii="Times New Roman" w:hAnsi="Times New Roman" w:eastAsia="Times New Roman"/>
+          <w:b w:val="0"/>
+          <w:i w:val="0"/>
+          <w:sz w:val="20"/>
+        </w:rPr>
+        <w:t>[164] Khorasaninejad M, Capasso F. Metalenses: Versatile multifunctional photonic components. Science. 2017;358(6367):eaam8100. doi:10.1126/science.aam8100</w:t>
+      </w:r>
+    </w:p>
+    <w:p>
+      <w:pPr>
+        <w:spacing w:after="120" w:line="276" w:lineRule="auto"/>
+        <w:ind w:left="504" w:hanging="504"/>
+      </w:pPr>
+      <w:r>
+        <w:rPr>
+          <w:rFonts w:ascii="Times New Roman" w:hAnsi="Times New Roman" w:eastAsia="Times New Roman"/>
+          <w:b w:val="0"/>
+          <w:i w:val="0"/>
+          <w:sz w:val="20"/>
+        </w:rPr>
+        <w:t>[165] Kirmani A, Venkatraman D, Shin D, Colaco A, Wong FNC, Shapiro JH, Goyal VK. First-photon imaging. Science. 2014;343(6166):58-61. doi:10.1126/science.1246775</w:t>
+      </w:r>
+    </w:p>
+    <w:p>
+      <w:pPr>
+        <w:spacing w:after="120" w:line="276" w:lineRule="auto"/>
+        <w:ind w:left="504" w:hanging="504"/>
+      </w:pPr>
+      <w:r>
+        <w:rPr>
+          <w:rFonts w:ascii="Times New Roman" w:hAnsi="Times New Roman" w:eastAsia="Times New Roman"/>
+          <w:b w:val="0"/>
+          <w:i w:val="0"/>
+          <w:sz w:val="20"/>
+        </w:rPr>
+        <w:t>[166] O'Toole M, Lindell DB, Wetzstein G. Confocal non-line-of-sight imaging based on the light-cone transform. Nature. 2018;555:338-341. doi:10.1038/nature25489</w:t>
+      </w:r>
+    </w:p>
+    <w:p>
+      <w:pPr>
+        <w:spacing w:after="120" w:line="276" w:lineRule="auto"/>
+        <w:ind w:left="504" w:hanging="504"/>
+      </w:pPr>
+      <w:r>
+        <w:rPr>
+          <w:rFonts w:ascii="Times New Roman" w:hAnsi="Times New Roman" w:eastAsia="Times New Roman"/>
+          <w:b w:val="0"/>
+          <w:i w:val="0"/>
+          <w:sz w:val="20"/>
+        </w:rPr>
+        <w:t>[167] Mildenhall B, Srinivasan PP, Tancik M, Barron JT, Ramamoorthi R, Ng R. NeRF: Representing scenes as neural radiance fields for view synthesis. In: Computer Vision - ECCV 2020. Springer; 2020. p. 405-421. doi:10.1007/978-3-030-58452-8_24</w:t>
+      </w:r>
+    </w:p>
+    <w:p>
+      <w:pPr>
+        <w:spacing w:after="120" w:line="276" w:lineRule="auto"/>
+        <w:ind w:left="504" w:hanging="504"/>
+      </w:pPr>
+      <w:r>
+        <w:rPr>
+          <w:rFonts w:ascii="Times New Roman" w:hAnsi="Times New Roman" w:eastAsia="Times New Roman"/>
+          <w:b w:val="0"/>
+          <w:i w:val="0"/>
+          <w:sz w:val="20"/>
+        </w:rPr>
+        <w:t>[168] Kerbl B, Kopanas G, Leimkuhler T, Drettakis G. 3D Gaussian splatting for real-time radiance field rendering. ACM Transactions on Graphics. 2023;42(4):139. doi:10.1145/3592433</w:t>
       </w:r>
     </w:p>
     <w:sectPr>

</xml_diff>